<commit_message>
Auto sync docs/source code 2026-07-07 13:00:22
</commit_message>
<xml_diff>
--- a/方向分析/专利/01_证据冲突感知的可信开放集加密恶意流量检测方法及装置/可信开放集加密恶意流量检测方法及系统_按新模板.docx
+++ b/方向分析/专利/01_证据冲突感知的可信开放集加密恶意流量检测方法及装置/可信开放集加密恶意流量检测方法及系统_按新模板.docx
@@ -12973,1056 +12973,13 @@
           <w:sz w:val="24"/>
           <w:szCs w:val="24"/>
         </w:rPr>
-        <w:t>图1</w:t>
-      </w:r>
-    </w:p>
-    <w:p>
-      <w:pPr>
-        <w:ind w:firstLineChars="200" w:firstLine="480"/>
-        <w:rPr>
-          <w:rFonts w:asciiTheme="minorEastAsia" w:eastAsiaTheme="minorEastAsia" w:hAnsiTheme="minorEastAsia"/>
-          <w:sz w:val="24"/>
-          <w:szCs w:val="24"/>
-        </w:rPr>
-      </w:pPr>
-      <w:r>
-        <w:rPr>
-          <w:rFonts w:asciiTheme="minorEastAsia" w:eastAsiaTheme="minorEastAsia" w:hAnsiTheme="minorEastAsia"/>
-          <w:noProof/>
-          <w:sz w:val="24"/>
-          <w:szCs w:val="24"/>
-        </w:rPr>
-        <w:lastRenderedPageBreak/>
-        <w:drawing>
-          <wp:inline distT="0" distB="0" distL="0" distR="0" wp14:anchorId="6E4D65C8" wp14:editId="2A4690E9">
-            <wp:extent cx="5753100" cy="3515783"/>
-            <wp:effectExtent l="0" t="0" r="0" b="0"/>
-            <wp:docPr id="1" name="Picture"/>
-            <wp:cNvGraphicFramePr/>
-            <a:graphic xmlns:a="http://schemas.openxmlformats.org/drawingml/2006/main">
-              <a:graphicData uri="http://schemas.openxmlformats.org/drawingml/2006/picture">
-                <pic:pic xmlns:pic="http://schemas.openxmlformats.org/drawingml/2006/picture">
-                  <pic:nvPicPr>
-                    <pic:cNvPr id="0" name="Picture" descr="figures/图1_系统总体架构图_imagegen.png"/>
-                    <pic:cNvPicPr>
-                      <a:picLocks noChangeAspect="1" noChangeArrowheads="1"/>
-                    </pic:cNvPicPr>
-                  </pic:nvPicPr>
-                  <pic:blipFill>
-                    <a:blip r:embed="rId7"/>
-                    <a:stretch>
-                      <a:fillRect/>
-                    </a:stretch>
-                  </pic:blipFill>
-                  <pic:spPr bwMode="auto">
-                    <a:xfrm>
-                      <a:off x="0" y="0"/>
-                      <a:ext cx="5753100" cy="3515783"/>
-                    </a:xfrm>
-                    <a:prstGeom prst="rect">
-                      <a:avLst/>
-                    </a:prstGeom>
-                    <a:noFill/>
-                    <a:ln w="9525">
-                      <a:noFill/>
-                      <a:headEnd/>
-                      <a:tailEnd/>
-                    </a:ln>
-                  </pic:spPr>
-                </pic:pic>
-              </a:graphicData>
-            </a:graphic>
-          </wp:inline>
-        </w:drawing>
-      </w:r>
-    </w:p>
-    <w:p>
-      <w:pPr>
-        <w:ind w:firstLineChars="200" w:firstLine="480"/>
-        <w:rPr>
-          <w:rFonts w:asciiTheme="minorEastAsia" w:eastAsiaTheme="minorEastAsia" w:hAnsiTheme="minorEastAsia"/>
-          <w:sz w:val="24"/>
-          <w:szCs w:val="24"/>
-        </w:rPr>
-      </w:pPr>
-      <w:r>
-        <w:rPr>
-          <w:rFonts w:asciiTheme="minorEastAsia" w:eastAsiaTheme="minorEastAsia" w:hAnsiTheme="minorEastAsia"/>
-          <w:sz w:val="24"/>
-          <w:szCs w:val="24"/>
-        </w:rPr>
-        <w:t>如图1所示，在一种实施方式中，系统部署在园区网络出口旁路探针和中心分析服务器之间。旁路探针采集加密报文和流记录，对报文进行会话重组、方向标记、时间窗口切分</w:t>
-      </w:r>
-      <w:proofErr w:type="gramStart"/>
-      <w:r>
-        <w:rPr>
-          <w:rFonts w:asciiTheme="minorEastAsia" w:eastAsiaTheme="minorEastAsia" w:hAnsiTheme="minorEastAsia"/>
-          <w:sz w:val="24"/>
-          <w:szCs w:val="24"/>
-        </w:rPr>
-        <w:t>和流级聚合</w:t>
-      </w:r>
-      <w:proofErr w:type="gramEnd"/>
-      <w:r>
-        <w:rPr>
-          <w:rFonts w:asciiTheme="minorEastAsia" w:eastAsiaTheme="minorEastAsia" w:hAnsiTheme="minorEastAsia"/>
-          <w:sz w:val="24"/>
-          <w:szCs w:val="24"/>
-        </w:rPr>
-        <w:t>，形成待检测流量对象。系统首先提取流统计、包长方向序列、TLS/QUIC 可见字段、字节摘要和关系图上下文等特征，并分别输入对应模态证据头，生成类别信念、不确定性和可靠度。随后，系统计算证据冲突矩阵，对</w:t>
-      </w:r>
-      <w:proofErr w:type="gramStart"/>
-      <w:r>
-        <w:rPr>
-          <w:rFonts w:asciiTheme="minorEastAsia" w:eastAsiaTheme="minorEastAsia" w:hAnsiTheme="minorEastAsia"/>
-          <w:sz w:val="24"/>
-          <w:szCs w:val="24"/>
-        </w:rPr>
-        <w:t>可靠且低不确定</w:t>
-      </w:r>
-      <w:proofErr w:type="gramEnd"/>
-      <w:r>
-        <w:rPr>
-          <w:rFonts w:asciiTheme="minorEastAsia" w:eastAsiaTheme="minorEastAsia" w:hAnsiTheme="minorEastAsia"/>
-          <w:sz w:val="24"/>
-          <w:szCs w:val="24"/>
-        </w:rPr>
-        <w:t>模态之间的矛盾进行显式建模，并将冲突结果输入自适应折扣融合模块。系统最终输出已知正常、已知恶意、未知恶意候选或待确认样本，同时生成</w:t>
-      </w:r>
-      <w:proofErr w:type="gramStart"/>
-      <w:r>
-        <w:rPr>
-          <w:rFonts w:asciiTheme="minorEastAsia" w:eastAsiaTheme="minorEastAsia" w:hAnsiTheme="minorEastAsia"/>
-          <w:sz w:val="24"/>
-          <w:szCs w:val="24"/>
-        </w:rPr>
-        <w:t>证据包并写入</w:t>
-      </w:r>
-      <w:proofErr w:type="gramEnd"/>
-      <w:r>
-        <w:rPr>
-          <w:rFonts w:asciiTheme="minorEastAsia" w:eastAsiaTheme="minorEastAsia" w:hAnsiTheme="minorEastAsia"/>
-          <w:sz w:val="24"/>
-          <w:szCs w:val="24"/>
-        </w:rPr>
-        <w:t>未知候选池。</w:t>
-      </w:r>
-    </w:p>
-    <w:p>
-      <w:pPr>
-        <w:pStyle w:val="a9"/>
-        <w:ind w:firstLineChars="200" w:firstLine="480"/>
-        <w:rPr>
-          <w:rFonts w:asciiTheme="minorEastAsia" w:eastAsiaTheme="minorEastAsia" w:hAnsiTheme="minorEastAsia"/>
-          <w:sz w:val="24"/>
-          <w:szCs w:val="24"/>
-        </w:rPr>
-      </w:pPr>
-      <w:r>
-        <w:rPr>
-          <w:rFonts w:asciiTheme="minorEastAsia" w:eastAsiaTheme="minorEastAsia" w:hAnsiTheme="minorEastAsia"/>
-          <w:sz w:val="24"/>
-          <w:szCs w:val="24"/>
-        </w:rPr>
-        <w:t>图2</w:t>
-      </w:r>
-    </w:p>
-    <w:p>
-      <w:pPr>
-        <w:rPr>
-          <w:rFonts w:asciiTheme="minorEastAsia" w:eastAsiaTheme="minorEastAsia" w:hAnsiTheme="minorEastAsia"/>
-          <w:sz w:val="24"/>
-          <w:szCs w:val="24"/>
-        </w:rPr>
-      </w:pPr>
-      <w:r>
-        <w:rPr>
-          <w:rFonts w:asciiTheme="minorEastAsia" w:eastAsiaTheme="minorEastAsia" w:hAnsiTheme="minorEastAsia"/>
-          <w:noProof/>
-          <w:sz w:val="24"/>
-          <w:szCs w:val="24"/>
-        </w:rPr>
-        <w:drawing>
-          <wp:inline distT="0" distB="0" distL="0" distR="0" wp14:anchorId="7031F9CE" wp14:editId="484958C2">
-            <wp:extent cx="5753100" cy="3515783"/>
-            <wp:effectExtent l="0" t="0" r="0" b="0"/>
-            <wp:docPr id="1104733256" name="Picture"/>
-            <wp:cNvGraphicFramePr/>
-            <a:graphic xmlns:a="http://schemas.openxmlformats.org/drawingml/2006/main">
-              <a:graphicData uri="http://schemas.openxmlformats.org/drawingml/2006/picture">
-                <pic:pic xmlns:pic="http://schemas.openxmlformats.org/drawingml/2006/picture">
-                  <pic:nvPicPr>
-                    <pic:cNvPr id="0" name="Picture" descr="figures/图2_证据冲突与折扣融合图_imagegen.png"/>
-                    <pic:cNvPicPr>
-                      <a:picLocks noChangeAspect="1" noChangeArrowheads="1"/>
-                    </pic:cNvPicPr>
-                  </pic:nvPicPr>
-                  <pic:blipFill>
-                    <a:blip r:embed="rId8"/>
-                    <a:stretch>
-                      <a:fillRect/>
-                    </a:stretch>
-                  </pic:blipFill>
-                  <pic:spPr bwMode="auto">
-                    <a:xfrm>
-                      <a:off x="0" y="0"/>
-                      <a:ext cx="5753100" cy="3515783"/>
-                    </a:xfrm>
-                    <a:prstGeom prst="rect">
-                      <a:avLst/>
-                    </a:prstGeom>
-                    <a:noFill/>
-                    <a:ln w="9525">
-                      <a:noFill/>
-                      <a:headEnd/>
-                      <a:tailEnd/>
-                    </a:ln>
-                  </pic:spPr>
-                </pic:pic>
-              </a:graphicData>
-            </a:graphic>
-          </wp:inline>
-        </w:drawing>
-      </w:r>
-    </w:p>
-    <w:p>
-      <w:pPr>
-        <w:ind w:firstLineChars="200" w:firstLine="480"/>
-        <w:rPr>
-          <w:rFonts w:asciiTheme="minorEastAsia" w:eastAsiaTheme="minorEastAsia" w:hAnsiTheme="minorEastAsia"/>
-          <w:sz w:val="24"/>
-          <w:szCs w:val="24"/>
-        </w:rPr>
-      </w:pPr>
-      <w:r>
-        <w:rPr>
-          <w:rFonts w:asciiTheme="minorEastAsia" w:eastAsiaTheme="minorEastAsia" w:hAnsiTheme="minorEastAsia"/>
-          <w:sz w:val="24"/>
-          <w:szCs w:val="24"/>
-        </w:rPr>
-        <w:lastRenderedPageBreak/>
-        <w:t xml:space="preserve">如图2所示，每个模态输出 </w:t>
-      </w:r>
-      <m:oMath>
-        <m:sSub>
-          <m:sSubPr>
-            <m:ctrlPr>
-              <w:rPr>
-                <w:rFonts w:ascii="Cambria Math" w:eastAsiaTheme="minorEastAsia" w:hAnsi="Cambria Math"/>
-                <w:sz w:val="24"/>
-                <w:szCs w:val="24"/>
-              </w:rPr>
-            </m:ctrlPr>
-          </m:sSubPr>
-          <m:e>
-            <m:r>
-              <w:rPr>
-                <w:rFonts w:ascii="Cambria Math" w:eastAsiaTheme="minorEastAsia" w:hAnsi="Cambria Math"/>
-                <w:sz w:val="24"/>
-                <w:szCs w:val="24"/>
-              </w:rPr>
-              <m:t>b</m:t>
-            </m:r>
-          </m:e>
-          <m:sub>
-            <m:r>
-              <w:rPr>
-                <w:rFonts w:ascii="Cambria Math" w:eastAsiaTheme="minorEastAsia" w:hAnsi="Cambria Math"/>
-                <w:sz w:val="24"/>
-                <w:szCs w:val="24"/>
-              </w:rPr>
-              <m:t>m</m:t>
-            </m:r>
-          </m:sub>
-        </m:sSub>
-      </m:oMath>
-      <w:r>
-        <w:rPr>
-          <w:rFonts w:asciiTheme="minorEastAsia" w:eastAsiaTheme="minorEastAsia" w:hAnsiTheme="minorEastAsia"/>
-          <w:sz w:val="24"/>
-          <w:szCs w:val="24"/>
-        </w:rPr>
-        <w:t>、</w:t>
-      </w:r>
-      <m:oMath>
-        <m:sSub>
-          <m:sSubPr>
-            <m:ctrlPr>
-              <w:rPr>
-                <w:rFonts w:ascii="Cambria Math" w:eastAsiaTheme="minorEastAsia" w:hAnsi="Cambria Math"/>
-                <w:sz w:val="24"/>
-                <w:szCs w:val="24"/>
-              </w:rPr>
-            </m:ctrlPr>
-          </m:sSubPr>
-          <m:e>
-            <m:r>
-              <w:rPr>
-                <w:rFonts w:ascii="Cambria Math" w:eastAsiaTheme="minorEastAsia" w:hAnsi="Cambria Math"/>
-                <w:sz w:val="24"/>
-                <w:szCs w:val="24"/>
-              </w:rPr>
-              <m:t>u</m:t>
-            </m:r>
-          </m:e>
-          <m:sub>
-            <m:r>
-              <w:rPr>
-                <w:rFonts w:ascii="Cambria Math" w:eastAsiaTheme="minorEastAsia" w:hAnsi="Cambria Math"/>
-                <w:sz w:val="24"/>
-                <w:szCs w:val="24"/>
-              </w:rPr>
-              <m:t>m</m:t>
-            </m:r>
-          </m:sub>
-        </m:sSub>
-      </m:oMath>
-      <w:r>
-        <w:rPr>
-          <w:rFonts w:asciiTheme="minorEastAsia" w:eastAsiaTheme="minorEastAsia" w:hAnsiTheme="minorEastAsia"/>
-          <w:sz w:val="24"/>
-          <w:szCs w:val="24"/>
-        </w:rPr>
-        <w:t xml:space="preserve"> 和 </w:t>
-      </w:r>
-      <m:oMath>
-        <m:sSub>
-          <m:sSubPr>
-            <m:ctrlPr>
-              <w:rPr>
-                <w:rFonts w:ascii="Cambria Math" w:eastAsiaTheme="minorEastAsia" w:hAnsi="Cambria Math"/>
-                <w:sz w:val="24"/>
-                <w:szCs w:val="24"/>
-              </w:rPr>
-            </m:ctrlPr>
-          </m:sSubPr>
-          <m:e>
-            <m:r>
-              <w:rPr>
-                <w:rFonts w:ascii="Cambria Math" w:eastAsiaTheme="minorEastAsia" w:hAnsi="Cambria Math"/>
-                <w:sz w:val="24"/>
-                <w:szCs w:val="24"/>
-              </w:rPr>
-              <m:t>r</m:t>
-            </m:r>
-          </m:e>
-          <m:sub>
-            <m:r>
-              <w:rPr>
-                <w:rFonts w:ascii="Cambria Math" w:eastAsiaTheme="minorEastAsia" w:hAnsi="Cambria Math"/>
-                <w:sz w:val="24"/>
-                <w:szCs w:val="24"/>
-              </w:rPr>
-              <m:t>m</m:t>
-            </m:r>
-          </m:sub>
-        </m:sSub>
-      </m:oMath>
-      <w:r>
-        <w:rPr>
-          <w:rFonts w:asciiTheme="minorEastAsia" w:eastAsiaTheme="minorEastAsia" w:hAnsiTheme="minorEastAsia"/>
-          <w:sz w:val="24"/>
-          <w:szCs w:val="24"/>
-        </w:rPr>
-        <w:t xml:space="preserve"> 后，系统计算任意模态对的冲突分数，形成冲突矩阵 </w:t>
-      </w:r>
-      <m:oMath>
-        <m:r>
-          <w:rPr>
-            <w:rFonts w:ascii="Cambria Math" w:eastAsiaTheme="minorEastAsia" w:hAnsi="Cambria Math"/>
-            <w:sz w:val="24"/>
-            <w:szCs w:val="24"/>
-          </w:rPr>
-          <m:t>C</m:t>
-        </m:r>
-      </m:oMath>
-      <w:r>
-        <w:rPr>
-          <w:rFonts w:asciiTheme="minorEastAsia" w:eastAsiaTheme="minorEastAsia" w:hAnsiTheme="minorEastAsia"/>
-          <w:sz w:val="24"/>
-          <w:szCs w:val="24"/>
-        </w:rPr>
-        <w:t xml:space="preserve">、全局冲突 </w:t>
-      </w:r>
-      <m:oMath>
-        <m:sSub>
-          <m:sSubPr>
-            <m:ctrlPr>
-              <w:rPr>
-                <w:rFonts w:ascii="Cambria Math" w:eastAsiaTheme="minorEastAsia" w:hAnsi="Cambria Math"/>
-                <w:sz w:val="24"/>
-                <w:szCs w:val="24"/>
-              </w:rPr>
-            </m:ctrlPr>
-          </m:sSubPr>
-          <m:e>
-            <m:r>
-              <w:rPr>
-                <w:rFonts w:ascii="Cambria Math" w:eastAsiaTheme="minorEastAsia" w:hAnsi="Cambria Math"/>
-                <w:sz w:val="24"/>
-                <w:szCs w:val="24"/>
-              </w:rPr>
-              <m:t>C</m:t>
-            </m:r>
-          </m:e>
-          <m:sub>
-            <m:r>
-              <w:rPr>
-                <w:rFonts w:ascii="Cambria Math" w:eastAsiaTheme="minorEastAsia" w:hAnsi="Cambria Math"/>
-                <w:sz w:val="24"/>
-                <w:szCs w:val="24"/>
-              </w:rPr>
-              <m:t>g</m:t>
-            </m:r>
-          </m:sub>
-        </m:sSub>
-      </m:oMath>
-      <w:r>
-        <w:rPr>
-          <w:rFonts w:asciiTheme="minorEastAsia" w:eastAsiaTheme="minorEastAsia" w:hAnsiTheme="minorEastAsia"/>
-          <w:sz w:val="24"/>
-          <w:szCs w:val="24"/>
-        </w:rPr>
-        <w:t xml:space="preserve"> 和单模态冲突 </w:t>
-      </w:r>
-      <m:oMath>
-        <m:sSub>
-          <m:sSubPr>
-            <m:ctrlPr>
-              <w:rPr>
-                <w:rFonts w:ascii="Cambria Math" w:eastAsiaTheme="minorEastAsia" w:hAnsi="Cambria Math"/>
-                <w:sz w:val="24"/>
-                <w:szCs w:val="24"/>
-              </w:rPr>
-            </m:ctrlPr>
-          </m:sSubPr>
-          <m:e>
-            <m:r>
-              <w:rPr>
-                <w:rFonts w:ascii="Cambria Math" w:eastAsiaTheme="minorEastAsia" w:hAnsi="Cambria Math"/>
-                <w:sz w:val="24"/>
-                <w:szCs w:val="24"/>
-              </w:rPr>
-              <m:t>c</m:t>
-            </m:r>
-          </m:e>
-          <m:sub>
-            <m:r>
-              <w:rPr>
-                <w:rFonts w:ascii="Cambria Math" w:eastAsiaTheme="minorEastAsia" w:hAnsi="Cambria Math"/>
-                <w:sz w:val="24"/>
-                <w:szCs w:val="24"/>
-              </w:rPr>
-              <m:t>m</m:t>
-            </m:r>
-          </m:sub>
-        </m:sSub>
-      </m:oMath>
-      <w:r>
-        <w:rPr>
-          <w:rFonts w:asciiTheme="minorEastAsia" w:eastAsiaTheme="minorEastAsia" w:hAnsiTheme="minorEastAsia"/>
-          <w:sz w:val="24"/>
-          <w:szCs w:val="24"/>
-        </w:rPr>
-        <w:t xml:space="preserve">。系统再根据 </w:t>
-      </w:r>
-      <m:oMath>
-        <m:sSub>
-          <m:sSubPr>
-            <m:ctrlPr>
-              <w:rPr>
-                <w:rFonts w:ascii="Cambria Math" w:eastAsiaTheme="minorEastAsia" w:hAnsi="Cambria Math"/>
-                <w:sz w:val="24"/>
-                <w:szCs w:val="24"/>
-              </w:rPr>
-            </m:ctrlPr>
-          </m:sSubPr>
-          <m:e>
-            <m:r>
-              <w:rPr>
-                <w:rFonts w:ascii="Cambria Math" w:eastAsiaTheme="minorEastAsia" w:hAnsi="Cambria Math"/>
-                <w:sz w:val="24"/>
-                <w:szCs w:val="24"/>
-              </w:rPr>
-              <m:t>r</m:t>
-            </m:r>
-          </m:e>
-          <m:sub>
-            <m:r>
-              <w:rPr>
-                <w:rFonts w:ascii="Cambria Math" w:eastAsiaTheme="minorEastAsia" w:hAnsi="Cambria Math"/>
-                <w:sz w:val="24"/>
-                <w:szCs w:val="24"/>
-              </w:rPr>
-              <m:t>m</m:t>
-            </m:r>
-          </m:sub>
-        </m:sSub>
-      </m:oMath>
-      <w:r>
-        <w:rPr>
-          <w:rFonts w:asciiTheme="minorEastAsia" w:eastAsiaTheme="minorEastAsia" w:hAnsiTheme="minorEastAsia"/>
-          <w:sz w:val="24"/>
-          <w:szCs w:val="24"/>
-        </w:rPr>
-        <w:t>、</w:t>
-      </w:r>
-      <m:oMath>
-        <m:sSub>
-          <m:sSubPr>
-            <m:ctrlPr>
-              <w:rPr>
-                <w:rFonts w:ascii="Cambria Math" w:eastAsiaTheme="minorEastAsia" w:hAnsi="Cambria Math"/>
-                <w:sz w:val="24"/>
-                <w:szCs w:val="24"/>
-              </w:rPr>
-            </m:ctrlPr>
-          </m:sSubPr>
-          <m:e>
-            <m:r>
-              <w:rPr>
-                <w:rFonts w:ascii="Cambria Math" w:eastAsiaTheme="minorEastAsia" w:hAnsi="Cambria Math"/>
-                <w:sz w:val="24"/>
-                <w:szCs w:val="24"/>
-              </w:rPr>
-              <m:t>u</m:t>
-            </m:r>
-          </m:e>
-          <m:sub>
-            <m:r>
-              <w:rPr>
-                <w:rFonts w:ascii="Cambria Math" w:eastAsiaTheme="minorEastAsia" w:hAnsi="Cambria Math"/>
-                <w:sz w:val="24"/>
-                <w:szCs w:val="24"/>
-              </w:rPr>
-              <m:t>m</m:t>
-            </m:r>
-          </m:sub>
-        </m:sSub>
-      </m:oMath>
-      <w:r>
-        <w:rPr>
-          <w:rFonts w:asciiTheme="minorEastAsia" w:eastAsiaTheme="minorEastAsia" w:hAnsiTheme="minorEastAsia"/>
-          <w:sz w:val="24"/>
-          <w:szCs w:val="24"/>
-        </w:rPr>
-        <w:t xml:space="preserve"> 和 </w:t>
-      </w:r>
-      <m:oMath>
-        <m:sSub>
-          <m:sSubPr>
-            <m:ctrlPr>
-              <w:rPr>
-                <w:rFonts w:ascii="Cambria Math" w:eastAsiaTheme="minorEastAsia" w:hAnsi="Cambria Math"/>
-                <w:sz w:val="24"/>
-                <w:szCs w:val="24"/>
-              </w:rPr>
-            </m:ctrlPr>
-          </m:sSubPr>
-          <m:e>
-            <m:r>
-              <w:rPr>
-                <w:rFonts w:ascii="Cambria Math" w:eastAsiaTheme="minorEastAsia" w:hAnsi="Cambria Math"/>
-                <w:sz w:val="24"/>
-                <w:szCs w:val="24"/>
-              </w:rPr>
-              <m:t>c</m:t>
-            </m:r>
-          </m:e>
-          <m:sub>
-            <m:r>
-              <w:rPr>
-                <w:rFonts w:ascii="Cambria Math" w:eastAsiaTheme="minorEastAsia" w:hAnsi="Cambria Math"/>
-                <w:sz w:val="24"/>
-                <w:szCs w:val="24"/>
-              </w:rPr>
-              <m:t>m</m:t>
-            </m:r>
-          </m:sub>
-        </m:sSub>
-      </m:oMath>
-      <w:r>
-        <w:rPr>
-          <w:rFonts w:asciiTheme="minorEastAsia" w:eastAsiaTheme="minorEastAsia" w:hAnsiTheme="minorEastAsia"/>
-          <w:sz w:val="24"/>
-          <w:szCs w:val="24"/>
-        </w:rPr>
-        <w:t xml:space="preserve"> 计算折扣系数 </w:t>
-      </w:r>
-      <m:oMath>
-        <m:sSub>
-          <m:sSubPr>
-            <m:ctrlPr>
-              <w:rPr>
-                <w:rFonts w:ascii="Cambria Math" w:eastAsiaTheme="minorEastAsia" w:hAnsi="Cambria Math"/>
-                <w:sz w:val="24"/>
-                <w:szCs w:val="24"/>
-              </w:rPr>
-            </m:ctrlPr>
-          </m:sSubPr>
-          <m:e>
-            <m:r>
-              <w:rPr>
-                <w:rFonts w:ascii="Cambria Math" w:eastAsiaTheme="minorEastAsia" w:hAnsi="Cambria Math"/>
-                <w:sz w:val="24"/>
-                <w:szCs w:val="24"/>
-              </w:rPr>
-              <m:t>γ</m:t>
-            </m:r>
-          </m:e>
-          <m:sub>
-            <m:r>
-              <w:rPr>
-                <w:rFonts w:ascii="Cambria Math" w:eastAsiaTheme="minorEastAsia" w:hAnsi="Cambria Math"/>
-                <w:sz w:val="24"/>
-                <w:szCs w:val="24"/>
-              </w:rPr>
-              <m:t>m</m:t>
-            </m:r>
-          </m:sub>
-        </m:sSub>
-      </m:oMath>
-      <w:r>
-        <w:rPr>
-          <w:rFonts w:asciiTheme="minorEastAsia" w:eastAsiaTheme="minorEastAsia" w:hAnsiTheme="minorEastAsia"/>
-          <w:sz w:val="24"/>
-          <w:szCs w:val="24"/>
-        </w:rPr>
-        <w:t>。如果全局冲突较低，系统进行证据加权融合；如果全局冲突处于中等水平，系统使用保守融合并提高不确定性；如果全局冲突过高，系统不强制融合，而是将该样本转入待确认或 unknown 风险判定，并在证据包中记录最高冲突模态对。</w:t>
-      </w:r>
-    </w:p>
-    <w:p>
-      <w:pPr>
-        <w:pStyle w:val="a9"/>
-        <w:ind w:firstLineChars="200" w:firstLine="480"/>
-        <w:rPr>
-          <w:rFonts w:asciiTheme="minorEastAsia" w:eastAsiaTheme="minorEastAsia" w:hAnsiTheme="minorEastAsia"/>
-          <w:sz w:val="24"/>
-          <w:szCs w:val="24"/>
-        </w:rPr>
-      </w:pPr>
-      <w:r>
-        <w:rPr>
-          <w:rFonts w:asciiTheme="minorEastAsia" w:eastAsiaTheme="minorEastAsia" w:hAnsiTheme="minorEastAsia"/>
-          <w:sz w:val="24"/>
-          <w:szCs w:val="24"/>
-        </w:rPr>
-        <w:t>图3</w:t>
-      </w:r>
-    </w:p>
-    <w:p>
-      <w:pPr>
-        <w:rPr>
-          <w:rFonts w:asciiTheme="minorEastAsia" w:eastAsiaTheme="minorEastAsia" w:hAnsiTheme="minorEastAsia"/>
-          <w:sz w:val="24"/>
-          <w:szCs w:val="24"/>
-        </w:rPr>
-      </w:pPr>
-      <w:r>
-        <w:rPr>
-          <w:rFonts w:asciiTheme="minorEastAsia" w:eastAsiaTheme="minorEastAsia" w:hAnsiTheme="minorEastAsia"/>
-          <w:noProof/>
-          <w:sz w:val="24"/>
-          <w:szCs w:val="24"/>
-        </w:rPr>
-        <w:drawing>
-          <wp:inline distT="0" distB="0" distL="0" distR="0" wp14:anchorId="40DEED4F" wp14:editId="4342B994">
-            <wp:extent cx="5753100" cy="3515783"/>
-            <wp:effectExtent l="0" t="0" r="0" b="0"/>
-            <wp:docPr id="1134111180" name="Picture"/>
-            <wp:cNvGraphicFramePr/>
-            <a:graphic xmlns:a="http://schemas.openxmlformats.org/drawingml/2006/main">
-              <a:graphicData uri="http://schemas.openxmlformats.org/drawingml/2006/picture">
-                <pic:pic xmlns:pic="http://schemas.openxmlformats.org/drawingml/2006/picture">
-                  <pic:nvPicPr>
-                    <pic:cNvPr id="0" name="Picture" descr="figures/图3_开放集风险判定图_imagegen.png"/>
-                    <pic:cNvPicPr>
-                      <a:picLocks noChangeAspect="1" noChangeArrowheads="1"/>
-                    </pic:cNvPicPr>
-                  </pic:nvPicPr>
-                  <pic:blipFill>
-                    <a:blip r:embed="rId9"/>
-                    <a:stretch>
-                      <a:fillRect/>
-                    </a:stretch>
-                  </pic:blipFill>
-                  <pic:spPr bwMode="auto">
-                    <a:xfrm>
-                      <a:off x="0" y="0"/>
-                      <a:ext cx="5753100" cy="3515783"/>
-                    </a:xfrm>
-                    <a:prstGeom prst="rect">
-                      <a:avLst/>
-                    </a:prstGeom>
-                    <a:noFill/>
-                    <a:ln w="9525">
-                      <a:noFill/>
-                      <a:headEnd/>
-                      <a:tailEnd/>
-                    </a:ln>
-                  </pic:spPr>
-                </pic:pic>
-              </a:graphicData>
-            </a:graphic>
-          </wp:inline>
-        </w:drawing>
-      </w:r>
-    </w:p>
-    <w:p>
-      <w:pPr>
-        <w:ind w:firstLineChars="200" w:firstLine="480"/>
-        <w:rPr>
-          <w:rFonts w:asciiTheme="minorEastAsia" w:eastAsiaTheme="minorEastAsia" w:hAnsiTheme="minorEastAsia"/>
-          <w:sz w:val="24"/>
-          <w:szCs w:val="24"/>
-        </w:rPr>
-      </w:pPr>
-      <w:r>
-        <w:rPr>
-          <w:rFonts w:asciiTheme="minorEastAsia" w:eastAsiaTheme="minorEastAsia" w:hAnsiTheme="minorEastAsia"/>
-          <w:sz w:val="24"/>
-          <w:szCs w:val="24"/>
-        </w:rPr>
-        <w:t xml:space="preserve">如图3所示，开放集风险判定模块接收融合不确定性、全局冲突、原型距离、能量分数、场景偏离和恶意风险等分量，计算 </w:t>
-      </w:r>
-      <m:oMath>
-        <m:sSub>
-          <m:sSubPr>
-            <m:ctrlPr>
-              <w:rPr>
-                <w:rFonts w:ascii="Cambria Math" w:eastAsiaTheme="minorEastAsia" w:hAnsi="Cambria Math"/>
-                <w:sz w:val="24"/>
-                <w:szCs w:val="24"/>
-              </w:rPr>
-            </m:ctrlPr>
-          </m:sSubPr>
-          <m:e>
-            <m:r>
-              <w:rPr>
-                <w:rFonts w:ascii="Cambria Math" w:eastAsiaTheme="minorEastAsia" w:hAnsi="Cambria Math"/>
-                <w:sz w:val="24"/>
-                <w:szCs w:val="24"/>
-              </w:rPr>
-              <m:t>S</m:t>
-            </m:r>
-          </m:e>
-          <m:sub>
-            <m:r>
-              <w:rPr>
-                <w:rFonts w:ascii="Cambria Math" w:eastAsiaTheme="minorEastAsia" w:hAnsi="Cambria Math"/>
-                <w:sz w:val="24"/>
-                <w:szCs w:val="24"/>
-              </w:rPr>
-              <m:t>unknown</m:t>
-            </m:r>
-          </m:sub>
-        </m:sSub>
-      </m:oMath>
-      <w:r>
-        <w:rPr>
-          <w:rFonts w:asciiTheme="minorEastAsia" w:eastAsiaTheme="minorEastAsia" w:hAnsiTheme="minorEastAsia"/>
-          <w:sz w:val="24"/>
-          <w:szCs w:val="24"/>
-        </w:rPr>
-        <w:t xml:space="preserve">。系统根据场景条件化阈值进行分层判定。当 </w:t>
-      </w:r>
-      <m:oMath>
-        <m:sSub>
-          <m:sSubPr>
-            <m:ctrlPr>
-              <w:rPr>
-                <w:rFonts w:ascii="Cambria Math" w:eastAsiaTheme="minorEastAsia" w:hAnsi="Cambria Math"/>
-                <w:sz w:val="24"/>
-                <w:szCs w:val="24"/>
-              </w:rPr>
-            </m:ctrlPr>
-          </m:sSubPr>
-          <m:e>
-            <m:r>
-              <w:rPr>
-                <w:rFonts w:ascii="Cambria Math" w:eastAsiaTheme="minorEastAsia" w:hAnsi="Cambria Math"/>
-                <w:sz w:val="24"/>
-                <w:szCs w:val="24"/>
-              </w:rPr>
-              <m:t>S</m:t>
-            </m:r>
-          </m:e>
-          <m:sub>
-            <m:r>
-              <w:rPr>
-                <w:rFonts w:ascii="Cambria Math" w:eastAsiaTheme="minorEastAsia" w:hAnsi="Cambria Math"/>
-                <w:sz w:val="24"/>
-                <w:szCs w:val="24"/>
-              </w:rPr>
-              <m:t>unknown</m:t>
-            </m:r>
-          </m:sub>
-        </m:sSub>
-      </m:oMath>
-      <w:r>
-        <w:rPr>
-          <w:rFonts w:asciiTheme="minorEastAsia" w:eastAsiaTheme="minorEastAsia" w:hAnsiTheme="minorEastAsia"/>
-          <w:sz w:val="24"/>
-          <w:szCs w:val="24"/>
-        </w:rPr>
-        <w:t xml:space="preserve"> 较低时，输出已知正常或已知恶意；当 </w:t>
-      </w:r>
-      <m:oMath>
-        <m:sSub>
-          <m:sSubPr>
-            <m:ctrlPr>
-              <w:rPr>
-                <w:rFonts w:ascii="Cambria Math" w:eastAsiaTheme="minorEastAsia" w:hAnsi="Cambria Math"/>
-                <w:sz w:val="24"/>
-                <w:szCs w:val="24"/>
-              </w:rPr>
-            </m:ctrlPr>
-          </m:sSubPr>
-          <m:e>
-            <m:r>
-              <w:rPr>
-                <w:rFonts w:ascii="Cambria Math" w:eastAsiaTheme="minorEastAsia" w:hAnsi="Cambria Math"/>
-                <w:sz w:val="24"/>
-                <w:szCs w:val="24"/>
-              </w:rPr>
-              <m:t>S</m:t>
-            </m:r>
-          </m:e>
-          <m:sub>
-            <m:r>
-              <w:rPr>
-                <w:rFonts w:ascii="Cambria Math" w:eastAsiaTheme="minorEastAsia" w:hAnsi="Cambria Math"/>
-                <w:sz w:val="24"/>
-                <w:szCs w:val="24"/>
-              </w:rPr>
-              <m:t>unknown</m:t>
-            </m:r>
-          </m:sub>
-        </m:sSub>
-      </m:oMath>
-      <w:r>
-        <w:rPr>
-          <w:rFonts w:asciiTheme="minorEastAsia" w:eastAsiaTheme="minorEastAsia" w:hAnsiTheme="minorEastAsia"/>
-          <w:sz w:val="24"/>
-          <w:szCs w:val="24"/>
-        </w:rPr>
-        <w:t xml:space="preserve"> 高于确认阈值但恶意风险尚不足时，输出待确认样本；当 </w:t>
-      </w:r>
-      <m:oMath>
-        <m:sSub>
-          <m:sSubPr>
-            <m:ctrlPr>
-              <w:rPr>
-                <w:rFonts w:ascii="Cambria Math" w:eastAsiaTheme="minorEastAsia" w:hAnsi="Cambria Math"/>
-                <w:sz w:val="24"/>
-                <w:szCs w:val="24"/>
-              </w:rPr>
-            </m:ctrlPr>
-          </m:sSubPr>
-          <m:e>
-            <m:r>
-              <w:rPr>
-                <w:rFonts w:ascii="Cambria Math" w:eastAsiaTheme="minorEastAsia" w:hAnsi="Cambria Math"/>
-                <w:sz w:val="24"/>
-                <w:szCs w:val="24"/>
-              </w:rPr>
-              <m:t>S</m:t>
-            </m:r>
-          </m:e>
-          <m:sub>
-            <m:r>
-              <w:rPr>
-                <w:rFonts w:ascii="Cambria Math" w:eastAsiaTheme="minorEastAsia" w:hAnsi="Cambria Math"/>
-                <w:sz w:val="24"/>
-                <w:szCs w:val="24"/>
-              </w:rPr>
-              <m:t>unknown</m:t>
-            </m:r>
-          </m:sub>
-        </m:sSub>
-      </m:oMath>
-      <w:r>
-        <w:rPr>
-          <w:rFonts w:asciiTheme="minorEastAsia" w:eastAsiaTheme="minorEastAsia" w:hAnsiTheme="minorEastAsia"/>
-          <w:sz w:val="24"/>
-          <w:szCs w:val="24"/>
-        </w:rPr>
-        <w:t xml:space="preserve"> 高于未知阈值且恶意风险较高时，输出未知恶意候选。该实施方式能够减少短流、字段缺失和业务漂移导致的误报，同时保留对新型加密恶意通信的发现能力。</w:t>
-      </w:r>
-    </w:p>
-    <w:p>
-      <w:pPr>
-        <w:pStyle w:val="a9"/>
-        <w:ind w:firstLineChars="200" w:firstLine="480"/>
-        <w:rPr>
-          <w:rFonts w:asciiTheme="minorEastAsia" w:eastAsiaTheme="minorEastAsia" w:hAnsiTheme="minorEastAsia"/>
-          <w:sz w:val="24"/>
-          <w:szCs w:val="24"/>
-        </w:rPr>
-      </w:pPr>
-      <w:r>
-        <w:rPr>
-          <w:rFonts w:asciiTheme="minorEastAsia" w:eastAsiaTheme="minorEastAsia" w:hAnsiTheme="minorEastAsia"/>
-          <w:sz w:val="24"/>
-          <w:szCs w:val="24"/>
-        </w:rPr>
-        <w:t>图4</w:t>
-      </w:r>
-    </w:p>
-    <w:p>
-      <w:pPr>
-        <w:rPr>
-          <w:rFonts w:asciiTheme="minorEastAsia" w:eastAsiaTheme="minorEastAsia" w:hAnsiTheme="minorEastAsia"/>
-          <w:sz w:val="24"/>
-          <w:szCs w:val="24"/>
-        </w:rPr>
-      </w:pPr>
-      <w:r>
-        <w:rPr>
-          <w:rFonts w:asciiTheme="minorEastAsia" w:eastAsiaTheme="minorEastAsia" w:hAnsiTheme="minorEastAsia"/>
-          <w:noProof/>
-          <w:sz w:val="24"/>
-          <w:szCs w:val="24"/>
-        </w:rPr>
-        <w:lastRenderedPageBreak/>
-        <w:drawing>
-          <wp:inline distT="0" distB="0" distL="0" distR="0" wp14:anchorId="71D64059" wp14:editId="436F9184">
-            <wp:extent cx="5753100" cy="3515783"/>
-            <wp:effectExtent l="0" t="0" r="0" b="0"/>
-            <wp:docPr id="580349747" name="Picture"/>
-            <wp:cNvGraphicFramePr/>
-            <a:graphic xmlns:a="http://schemas.openxmlformats.org/drawingml/2006/main">
-              <a:graphicData uri="http://schemas.openxmlformats.org/drawingml/2006/picture">
-                <pic:pic xmlns:pic="http://schemas.openxmlformats.org/drawingml/2006/picture">
-                  <pic:nvPicPr>
-                    <pic:cNvPr id="0" name="Picture" descr="figures/图4_反馈更新闭环图_imagegen.png"/>
-                    <pic:cNvPicPr>
-                      <a:picLocks noChangeAspect="1" noChangeArrowheads="1"/>
-                    </pic:cNvPicPr>
-                  </pic:nvPicPr>
-                  <pic:blipFill>
-                    <a:blip r:embed="rId10"/>
-                    <a:stretch>
-                      <a:fillRect/>
-                    </a:stretch>
-                  </pic:blipFill>
-                  <pic:spPr bwMode="auto">
-                    <a:xfrm>
-                      <a:off x="0" y="0"/>
-                      <a:ext cx="5753100" cy="3515783"/>
-                    </a:xfrm>
-                    <a:prstGeom prst="rect">
-                      <a:avLst/>
-                    </a:prstGeom>
-                    <a:noFill/>
-                    <a:ln w="9525">
-                      <a:noFill/>
-                      <a:headEnd/>
-                      <a:tailEnd/>
-                    </a:ln>
-                  </pic:spPr>
-                </pic:pic>
-              </a:graphicData>
-            </a:graphic>
-          </wp:inline>
-        </w:drawing>
-      </w:r>
-    </w:p>
-    <w:p>
-      <w:pPr>
-        <w:ind w:firstLineChars="200" w:firstLine="480"/>
-        <w:rPr>
-          <w:rFonts w:asciiTheme="minorEastAsia" w:eastAsiaTheme="minorEastAsia" w:hAnsiTheme="minorEastAsia"/>
-          <w:sz w:val="24"/>
-          <w:szCs w:val="24"/>
-        </w:rPr>
-      </w:pPr>
-      <w:r>
-        <w:rPr>
-          <w:rFonts w:asciiTheme="minorEastAsia" w:eastAsiaTheme="minorEastAsia" w:hAnsiTheme="minorEastAsia"/>
-          <w:sz w:val="24"/>
-          <w:szCs w:val="24"/>
-        </w:rPr>
-        <w:t>如图4所示，未知恶意</w:t>
-      </w:r>
-      <w:proofErr w:type="gramStart"/>
-      <w:r>
-        <w:rPr>
-          <w:rFonts w:asciiTheme="minorEastAsia" w:eastAsiaTheme="minorEastAsia" w:hAnsiTheme="minorEastAsia"/>
-          <w:sz w:val="24"/>
-          <w:szCs w:val="24"/>
-        </w:rPr>
-        <w:t>候选和</w:t>
-      </w:r>
-      <w:proofErr w:type="gramEnd"/>
-      <w:r>
-        <w:rPr>
-          <w:rFonts w:asciiTheme="minorEastAsia" w:eastAsiaTheme="minorEastAsia" w:hAnsiTheme="minorEastAsia"/>
-          <w:sz w:val="24"/>
-          <w:szCs w:val="24"/>
-        </w:rPr>
-        <w:t>待确认样本进入未知候选池。系统对候选样本进行相似样本合并和候选簇生成，并接收确认后的样本标签。若确认某一候选</w:t>
-      </w:r>
-      <w:proofErr w:type="gramStart"/>
-      <w:r>
-        <w:rPr>
-          <w:rFonts w:asciiTheme="minorEastAsia" w:eastAsiaTheme="minorEastAsia" w:hAnsiTheme="minorEastAsia"/>
-          <w:sz w:val="24"/>
-          <w:szCs w:val="24"/>
-        </w:rPr>
-        <w:t>簇</w:t>
-      </w:r>
-      <w:proofErr w:type="gramEnd"/>
-      <w:r>
-        <w:rPr>
-          <w:rFonts w:asciiTheme="minorEastAsia" w:eastAsiaTheme="minorEastAsia" w:hAnsiTheme="minorEastAsia"/>
-          <w:sz w:val="24"/>
-          <w:szCs w:val="24"/>
-        </w:rPr>
-        <w:t>属于新的恶意家族，系统</w:t>
-      </w:r>
-      <w:proofErr w:type="gramStart"/>
-      <w:r>
-        <w:rPr>
-          <w:rFonts w:asciiTheme="minorEastAsia" w:eastAsiaTheme="minorEastAsia" w:hAnsiTheme="minorEastAsia"/>
-          <w:sz w:val="24"/>
-          <w:szCs w:val="24"/>
-        </w:rPr>
-        <w:t>将该簇沉淀</w:t>
-      </w:r>
-      <w:proofErr w:type="gramEnd"/>
-      <w:r>
-        <w:rPr>
-          <w:rFonts w:asciiTheme="minorEastAsia" w:eastAsiaTheme="minorEastAsia" w:hAnsiTheme="minorEastAsia"/>
-          <w:sz w:val="24"/>
-          <w:szCs w:val="24"/>
-        </w:rPr>
-        <w:t>为新恶意家族候选，记录代表样本、冲突模态和相似历史样本，并在满足样本数和纯度条件后生成新类原型。若确认候选簇为正常新业务，系统降低相似样本的告警级别，更新场景阈值和正常类原型。若确认样本属于已知类别，系统使用指数滑动平均更新对应类别原型，并修正相应场景下的模态可靠度统计。</w:t>
-      </w:r>
-    </w:p>
-    <w:p>
-      <w:pPr>
-        <w:pStyle w:val="a9"/>
-        <w:ind w:firstLineChars="200" w:firstLine="480"/>
-        <w:rPr>
-          <w:rFonts w:asciiTheme="minorEastAsia" w:eastAsiaTheme="minorEastAsia" w:hAnsiTheme="minorEastAsia"/>
-          <w:sz w:val="24"/>
-          <w:szCs w:val="24"/>
-        </w:rPr>
-      </w:pPr>
-      <w:r>
-        <w:rPr>
-          <w:rFonts w:asciiTheme="minorEastAsia" w:eastAsiaTheme="minorEastAsia" w:hAnsiTheme="minorEastAsia"/>
-          <w:sz w:val="24"/>
-          <w:szCs w:val="24"/>
-        </w:rPr>
         <w:t>本发明未详尽之处，均可参见现有技术。</w:t>
       </w:r>
     </w:p>
     <w:sectPr>
-      <w:footerReference w:type="default" r:id="rId11"/>
-      <w:headerReference w:type="first" r:id="rId12"/>
-      <w:footerReference w:type="first" r:id="rId13"/>
+      <w:footerReference w:type="default" r:id="rId7"/>
+      <w:headerReference w:type="first" r:id="rId8"/>
+      <w:footerReference w:type="first" r:id="rId9"/>
       <w:pgSz w:w="11906" w:h="16838" w:code="9"/>
       <w:pgMar w:top="1418" w:right="1304" w:bottom="1134" w:left="1531" w:header="851" w:footer="567" w:gutter="0"/>
       <w:pgNumType w:start="1"/>

</xml_diff>

<commit_message>
Auto sync docs/source code 2026-07-07 13:13:54
</commit_message>
<xml_diff>
--- a/方向分析/专利/01_证据冲突感知的可信开放集加密恶意流量检测方法及装置/可信开放集加密恶意流量检测方法及系统_按新模板.docx
+++ b/方向分析/专利/01_证据冲突感知的可信开放集加密恶意流量检测方法及装置/可信开放集加密恶意流量检测方法及系统_按新模板.docx
@@ -54,6 +54,7 @@
     <w:p>
       <w:pPr>
         <w:pStyle w:val="a9"/>
+        <w:spacing w:line="360" w:lineRule="auto"/>
         <w:ind w:firstLineChars="200" w:firstLine="480"/>
         <w:rPr>
           <w:rFonts w:asciiTheme="minorEastAsia" w:eastAsiaTheme="minorEastAsia" w:hAnsiTheme="minorEastAsia"/>
@@ -103,6 +104,7 @@
     <w:p>
       <w:pPr>
         <w:pStyle w:val="a9"/>
+        <w:spacing w:line="360" w:lineRule="auto"/>
         <w:ind w:firstLineChars="200" w:firstLine="480"/>
         <w:rPr>
           <w:rFonts w:asciiTheme="minorEastAsia" w:eastAsiaTheme="minorEastAsia" w:hAnsiTheme="minorEastAsia"/>
@@ -158,6 +160,7 @@
     <w:p>
       <w:pPr>
         <w:pStyle w:val="a9"/>
+        <w:spacing w:line="360" w:lineRule="auto"/>
         <w:ind w:firstLineChars="200" w:firstLine="480"/>
         <w:rPr>
           <w:rFonts w:asciiTheme="minorEastAsia" w:eastAsiaTheme="minorEastAsia" w:hAnsiTheme="minorEastAsia"/>
@@ -195,6 +198,7 @@
     <w:p>
       <w:pPr>
         <w:pStyle w:val="a9"/>
+        <w:spacing w:line="360" w:lineRule="auto"/>
         <w:ind w:firstLineChars="200" w:firstLine="480"/>
         <w:rPr>
           <w:rFonts w:asciiTheme="minorEastAsia" w:eastAsiaTheme="minorEastAsia" w:hAnsiTheme="minorEastAsia"/>
@@ -214,6 +218,7 @@
     <w:p>
       <w:pPr>
         <w:pStyle w:val="a9"/>
+        <w:spacing w:line="360" w:lineRule="auto"/>
         <w:ind w:firstLineChars="200" w:firstLine="480"/>
         <w:rPr>
           <w:rFonts w:asciiTheme="minorEastAsia" w:eastAsiaTheme="minorEastAsia" w:hAnsiTheme="minorEastAsia"/>
@@ -263,6 +268,7 @@
     <w:p>
       <w:pPr>
         <w:pStyle w:val="a9"/>
+        <w:spacing w:line="360" w:lineRule="auto"/>
         <w:ind w:firstLineChars="200" w:firstLine="480"/>
         <w:rPr>
           <w:rFonts w:asciiTheme="minorEastAsia" w:eastAsiaTheme="minorEastAsia" w:hAnsiTheme="minorEastAsia"/>
@@ -270,6 +276,7 @@
           <w:szCs w:val="24"/>
         </w:rPr>
       </w:pPr>
+      <w:bookmarkStart w:id="0" w:name="OLE_LINK4"/>
       <w:r>
         <w:rPr>
           <w:rFonts w:asciiTheme="minorEastAsia" w:eastAsiaTheme="minorEastAsia" w:hAnsiTheme="minorEastAsia"/>
@@ -294,12 +301,22 @@
           <w:sz w:val="24"/>
           <w:szCs w:val="24"/>
         </w:rPr>
-        <w:t>解密载荷的前提下，构建多粒度侧信道特征，生成各模态证据意见，显式计算证据冲突并进行自适应折扣融合，结合多因素开放集风险输出检测结果，并成功解决未知流量高置信误判、模态冲突难刻画和结果可信解释不足等关键问题。</w:t>
+        <w:t>解密载荷的前提下，构建多粒度侧信道特征，生成各</w:t>
+      </w:r>
+      <w:r>
+        <w:rPr>
+          <w:rFonts w:asciiTheme="minorEastAsia" w:eastAsiaTheme="minorEastAsia" w:hAnsiTheme="minorEastAsia"/>
+          <w:sz w:val="24"/>
+          <w:szCs w:val="24"/>
+        </w:rPr>
+        <w:lastRenderedPageBreak/>
+        <w:t>模态证据意见，显式计算证据冲突并进行自适应折扣融合，结合多因素开放集风险输出检测结果，并成功解决未知流量高置信误判、模态冲突难刻画和结果可信解释不足等关键问题。</w:t>
       </w:r>
     </w:p>
     <w:p>
       <w:pPr>
         <w:pStyle w:val="a9"/>
+        <w:spacing w:line="360" w:lineRule="auto"/>
         <w:ind w:firstLineChars="200" w:firstLine="480"/>
         <w:rPr>
           <w:rFonts w:asciiTheme="minorEastAsia" w:eastAsiaTheme="minorEastAsia" w:hAnsiTheme="minorEastAsia"/>
@@ -319,6 +336,7 @@
     <w:p>
       <w:pPr>
         <w:pStyle w:val="a9"/>
+        <w:spacing w:line="360" w:lineRule="auto"/>
         <w:ind w:firstLineChars="200" w:firstLine="480"/>
         <w:rPr>
           <w:rFonts w:asciiTheme="minorEastAsia" w:eastAsiaTheme="minorEastAsia" w:hAnsiTheme="minorEastAsia"/>
@@ -338,6 +356,7 @@
     <w:p>
       <w:pPr>
         <w:pStyle w:val="a9"/>
+        <w:spacing w:line="360" w:lineRule="auto"/>
         <w:ind w:firstLineChars="200" w:firstLine="480"/>
         <w:rPr>
           <w:rFonts w:asciiTheme="minorEastAsia" w:eastAsiaTheme="minorEastAsia" w:hAnsiTheme="minorEastAsia"/>
@@ -411,6 +430,7 @@
     <w:p>
       <w:pPr>
         <w:pStyle w:val="a9"/>
+        <w:spacing w:line="360" w:lineRule="auto"/>
         <w:ind w:firstLineChars="200" w:firstLine="480"/>
         <w:rPr>
           <w:rFonts w:asciiTheme="minorEastAsia" w:eastAsiaTheme="minorEastAsia" w:hAnsiTheme="minorEastAsia"/>
@@ -424,21 +444,13 @@
           <w:sz w:val="24"/>
           <w:szCs w:val="24"/>
         </w:rPr>
-        <w:t>模态证据意见，是指某一模态针对待检测流量对象给出的类别信念、类别证据、</w:t>
-      </w:r>
-      <w:r>
-        <w:rPr>
-          <w:rFonts w:asciiTheme="minorEastAsia" w:eastAsiaTheme="minorEastAsia" w:hAnsiTheme="minorEastAsia"/>
-          <w:sz w:val="24"/>
-          <w:szCs w:val="24"/>
-        </w:rPr>
-        <w:lastRenderedPageBreak/>
-        <w:t>不确定性和可靠度的组合。类别信念表示该模态对各已知类别的支持程度，不确定性表示该模态是否证据不足，可靠度表示该模态在当前样本和当前场景下是否可信。</w:t>
+        <w:t>模态证据意见，是指某一模态针对待检测流量对象给出的类别信念、类别证据、不确定性和可靠度的组合。类别信念表示该模态对各已知类别的支持程度，不确定性表示该模态是否证据不足，可靠度表示该模态在当前样本和当前场景下是否可信。</w:t>
       </w:r>
     </w:p>
     <w:p>
       <w:pPr>
         <w:pStyle w:val="a9"/>
+        <w:spacing w:line="360" w:lineRule="auto"/>
         <w:ind w:firstLineChars="200" w:firstLine="480"/>
         <w:rPr>
           <w:rFonts w:asciiTheme="minorEastAsia" w:eastAsiaTheme="minorEastAsia" w:hAnsiTheme="minorEastAsia"/>
@@ -476,6 +488,7 @@
     <w:p>
       <w:pPr>
         <w:pStyle w:val="a9"/>
+        <w:spacing w:line="360" w:lineRule="auto"/>
         <w:ind w:firstLineChars="200" w:firstLine="480"/>
         <w:rPr>
           <w:rFonts w:asciiTheme="minorEastAsia" w:eastAsiaTheme="minorEastAsia" w:hAnsiTheme="minorEastAsia"/>
@@ -513,6 +526,7 @@
     <w:p>
       <w:pPr>
         <w:pStyle w:val="a9"/>
+        <w:spacing w:line="360" w:lineRule="auto"/>
         <w:ind w:firstLineChars="200" w:firstLine="480"/>
         <w:rPr>
           <w:rFonts w:asciiTheme="minorEastAsia" w:eastAsiaTheme="minorEastAsia" w:hAnsiTheme="minorEastAsia"/>
@@ -544,12 +558,22 @@
           <w:sz w:val="24"/>
           <w:szCs w:val="24"/>
         </w:rPr>
-        <w:t>持续发现新类、减少重复确认，并在满足可信度条件后支持原型、阈值和模态可靠度更新。</w:t>
+        <w:t>持续发现新类、减少重复确认，并在满足可信度条件后支持原型、阈值和模态可靠度更新</w:t>
+      </w:r>
+      <w:bookmarkEnd w:id="0"/>
+      <w:r>
+        <w:rPr>
+          <w:rFonts w:asciiTheme="minorEastAsia" w:eastAsiaTheme="minorEastAsia" w:hAnsiTheme="minorEastAsia"/>
+          <w:sz w:val="24"/>
+          <w:szCs w:val="24"/>
+        </w:rPr>
+        <w:t>。</w:t>
       </w:r>
     </w:p>
     <w:p>
       <w:pPr>
         <w:pStyle w:val="a9"/>
+        <w:spacing w:line="360" w:lineRule="auto"/>
         <w:ind w:firstLineChars="200" w:firstLine="480"/>
         <w:rPr>
           <w:rFonts w:asciiTheme="minorEastAsia" w:eastAsiaTheme="minorEastAsia" w:hAnsiTheme="minorEastAsia"/>
@@ -569,6 +593,7 @@
     <w:p>
       <w:pPr>
         <w:pStyle w:val="a9"/>
+        <w:spacing w:line="360" w:lineRule="auto"/>
         <w:ind w:firstLineChars="200" w:firstLine="480"/>
         <w:rPr>
           <w:rFonts w:asciiTheme="minorEastAsia" w:eastAsiaTheme="minorEastAsia" w:hAnsiTheme="minorEastAsia"/>
@@ -588,6 +613,7 @@
     <w:p>
       <w:pPr>
         <w:pStyle w:val="a9"/>
+        <w:spacing w:line="360" w:lineRule="auto"/>
         <w:ind w:firstLineChars="200" w:firstLine="480"/>
         <w:rPr>
           <w:rFonts w:asciiTheme="minorEastAsia" w:eastAsiaTheme="minorEastAsia" w:hAnsiTheme="minorEastAsia"/>
@@ -619,7 +645,16 @@
           <w:sz w:val="24"/>
           <w:szCs w:val="24"/>
         </w:rPr>
-        <w:t>或日志进行规范化处理，得到可供后续检测</w:t>
+        <w:t>或日志进行规范化处理，</w:t>
+      </w:r>
+      <w:r>
+        <w:rPr>
+          <w:rFonts w:asciiTheme="minorEastAsia" w:eastAsiaTheme="minorEastAsia" w:hAnsiTheme="minorEastAsia"/>
+          <w:sz w:val="24"/>
+          <w:szCs w:val="24"/>
+        </w:rPr>
+        <w:lastRenderedPageBreak/>
+        <w:t>得到可供后续检测</w:t>
       </w:r>
       <w:proofErr w:type="gramStart"/>
       <w:r>
@@ -697,6 +732,7 @@
     <w:p>
       <w:pPr>
         <w:pStyle w:val="a9"/>
+        <w:spacing w:line="360" w:lineRule="auto"/>
         <w:ind w:firstLineChars="200" w:firstLine="480"/>
         <w:rPr>
           <w:rFonts w:asciiTheme="minorEastAsia" w:eastAsiaTheme="minorEastAsia" w:hAnsiTheme="minorEastAsia"/>
@@ -770,6 +806,7 @@
     <w:p>
       <w:pPr>
         <w:pStyle w:val="a9"/>
+        <w:spacing w:line="360" w:lineRule="auto"/>
         <w:ind w:firstLineChars="200" w:firstLine="480"/>
         <w:rPr>
           <w:rFonts w:asciiTheme="minorEastAsia" w:eastAsiaTheme="minorEastAsia" w:hAnsiTheme="minorEastAsia"/>
@@ -789,6 +826,7 @@
     <w:p>
       <w:pPr>
         <w:pStyle w:val="a9"/>
+        <w:spacing w:line="360" w:lineRule="auto"/>
         <w:ind w:firstLineChars="200" w:firstLine="480"/>
         <w:rPr>
           <w:rFonts w:asciiTheme="minorEastAsia" w:eastAsiaTheme="minorEastAsia" w:hAnsiTheme="minorEastAsia"/>
@@ -808,6 +846,7 @@
     <w:p>
       <w:pPr>
         <w:pStyle w:val="a9"/>
+        <w:spacing w:line="360" w:lineRule="auto"/>
         <w:ind w:firstLineChars="200" w:firstLine="480"/>
         <w:rPr>
           <w:rFonts w:asciiTheme="minorEastAsia" w:eastAsiaTheme="minorEastAsia" w:hAnsiTheme="minorEastAsia"/>
@@ -863,6 +902,7 @@
     <w:p>
       <w:pPr>
         <w:pStyle w:val="a9"/>
+        <w:spacing w:line="360" w:lineRule="auto"/>
         <w:ind w:firstLineChars="200" w:firstLine="480"/>
         <w:rPr>
           <w:rFonts w:asciiTheme="minorEastAsia" w:eastAsiaTheme="minorEastAsia" w:hAnsiTheme="minorEastAsia"/>
@@ -922,21 +962,13 @@
           <w:sz w:val="24"/>
           <w:szCs w:val="24"/>
         </w:rPr>
-        <w:t>报文的包长、方向、到达间隔、突发</w:t>
-      </w:r>
-      <w:r>
-        <w:rPr>
-          <w:rFonts w:asciiTheme="minorEastAsia" w:eastAsiaTheme="minorEastAsia" w:hAnsiTheme="minorEastAsia"/>
-          <w:sz w:val="24"/>
-          <w:szCs w:val="24"/>
-        </w:rPr>
-        <w:lastRenderedPageBreak/>
-        <w:t>序列、符号化包长序列和上下行转移模式，用于刻画周期性心跳、低频命令控制、隧道封装、扫描探测和恶意下载等行为。</w:t>
+        <w:t>报文的包长、方向、到达间隔、突发序列、符号化包长序列和上下行转移模式，用于刻画周期性心跳、低频命令控制、隧道封装、扫描探测和恶意下载等行为。</w:t>
       </w:r>
     </w:p>
     <w:p>
       <w:pPr>
         <w:pStyle w:val="a9"/>
+        <w:spacing w:line="360" w:lineRule="auto"/>
         <w:ind w:firstLineChars="200" w:firstLine="480"/>
         <w:rPr>
           <w:rFonts w:asciiTheme="minorEastAsia" w:eastAsiaTheme="minorEastAsia" w:hAnsiTheme="minorEastAsia"/>
@@ -950,7 +982,16 @@
           <w:sz w:val="24"/>
           <w:szCs w:val="24"/>
         </w:rPr>
-        <w:t>可见协议字段模态包括 TLS/QUIC 版本、Cipher Suites 数量、扩展类型、ALPN、SNI 可见字段摘要、证书摘要、证书有效期统计、JA3/JA4 指纹、QUIC 传输参数、DoH 查询外观统计和代理协议可见字段。涉及隐私内容的字段仅保留不可逆摘要、长度、类别或统计量。字节摘要</w:t>
+        <w:t>可见协议字段模态包括 TLS/QUIC 版本、Cipher Suites 数量、扩展类型、ALPN、</w:t>
+      </w:r>
+      <w:r>
+        <w:rPr>
+          <w:rFonts w:asciiTheme="minorEastAsia" w:eastAsiaTheme="minorEastAsia" w:hAnsiTheme="minorEastAsia"/>
+          <w:sz w:val="24"/>
+          <w:szCs w:val="24"/>
+        </w:rPr>
+        <w:lastRenderedPageBreak/>
+        <w:t>SNI 可见字段摘要、证书摘要、证书有效期统计、JA3/JA4 指纹、QUIC 传输参数、DoH 查询外观统计和代理协议可见字段。涉及隐私内容的字段仅保留不可逆摘要、长度、类别或统计量。字节摘要</w:t>
       </w:r>
       <w:proofErr w:type="gramStart"/>
       <w:r>
@@ -992,6 +1033,7 @@
     <w:p>
       <w:pPr>
         <w:pStyle w:val="a9"/>
+        <w:spacing w:line="360" w:lineRule="auto"/>
         <w:ind w:firstLineChars="200" w:firstLine="480"/>
         <w:rPr>
           <w:rFonts w:asciiTheme="minorEastAsia" w:eastAsiaTheme="minorEastAsia" w:hAnsiTheme="minorEastAsia"/>
@@ -1032,7 +1074,56 @@
             <w:sz w:val="24"/>
             <w:szCs w:val="24"/>
           </w:rPr>
-          <m:t>G=(V,E)</m:t>
+          <m:t>G</m:t>
+        </m:r>
+        <m:r>
+          <m:rPr>
+            <m:sty m:val="p"/>
+          </m:rPr>
+          <w:rPr>
+            <w:rFonts w:ascii="Cambria Math" w:eastAsiaTheme="minorEastAsia" w:hAnsi="Cambria Math"/>
+            <w:sz w:val="24"/>
+            <w:szCs w:val="24"/>
+          </w:rPr>
+          <m:t>=(</m:t>
+        </m:r>
+        <m:r>
+          <w:rPr>
+            <w:rFonts w:ascii="Cambria Math" w:eastAsiaTheme="minorEastAsia" w:hAnsi="Cambria Math"/>
+            <w:sz w:val="24"/>
+            <w:szCs w:val="24"/>
+          </w:rPr>
+          <m:t>V</m:t>
+        </m:r>
+        <m:r>
+          <m:rPr>
+            <m:sty m:val="p"/>
+          </m:rPr>
+          <w:rPr>
+            <w:rFonts w:ascii="Cambria Math" w:eastAsiaTheme="minorEastAsia" w:hAnsi="Cambria Math"/>
+            <w:sz w:val="24"/>
+            <w:szCs w:val="24"/>
+          </w:rPr>
+          <m:t>,</m:t>
+        </m:r>
+        <m:r>
+          <w:rPr>
+            <w:rFonts w:ascii="Cambria Math" w:eastAsiaTheme="minorEastAsia" w:hAnsi="Cambria Math"/>
+            <w:sz w:val="24"/>
+            <w:szCs w:val="24"/>
+          </w:rPr>
+          <m:t>E</m:t>
+        </m:r>
+        <m:r>
+          <m:rPr>
+            <m:sty m:val="p"/>
+          </m:rPr>
+          <w:rPr>
+            <w:rFonts w:ascii="Cambria Math" w:eastAsiaTheme="minorEastAsia" w:hAnsi="Cambria Math"/>
+            <w:sz w:val="24"/>
+            <w:szCs w:val="24"/>
+          </w:rPr>
+          <m:t>)</m:t>
         </m:r>
       </m:oMath>
       <w:r>
@@ -1119,6 +1210,7 @@
     <w:p>
       <w:pPr>
         <w:pStyle w:val="a9"/>
+        <w:spacing w:line="360" w:lineRule="auto"/>
         <w:ind w:firstLineChars="200" w:firstLine="480"/>
         <w:rPr>
           <w:rFonts w:asciiTheme="minorEastAsia" w:eastAsiaTheme="minorEastAsia" w:hAnsiTheme="minorEastAsia"/>
@@ -1138,6 +1230,7 @@
     <w:p>
       <w:pPr>
         <w:pStyle w:val="a9"/>
+        <w:spacing w:line="360" w:lineRule="auto"/>
         <w:ind w:firstLineChars="200" w:firstLine="480"/>
         <w:rPr>
           <w:rFonts w:asciiTheme="minorEastAsia" w:eastAsiaTheme="minorEastAsia" w:hAnsiTheme="minorEastAsia"/>
@@ -1216,6 +1309,7 @@
     <w:p>
       <w:pPr>
         <w:pStyle w:val="a9"/>
+        <w:spacing w:line="360" w:lineRule="auto"/>
         <w:ind w:firstLineChars="200" w:firstLine="480"/>
         <w:rPr>
           <w:rFonts w:asciiTheme="minorEastAsia" w:eastAsiaTheme="minorEastAsia" w:hAnsiTheme="minorEastAsia"/>
@@ -1276,6 +1370,7 @@
     <w:p>
       <w:pPr>
         <w:pStyle w:val="a9"/>
+        <w:spacing w:line="360" w:lineRule="auto"/>
         <w:ind w:firstLineChars="200" w:firstLine="480"/>
         <w:rPr>
           <w:rFonts w:asciiTheme="minorEastAsia" w:eastAsiaTheme="minorEastAsia" w:hAnsiTheme="minorEastAsia"/>
@@ -1320,12 +1415,34 @@
             </m:sub>
           </m:sSub>
           <m:r>
+            <m:rPr>
+              <m:sty m:val="p"/>
+            </m:rPr>
             <w:rPr>
               <w:rFonts w:ascii="Cambria Math" w:eastAsiaTheme="minorEastAsia" w:hAnsi="Cambria Math"/>
               <w:sz w:val="24"/>
               <w:szCs w:val="24"/>
             </w:rPr>
-            <m:t>=σ(</m:t>
+            <m:t>=</m:t>
+          </m:r>
+          <m:r>
+            <w:rPr>
+              <w:rFonts w:ascii="Cambria Math" w:eastAsiaTheme="minorEastAsia" w:hAnsi="Cambria Math"/>
+              <w:sz w:val="24"/>
+              <w:szCs w:val="24"/>
+            </w:rPr>
+            <m:t>σ</m:t>
+          </m:r>
+          <m:r>
+            <m:rPr>
+              <m:sty m:val="p"/>
+            </m:rPr>
+            <w:rPr>
+              <w:rFonts w:ascii="Cambria Math" w:eastAsiaTheme="minorEastAsia" w:hAnsi="Cambria Math"/>
+              <w:sz w:val="24"/>
+              <w:szCs w:val="24"/>
+            </w:rPr>
+            <m:t>(</m:t>
           </m:r>
           <m:sSubSup>
             <m:sSubSupPr>
@@ -1359,6 +1476,9 @@
             </m:sub>
             <m:sup>
               <m:r>
+                <m:rPr>
+                  <m:sty m:val="p"/>
+                </m:rPr>
                 <w:rPr>
                   <w:rFonts w:ascii="Cambria Math" w:eastAsiaTheme="minorEastAsia" w:hAnsi="Cambria Math"/>
                   <w:sz w:val="24"/>
@@ -1400,6 +1520,9 @@
             </m:sub>
           </m:sSub>
           <m:r>
+            <m:rPr>
+              <m:sty m:val="p"/>
+            </m:rPr>
             <w:rPr>
               <w:rFonts w:ascii="Cambria Math" w:eastAsiaTheme="minorEastAsia" w:hAnsi="Cambria Math"/>
               <w:sz w:val="24"/>
@@ -1470,6 +1593,9 @@
             </m:sub>
           </m:sSub>
           <m:r>
+            <m:rPr>
+              <m:sty m:val="p"/>
+            </m:rPr>
             <w:rPr>
               <w:rFonts w:ascii="Cambria Math" w:eastAsiaTheme="minorEastAsia" w:hAnsi="Cambria Math"/>
               <w:sz w:val="24"/>
@@ -1540,6 +1666,9 @@
             </m:sub>
           </m:sSub>
           <m:r>
+            <m:rPr>
+              <m:sty m:val="p"/>
+            </m:rPr>
             <w:rPr>
               <w:rFonts w:ascii="Cambria Math" w:eastAsiaTheme="minorEastAsia" w:hAnsi="Cambria Math"/>
               <w:sz w:val="24"/>
@@ -1579,6 +1708,9 @@
             </m:sub>
           </m:sSub>
           <m:r>
+            <m:rPr>
+              <m:sty m:val="p"/>
+            </m:rPr>
             <w:rPr>
               <w:rFonts w:ascii="Cambria Math" w:eastAsiaTheme="minorEastAsia" w:hAnsi="Cambria Math"/>
               <w:sz w:val="24"/>
@@ -1591,6 +1723,8 @@
     </w:p>
     <w:p>
       <w:pPr>
+        <w:pStyle w:val="a9"/>
+        <w:spacing w:line="360" w:lineRule="auto"/>
         <w:ind w:firstLineChars="200" w:firstLine="480"/>
         <w:rPr>
           <w:rFonts w:asciiTheme="minorEastAsia" w:eastAsiaTheme="minorEastAsia" w:hAnsiTheme="minorEastAsia"/>
@@ -1874,6 +2008,7 @@
     <w:p>
       <w:pPr>
         <w:pStyle w:val="a9"/>
+        <w:spacing w:line="360" w:lineRule="auto"/>
         <w:ind w:firstLineChars="200" w:firstLine="480"/>
         <w:rPr>
           <w:rFonts w:asciiTheme="minorEastAsia" w:eastAsiaTheme="minorEastAsia" w:hAnsiTheme="minorEastAsia"/>
@@ -1893,6 +2028,7 @@
     <w:p>
       <w:pPr>
         <w:pStyle w:val="a9"/>
+        <w:spacing w:line="360" w:lineRule="auto"/>
         <w:ind w:firstLineChars="200" w:firstLine="480"/>
         <w:rPr>
           <w:rFonts w:asciiTheme="minorEastAsia" w:eastAsiaTheme="minorEastAsia" w:hAnsiTheme="minorEastAsia"/>
@@ -1912,6 +2048,7 @@
     <w:p>
       <w:pPr>
         <w:pStyle w:val="a9"/>
+        <w:spacing w:line="360" w:lineRule="auto"/>
         <w:ind w:firstLineChars="200" w:firstLine="480"/>
         <w:rPr>
           <w:rFonts w:asciiTheme="minorEastAsia" w:eastAsiaTheme="minorEastAsia" w:hAnsiTheme="minorEastAsia"/>
@@ -1925,7 +2062,16 @@
           <w:sz w:val="24"/>
           <w:szCs w:val="24"/>
         </w:rPr>
-        <w:t xml:space="preserve">模态证据生成模块用于将每一类特征转换为类别证据、不确定性和模态表示。对于第 </w:t>
+        <w:t>模态证据生成模块用于将每一类特征转换为类别证据、不确定性和模态表示。对</w:t>
+      </w:r>
+      <w:r>
+        <w:rPr>
+          <w:rFonts w:asciiTheme="minorEastAsia" w:eastAsiaTheme="minorEastAsia" w:hAnsiTheme="minorEastAsia"/>
+          <w:sz w:val="24"/>
+          <w:szCs w:val="24"/>
+        </w:rPr>
+        <w:lastRenderedPageBreak/>
+        <w:t xml:space="preserve">于第 </w:t>
       </w:r>
       <m:oMath>
         <m:r>
@@ -2008,6 +2154,7 @@
     <w:p>
       <w:pPr>
         <w:pStyle w:val="a9"/>
+        <w:spacing w:line="360" w:lineRule="auto"/>
         <w:ind w:firstLineChars="200" w:firstLine="480"/>
         <w:rPr>
           <w:rFonts w:asciiTheme="minorEastAsia" w:eastAsiaTheme="minorEastAsia" w:hAnsiTheme="minorEastAsia"/>
@@ -2052,12 +2199,23 @@
             </m:sub>
           </m:sSub>
           <m:r>
+            <m:rPr>
+              <m:sty m:val="p"/>
+            </m:rPr>
             <w:rPr>
               <w:rFonts w:ascii="Cambria Math" w:eastAsiaTheme="minorEastAsia" w:hAnsi="Cambria Math"/>
               <w:sz w:val="24"/>
               <w:szCs w:val="24"/>
             </w:rPr>
-            <m:t>=Encode</m:t>
+            <m:t>=</m:t>
+          </m:r>
+          <m:r>
+            <w:rPr>
+              <w:rFonts w:ascii="Cambria Math" w:eastAsiaTheme="minorEastAsia" w:hAnsi="Cambria Math"/>
+              <w:sz w:val="24"/>
+              <w:szCs w:val="24"/>
+            </w:rPr>
+            <m:t>Encode</m:t>
           </m:r>
           <m:sSub>
             <m:sSubPr>
@@ -2091,6 +2249,9 @@
             </m:sub>
           </m:sSub>
           <m:r>
+            <m:rPr>
+              <m:sty m:val="p"/>
+            </m:rPr>
             <w:rPr>
               <w:rFonts w:ascii="Cambria Math" w:eastAsiaTheme="minorEastAsia" w:hAnsi="Cambria Math"/>
               <w:sz w:val="24"/>
@@ -2130,6 +2291,9 @@
             </m:sub>
           </m:sSub>
           <m:r>
+            <m:rPr>
+              <m:sty m:val="p"/>
+            </m:rPr>
             <w:rPr>
               <w:rFonts w:ascii="Cambria Math" w:eastAsiaTheme="minorEastAsia" w:hAnsi="Cambria Math"/>
               <w:sz w:val="24"/>
@@ -2142,6 +2306,8 @@
     </w:p>
     <w:p>
       <w:pPr>
+        <w:pStyle w:val="a9"/>
+        <w:spacing w:line="360" w:lineRule="auto"/>
         <w:ind w:firstLineChars="200" w:firstLine="480"/>
         <w:rPr>
           <w:rFonts w:asciiTheme="minorEastAsia" w:eastAsiaTheme="minorEastAsia" w:hAnsiTheme="minorEastAsia"/>
@@ -2287,6 +2453,7 @@
     <w:p>
       <w:pPr>
         <w:pStyle w:val="a9"/>
+        <w:spacing w:line="360" w:lineRule="auto"/>
         <w:ind w:firstLineChars="200" w:firstLine="480"/>
         <w:rPr>
           <w:rFonts w:asciiTheme="minorEastAsia" w:eastAsiaTheme="minorEastAsia" w:hAnsiTheme="minorEastAsia"/>
@@ -2347,6 +2514,7 @@
     <w:p>
       <w:pPr>
         <w:pStyle w:val="a9"/>
+        <w:spacing w:line="360" w:lineRule="auto"/>
         <w:ind w:firstLineChars="200" w:firstLine="480"/>
         <w:rPr>
           <w:rFonts w:asciiTheme="minorEastAsia" w:eastAsiaTheme="minorEastAsia" w:hAnsiTheme="minorEastAsia"/>
@@ -2391,12 +2559,34 @@
             </m:sub>
           </m:sSub>
           <m:r>
+            <m:rPr>
+              <m:sty m:val="p"/>
+            </m:rPr>
             <w:rPr>
               <w:rFonts w:ascii="Cambria Math" w:eastAsiaTheme="minorEastAsia" w:hAnsi="Cambria Math"/>
               <w:sz w:val="24"/>
               <w:szCs w:val="24"/>
             </w:rPr>
-            <m:t>=softplus(</m:t>
+            <m:t>=</m:t>
+          </m:r>
+          <m:r>
+            <w:rPr>
+              <w:rFonts w:ascii="Cambria Math" w:eastAsiaTheme="minorEastAsia" w:hAnsi="Cambria Math"/>
+              <w:sz w:val="24"/>
+              <w:szCs w:val="24"/>
+            </w:rPr>
+            <m:t>softplus</m:t>
+          </m:r>
+          <m:r>
+            <m:rPr>
+              <m:sty m:val="p"/>
+            </m:rPr>
+            <w:rPr>
+              <w:rFonts w:ascii="Cambria Math" w:eastAsiaTheme="minorEastAsia" w:hAnsi="Cambria Math"/>
+              <w:sz w:val="24"/>
+              <w:szCs w:val="24"/>
+            </w:rPr>
+            <m:t>(</m:t>
           </m:r>
           <m:sSub>
             <m:sSubPr>
@@ -2461,6 +2651,9 @@
             </m:sub>
           </m:sSub>
           <m:r>
+            <m:rPr>
+              <m:sty m:val="p"/>
+            </m:rPr>
             <w:rPr>
               <w:rFonts w:ascii="Cambria Math" w:eastAsiaTheme="minorEastAsia" w:hAnsi="Cambria Math"/>
               <w:sz w:val="24"/>
@@ -2500,6 +2693,9 @@
             </m:sub>
           </m:sSub>
           <m:r>
+            <m:rPr>
+              <m:sty m:val="p"/>
+            </m:rPr>
             <w:rPr>
               <w:rFonts w:ascii="Cambria Math" w:eastAsiaTheme="minorEastAsia" w:hAnsi="Cambria Math"/>
               <w:sz w:val="24"/>
@@ -2512,6 +2708,8 @@
     </w:p>
     <w:p>
       <w:pPr>
+        <w:pStyle w:val="a9"/>
+        <w:spacing w:line="360" w:lineRule="auto"/>
         <w:ind w:firstLineChars="200" w:firstLine="480"/>
         <w:rPr>
           <w:rFonts w:asciiTheme="minorEastAsia" w:eastAsiaTheme="minorEastAsia" w:hAnsiTheme="minorEastAsia"/>
@@ -2567,6 +2765,7 @@
     <w:p>
       <w:pPr>
         <w:pStyle w:val="a9"/>
+        <w:spacing w:line="360" w:lineRule="auto"/>
         <w:ind w:firstLineChars="200" w:firstLine="480"/>
         <w:rPr>
           <w:rFonts w:asciiTheme="minorEastAsia" w:eastAsiaTheme="minorEastAsia" w:hAnsiTheme="minorEastAsia"/>
@@ -2611,6 +2810,9 @@
             </m:sub>
           </m:sSub>
           <m:r>
+            <m:rPr>
+              <m:sty m:val="p"/>
+            </m:rPr>
             <w:rPr>
               <w:rFonts w:ascii="Cambria Math" w:eastAsiaTheme="minorEastAsia" w:hAnsi="Cambria Math"/>
               <w:sz w:val="24"/>
@@ -2650,6 +2852,9 @@
             </m:sub>
           </m:sSub>
           <m:r>
+            <m:rPr>
+              <m:sty m:val="p"/>
+            </m:rPr>
             <w:rPr>
               <w:rFonts w:ascii="Cambria Math" w:eastAsiaTheme="minorEastAsia" w:hAnsi="Cambria Math"/>
               <w:sz w:val="24"/>
@@ -2673,6 +2878,8 @@
     </w:p>
     <w:p>
       <w:pPr>
+        <w:pStyle w:val="a9"/>
+        <w:spacing w:line="360" w:lineRule="auto"/>
         <w:ind w:firstLineChars="200" w:firstLine="480"/>
         <w:rPr>
           <w:rFonts w:asciiTheme="minorEastAsia" w:eastAsiaTheme="minorEastAsia" w:hAnsiTheme="minorEastAsia"/>
@@ -2716,7 +2923,26 @@
                 <w:sz w:val="24"/>
                 <w:szCs w:val="24"/>
               </w:rPr>
-              <m:t>m,k</m:t>
+              <m:t>m</m:t>
+            </m:r>
+            <m:r>
+              <m:rPr>
+                <m:sty m:val="p"/>
+              </m:rPr>
+              <w:rPr>
+                <w:rFonts w:ascii="Cambria Math" w:eastAsiaTheme="minorEastAsia" w:hAnsi="Cambria Math"/>
+                <w:sz w:val="24"/>
+                <w:szCs w:val="24"/>
+              </w:rPr>
+              <m:t>,</m:t>
+            </m:r>
+            <m:r>
+              <w:rPr>
+                <w:rFonts w:ascii="Cambria Math" w:eastAsiaTheme="minorEastAsia" w:hAnsi="Cambria Math"/>
+                <w:sz w:val="24"/>
+                <w:szCs w:val="24"/>
+              </w:rPr>
+              <m:t>k</m:t>
             </m:r>
           </m:sub>
         </m:sSub>
@@ -2774,6 +3000,7 @@
     <w:p>
       <w:pPr>
         <w:pStyle w:val="a9"/>
+        <w:spacing w:line="360" w:lineRule="auto"/>
         <w:ind w:firstLineChars="200" w:firstLine="480"/>
         <w:rPr>
           <w:rFonts w:asciiTheme="minorEastAsia" w:eastAsiaTheme="minorEastAsia" w:hAnsiTheme="minorEastAsia"/>
@@ -2813,11 +3040,33 @@
                   <w:sz w:val="24"/>
                   <w:szCs w:val="24"/>
                 </w:rPr>
-                <m:t>m,k</m:t>
+                <m:t>m</m:t>
+              </m:r>
+              <m:r>
+                <m:rPr>
+                  <m:sty m:val="p"/>
+                </m:rPr>
+                <w:rPr>
+                  <w:rFonts w:ascii="Cambria Math" w:eastAsiaTheme="minorEastAsia" w:hAnsi="Cambria Math"/>
+                  <w:sz w:val="24"/>
+                  <w:szCs w:val="24"/>
+                </w:rPr>
+                <m:t>,</m:t>
+              </m:r>
+              <m:r>
+                <w:rPr>
+                  <w:rFonts w:ascii="Cambria Math" w:eastAsiaTheme="minorEastAsia" w:hAnsi="Cambria Math"/>
+                  <w:sz w:val="24"/>
+                  <w:szCs w:val="24"/>
+                </w:rPr>
+                <m:t>k</m:t>
               </m:r>
             </m:sub>
           </m:sSub>
           <m:r>
+            <m:rPr>
+              <m:sty m:val="p"/>
+            </m:rPr>
             <w:rPr>
               <w:rFonts w:ascii="Cambria Math" w:eastAsiaTheme="minorEastAsia" w:hAnsi="Cambria Math"/>
               <w:sz w:val="24"/>
@@ -2863,7 +3112,26 @@
                       <w:sz w:val="24"/>
                       <w:szCs w:val="24"/>
                     </w:rPr>
-                    <m:t>m,k</m:t>
+                    <m:t>m</m:t>
+                  </m:r>
+                  <m:r>
+                    <m:rPr>
+                      <m:sty m:val="p"/>
+                    </m:rPr>
+                    <w:rPr>
+                      <w:rFonts w:ascii="Cambria Math" w:eastAsiaTheme="minorEastAsia" w:hAnsi="Cambria Math"/>
+                      <w:sz w:val="24"/>
+                      <w:szCs w:val="24"/>
+                    </w:rPr>
+                    <m:t>,</m:t>
+                  </m:r>
+                  <m:r>
+                    <w:rPr>
+                      <w:rFonts w:ascii="Cambria Math" w:eastAsiaTheme="minorEastAsia" w:hAnsi="Cambria Math"/>
+                      <w:sz w:val="24"/>
+                      <w:szCs w:val="24"/>
+                    </w:rPr>
+                    <m:t>k</m:t>
                   </m:r>
                 </m:sub>
               </m:sSub>
@@ -2888,7 +3156,18 @@
                       <w:sz w:val="24"/>
                       <w:szCs w:val="24"/>
                     </w:rPr>
-                    <m:t>j=1</m:t>
+                    <m:t>j</m:t>
+                  </m:r>
+                  <m:r>
+                    <m:rPr>
+                      <m:sty m:val="p"/>
+                    </m:rPr>
+                    <w:rPr>
+                      <w:rFonts w:ascii="Cambria Math" w:eastAsiaTheme="minorEastAsia" w:hAnsi="Cambria Math"/>
+                      <w:sz w:val="24"/>
+                      <w:szCs w:val="24"/>
+                    </w:rPr>
+                    <m:t>=1</m:t>
                   </m:r>
                 </m:sub>
                 <m:sup>
@@ -2929,7 +3208,26 @@
                           <w:sz w:val="24"/>
                           <w:szCs w:val="24"/>
                         </w:rPr>
-                        <m:t>m,j</m:t>
+                        <m:t>m</m:t>
+                      </m:r>
+                      <m:r>
+                        <m:rPr>
+                          <m:sty m:val="p"/>
+                        </m:rPr>
+                        <w:rPr>
+                          <w:rFonts w:ascii="Cambria Math" w:eastAsiaTheme="minorEastAsia" w:hAnsi="Cambria Math"/>
+                          <w:sz w:val="24"/>
+                          <w:szCs w:val="24"/>
+                        </w:rPr>
+                        <m:t>,</m:t>
+                      </m:r>
+                      <m:r>
+                        <w:rPr>
+                          <w:rFonts w:ascii="Cambria Math" w:eastAsiaTheme="minorEastAsia" w:hAnsi="Cambria Math"/>
+                          <w:sz w:val="24"/>
+                          <w:szCs w:val="24"/>
+                        </w:rPr>
+                        <m:t>j</m:t>
                       </m:r>
                     </m:sub>
                   </m:sSub>
@@ -2938,6 +3236,9 @@
             </m:den>
           </m:f>
           <m:r>
+            <m:rPr>
+              <m:sty m:val="p"/>
+            </m:rPr>
             <w:rPr>
               <w:rFonts w:ascii="Cambria Math" w:eastAsiaTheme="minorEastAsia" w:hAnsi="Cambria Math"/>
               <w:sz w:val="24"/>
@@ -2977,6 +3278,9 @@
             </m:sub>
           </m:sSub>
           <m:r>
+            <m:rPr>
+              <m:sty m:val="p"/>
+            </m:rPr>
             <w:rPr>
               <w:rFonts w:ascii="Cambria Math" w:eastAsiaTheme="minorEastAsia" w:hAnsi="Cambria Math"/>
               <w:sz w:val="24"/>
@@ -3024,7 +3328,18 @@
                       <w:sz w:val="24"/>
                       <w:szCs w:val="24"/>
                     </w:rPr>
-                    <m:t>j=1</m:t>
+                    <m:t>j</m:t>
+                  </m:r>
+                  <m:r>
+                    <m:rPr>
+                      <m:sty m:val="p"/>
+                    </m:rPr>
+                    <w:rPr>
+                      <w:rFonts w:ascii="Cambria Math" w:eastAsiaTheme="minorEastAsia" w:hAnsi="Cambria Math"/>
+                      <w:sz w:val="24"/>
+                      <w:szCs w:val="24"/>
+                    </w:rPr>
+                    <m:t>=1</m:t>
                   </m:r>
                 </m:sub>
                 <m:sup>
@@ -3065,7 +3380,26 @@
                           <w:sz w:val="24"/>
                           <w:szCs w:val="24"/>
                         </w:rPr>
-                        <m:t>m,j</m:t>
+                        <m:t>m</m:t>
+                      </m:r>
+                      <m:r>
+                        <m:rPr>
+                          <m:sty m:val="p"/>
+                        </m:rPr>
+                        <w:rPr>
+                          <w:rFonts w:ascii="Cambria Math" w:eastAsiaTheme="minorEastAsia" w:hAnsi="Cambria Math"/>
+                          <w:sz w:val="24"/>
+                          <w:szCs w:val="24"/>
+                        </w:rPr>
+                        <m:t>,</m:t>
+                      </m:r>
+                      <m:r>
+                        <w:rPr>
+                          <w:rFonts w:ascii="Cambria Math" w:eastAsiaTheme="minorEastAsia" w:hAnsi="Cambria Math"/>
+                          <w:sz w:val="24"/>
+                          <w:szCs w:val="24"/>
+                        </w:rPr>
+                        <m:t>j</m:t>
                       </m:r>
                     </m:sub>
                   </m:sSub>
@@ -3078,6 +3412,8 @@
     </w:p>
     <w:p>
       <w:pPr>
+        <w:pStyle w:val="a9"/>
+        <w:spacing w:line="360" w:lineRule="auto"/>
         <w:ind w:firstLineChars="200" w:firstLine="480"/>
         <w:rPr>
           <w:rFonts w:asciiTheme="minorEastAsia" w:eastAsiaTheme="minorEastAsia" w:hAnsiTheme="minorEastAsia"/>
@@ -3121,7 +3457,26 @@
                 <w:sz w:val="24"/>
                 <w:szCs w:val="24"/>
               </w:rPr>
-              <m:t>m,k</m:t>
+              <m:t>m</m:t>
+            </m:r>
+            <m:r>
+              <m:rPr>
+                <m:sty m:val="p"/>
+              </m:rPr>
+              <w:rPr>
+                <w:rFonts w:ascii="Cambria Math" w:eastAsiaTheme="minorEastAsia" w:hAnsi="Cambria Math"/>
+                <w:sz w:val="24"/>
+                <w:szCs w:val="24"/>
+              </w:rPr>
+              <m:t>,</m:t>
+            </m:r>
+            <m:r>
+              <w:rPr>
+                <w:rFonts w:ascii="Cambria Math" w:eastAsiaTheme="minorEastAsia" w:hAnsi="Cambria Math"/>
+                <w:sz w:val="24"/>
+                <w:szCs w:val="24"/>
+              </w:rPr>
+              <m:t>k</m:t>
             </m:r>
           </m:sub>
         </m:sSub>
@@ -3220,6 +3575,7 @@
     <w:p>
       <w:pPr>
         <w:pStyle w:val="a9"/>
+        <w:spacing w:line="360" w:lineRule="auto"/>
         <w:ind w:firstLineChars="200" w:firstLine="480"/>
         <w:rPr>
           <w:rFonts w:asciiTheme="minorEastAsia" w:eastAsiaTheme="minorEastAsia" w:hAnsiTheme="minorEastAsia"/>
@@ -3293,6 +3649,7 @@
     <w:p>
       <w:pPr>
         <w:pStyle w:val="a9"/>
+        <w:spacing w:line="360" w:lineRule="auto"/>
         <w:ind w:firstLineChars="200" w:firstLine="480"/>
         <w:rPr>
           <w:rFonts w:asciiTheme="minorEastAsia" w:eastAsiaTheme="minorEastAsia" w:hAnsiTheme="minorEastAsia"/>
@@ -3312,6 +3669,7 @@
     <w:p>
       <w:pPr>
         <w:pStyle w:val="a9"/>
+        <w:spacing w:line="360" w:lineRule="auto"/>
         <w:ind w:firstLineChars="200" w:firstLine="480"/>
         <w:rPr>
           <w:rFonts w:asciiTheme="minorEastAsia" w:eastAsiaTheme="minorEastAsia" w:hAnsiTheme="minorEastAsia"/>
@@ -3367,6 +3725,7 @@
     <w:p>
       <w:pPr>
         <w:pStyle w:val="a9"/>
+        <w:spacing w:line="360" w:lineRule="auto"/>
         <w:ind w:firstLineChars="200" w:firstLine="480"/>
         <w:rPr>
           <w:rFonts w:asciiTheme="minorEastAsia" w:eastAsiaTheme="minorEastAsia" w:hAnsiTheme="minorEastAsia"/>
@@ -3411,6 +3770,9 @@
             </m:sub>
           </m:sSub>
           <m:r>
+            <m:rPr>
+              <m:sty m:val="p"/>
+            </m:rPr>
             <w:rPr>
               <w:rFonts w:ascii="Cambria Math" w:eastAsiaTheme="minorEastAsia" w:hAnsi="Cambria Math"/>
               <w:sz w:val="24"/>
@@ -3481,6 +3843,9 @@
             </m:sub>
           </m:sSub>
           <m:r>
+            <m:rPr>
+              <m:sty m:val="p"/>
+            </m:rPr>
             <w:rPr>
               <w:rFonts w:ascii="Cambria Math" w:eastAsiaTheme="minorEastAsia" w:hAnsi="Cambria Math"/>
               <w:sz w:val="24"/>
@@ -3520,6 +3885,9 @@
             </m:sub>
           </m:sSub>
           <m:r>
+            <m:rPr>
+              <m:sty m:val="p"/>
+            </m:rPr>
             <w:rPr>
               <w:rFonts w:ascii="Cambria Math" w:eastAsiaTheme="minorEastAsia" w:hAnsi="Cambria Math"/>
               <w:sz w:val="24"/>
@@ -3559,12 +3927,34 @@
             </m:sub>
           </m:sSub>
           <m:r>
+            <m:rPr>
+              <m:sty m:val="p"/>
+            </m:rPr>
             <w:rPr>
               <w:rFonts w:ascii="Cambria Math" w:eastAsiaTheme="minorEastAsia" w:hAnsi="Cambria Math"/>
               <w:sz w:val="24"/>
               <w:szCs w:val="24"/>
             </w:rPr>
-            <m:t>)D(</m:t>
+            <m:t>)</m:t>
+          </m:r>
+          <m:r>
+            <w:rPr>
+              <w:rFonts w:ascii="Cambria Math" w:eastAsiaTheme="minorEastAsia" w:hAnsi="Cambria Math"/>
+              <w:sz w:val="24"/>
+              <w:szCs w:val="24"/>
+            </w:rPr>
+            <m:t>D</m:t>
+          </m:r>
+          <m:r>
+            <m:rPr>
+              <m:sty m:val="p"/>
+            </m:rPr>
+            <w:rPr>
+              <w:rFonts w:ascii="Cambria Math" w:eastAsiaTheme="minorEastAsia" w:hAnsi="Cambria Math"/>
+              <w:sz w:val="24"/>
+              <w:szCs w:val="24"/>
+            </w:rPr>
+            <m:t>(</m:t>
           </m:r>
           <m:sSub>
             <m:sSubPr>
@@ -3598,6 +3988,9 @@
             </m:sub>
           </m:sSub>
           <m:r>
+            <m:rPr>
+              <m:sty m:val="p"/>
+            </m:rPr>
             <w:rPr>
               <w:rFonts w:ascii="Cambria Math" w:eastAsiaTheme="minorEastAsia" w:hAnsi="Cambria Math"/>
               <w:sz w:val="24"/>
@@ -3637,6 +4030,9 @@
             </m:sub>
           </m:sSub>
           <m:r>
+            <m:rPr>
+              <m:sty m:val="p"/>
+            </m:rPr>
             <w:rPr>
               <w:rFonts w:ascii="Cambria Math" w:eastAsiaTheme="minorEastAsia" w:hAnsi="Cambria Math"/>
               <w:sz w:val="24"/>
@@ -3649,6 +4045,8 @@
     </w:p>
     <w:p>
       <w:pPr>
+        <w:pStyle w:val="a9"/>
+        <w:spacing w:line="360" w:lineRule="auto"/>
         <w:ind w:firstLineChars="200" w:firstLine="480"/>
         <w:rPr>
           <w:rFonts w:asciiTheme="minorEastAsia" w:eastAsiaTheme="minorEastAsia" w:hAnsiTheme="minorEastAsia"/>
@@ -3671,7 +4069,18 @@
             <w:sz w:val="24"/>
             <w:szCs w:val="24"/>
           </w:rPr>
-          <m:t>D(</m:t>
+          <m:t>D</m:t>
+        </m:r>
+        <m:r>
+          <m:rPr>
+            <m:sty m:val="p"/>
+          </m:rPr>
+          <w:rPr>
+            <w:rFonts w:ascii="Cambria Math" w:eastAsiaTheme="minorEastAsia" w:hAnsi="Cambria Math"/>
+            <w:sz w:val="24"/>
+            <w:szCs w:val="24"/>
+          </w:rPr>
+          <m:t>(</m:t>
         </m:r>
         <m:sSub>
           <m:sSubPr>
@@ -3705,6 +4114,9 @@
           </m:sub>
         </m:sSub>
         <m:r>
+          <m:rPr>
+            <m:sty m:val="p"/>
+          </m:rPr>
           <w:rPr>
             <w:rFonts w:ascii="Cambria Math" w:eastAsiaTheme="minorEastAsia" w:hAnsi="Cambria Math"/>
             <w:sz w:val="24"/>
@@ -3744,6 +4156,9 @@
           </m:sub>
         </m:sSub>
         <m:r>
+          <m:rPr>
+            <m:sty m:val="p"/>
+          </m:rPr>
           <w:rPr>
             <w:rFonts w:ascii="Cambria Math" w:eastAsiaTheme="minorEastAsia" w:hAnsi="Cambria Math"/>
             <w:sz w:val="24"/>
@@ -3824,6 +4239,9 @@
           </m:sub>
         </m:sSub>
         <m:r>
+          <m:rPr>
+            <m:sty m:val="p"/>
+          </m:rPr>
           <w:rPr>
             <w:rFonts w:ascii="Cambria Math" w:eastAsiaTheme="minorEastAsia" w:hAnsi="Cambria Math"/>
             <w:sz w:val="24"/>
@@ -3863,6 +4281,9 @@
           </m:sub>
         </m:sSub>
         <m:r>
+          <m:rPr>
+            <m:sty m:val="p"/>
+          </m:rPr>
           <w:rPr>
             <w:rFonts w:ascii="Cambria Math" w:eastAsiaTheme="minorEastAsia" w:hAnsi="Cambria Math"/>
             <w:sz w:val="24"/>
@@ -3902,6 +4323,9 @@
           </m:sub>
         </m:sSub>
         <m:r>
+          <m:rPr>
+            <m:sty m:val="p"/>
+          </m:rPr>
           <w:rPr>
             <w:rFonts w:ascii="Cambria Math" w:eastAsiaTheme="minorEastAsia" w:hAnsi="Cambria Math"/>
             <w:sz w:val="24"/>
@@ -3940,6 +4364,7 @@
     <w:p>
       <w:pPr>
         <w:pStyle w:val="a9"/>
+        <w:spacing w:line="360" w:lineRule="auto"/>
         <w:ind w:firstLineChars="200" w:firstLine="480"/>
         <w:rPr>
           <w:rFonts w:asciiTheme="minorEastAsia" w:eastAsiaTheme="minorEastAsia" w:hAnsiTheme="minorEastAsia"/>
@@ -3953,6 +4378,7 @@
           <w:sz w:val="24"/>
           <w:szCs w:val="24"/>
         </w:rPr>
+        <w:lastRenderedPageBreak/>
         <w:t xml:space="preserve">系统将所有 </w:t>
       </w:r>
       <m:oMath>
@@ -4018,6 +4444,7 @@
     <w:p>
       <w:pPr>
         <w:pStyle w:val="a9"/>
+        <w:spacing w:line="360" w:lineRule="auto"/>
         <w:ind w:firstLineChars="200" w:firstLine="480"/>
         <w:rPr>
           <w:rFonts w:asciiTheme="minorEastAsia" w:eastAsiaTheme="minorEastAsia" w:hAnsiTheme="minorEastAsia"/>
@@ -4062,6 +4489,9 @@
             </m:sub>
           </m:sSub>
           <m:r>
+            <m:rPr>
+              <m:sty m:val="p"/>
+            </m:rPr>
             <w:rPr>
               <w:rFonts w:ascii="Cambria Math" w:eastAsiaTheme="minorEastAsia" w:hAnsi="Cambria Math"/>
               <w:sz w:val="24"/>
@@ -4081,6 +4511,9 @@
             </m:fPr>
             <m:num>
               <m:r>
+                <m:rPr>
+                  <m:sty m:val="p"/>
+                </m:rPr>
                 <w:rPr>
                   <w:rFonts w:ascii="Cambria Math" w:eastAsiaTheme="minorEastAsia" w:hAnsi="Cambria Math"/>
                   <w:sz w:val="24"/>
@@ -4096,7 +4529,37 @@
                   <w:sz w:val="24"/>
                   <w:szCs w:val="24"/>
                 </w:rPr>
-                <m:t>M(M-1)</m:t>
+                <m:t>M</m:t>
+              </m:r>
+              <m:r>
+                <m:rPr>
+                  <m:sty m:val="p"/>
+                </m:rPr>
+                <w:rPr>
+                  <w:rFonts w:ascii="Cambria Math" w:eastAsiaTheme="minorEastAsia" w:hAnsi="Cambria Math"/>
+                  <w:sz w:val="24"/>
+                  <w:szCs w:val="24"/>
+                </w:rPr>
+                <m:t>(</m:t>
+              </m:r>
+              <m:r>
+                <w:rPr>
+                  <w:rFonts w:ascii="Cambria Math" w:eastAsiaTheme="minorEastAsia" w:hAnsi="Cambria Math"/>
+                  <w:sz w:val="24"/>
+                  <w:szCs w:val="24"/>
+                </w:rPr>
+                <m:t>M</m:t>
+              </m:r>
+              <m:r>
+                <m:rPr>
+                  <m:sty m:val="p"/>
+                </m:rPr>
+                <w:rPr>
+                  <w:rFonts w:ascii="Cambria Math" w:eastAsiaTheme="minorEastAsia" w:hAnsi="Cambria Math"/>
+                  <w:sz w:val="24"/>
+                  <w:szCs w:val="24"/>
+                </w:rPr>
+                <m:t>-1)</m:t>
               </m:r>
             </m:den>
           </m:f>
@@ -4115,12 +4578,61 @@
             </m:naryPr>
             <m:sub>
               <m:r>
-                <w:rPr>
-                  <w:rFonts w:ascii="Cambria Math" w:eastAsiaTheme="minorEastAsia" w:hAnsi="Cambria Math"/>
-                  <w:sz w:val="24"/>
-                  <w:szCs w:val="24"/>
-                </w:rPr>
-                <m:t>1≤i&lt;j≤M</m:t>
+                <m:rPr>
+                  <m:sty m:val="p"/>
+                </m:rPr>
+                <w:rPr>
+                  <w:rFonts w:ascii="Cambria Math" w:eastAsiaTheme="minorEastAsia" w:hAnsi="Cambria Math"/>
+                  <w:sz w:val="24"/>
+                  <w:szCs w:val="24"/>
+                </w:rPr>
+                <m:t>1≤</m:t>
+              </m:r>
+              <m:r>
+                <w:rPr>
+                  <w:rFonts w:ascii="Cambria Math" w:eastAsiaTheme="minorEastAsia" w:hAnsi="Cambria Math"/>
+                  <w:sz w:val="24"/>
+                  <w:szCs w:val="24"/>
+                </w:rPr>
+                <m:t>i</m:t>
+              </m:r>
+              <m:r>
+                <m:rPr>
+                  <m:sty m:val="p"/>
+                </m:rPr>
+                <w:rPr>
+                  <w:rFonts w:ascii="Cambria Math" w:eastAsiaTheme="minorEastAsia" w:hAnsi="Cambria Math"/>
+                  <w:sz w:val="24"/>
+                  <w:szCs w:val="24"/>
+                </w:rPr>
+                <m:t>&lt;</m:t>
+              </m:r>
+              <m:r>
+                <w:rPr>
+                  <w:rFonts w:ascii="Cambria Math" w:eastAsiaTheme="minorEastAsia" w:hAnsi="Cambria Math"/>
+                  <w:sz w:val="24"/>
+                  <w:szCs w:val="24"/>
+                </w:rPr>
+                <m:t>j</m:t>
+              </m:r>
+              <m:r>
+                <m:rPr>
+                  <m:sty m:val="p"/>
+                </m:rPr>
+                <w:rPr>
+                  <w:rFonts w:ascii="Cambria Math" w:eastAsiaTheme="minorEastAsia" w:hAnsi="Cambria Math"/>
+                  <w:sz w:val="24"/>
+                  <w:szCs w:val="24"/>
+                </w:rPr>
+                <m:t>≤</m:t>
+              </m:r>
+              <m:r>
+                <w:rPr>
+                  <w:rFonts w:ascii="Cambria Math" w:eastAsiaTheme="minorEastAsia" w:hAnsi="Cambria Math"/>
+                  <w:sz w:val="24"/>
+                  <w:szCs w:val="24"/>
+                </w:rPr>
+                <m:t>M</m:t>
               </m:r>
             </m:sub>
             <m:sup/>
@@ -4163,6 +4675,8 @@
     </w:p>
     <w:p>
       <w:pPr>
+        <w:pStyle w:val="a9"/>
+        <w:spacing w:line="360" w:lineRule="auto"/>
         <w:ind w:firstLineChars="200" w:firstLine="480"/>
         <w:rPr>
           <w:rFonts w:asciiTheme="minorEastAsia" w:eastAsiaTheme="minorEastAsia" w:hAnsiTheme="minorEastAsia"/>
@@ -4182,6 +4696,7 @@
     <w:p>
       <w:pPr>
         <w:pStyle w:val="a9"/>
+        <w:spacing w:line="360" w:lineRule="auto"/>
         <w:ind w:firstLineChars="200" w:firstLine="480"/>
         <w:rPr>
           <w:rFonts w:asciiTheme="minorEastAsia" w:eastAsiaTheme="minorEastAsia" w:hAnsiTheme="minorEastAsia"/>
@@ -4226,6 +4741,9 @@
             </m:sub>
           </m:sSub>
           <m:r>
+            <m:rPr>
+              <m:sty m:val="p"/>
+            </m:rPr>
             <w:rPr>
               <w:rFonts w:ascii="Cambria Math" w:eastAsiaTheme="minorEastAsia" w:hAnsi="Cambria Math"/>
               <w:sz w:val="24"/>
@@ -4245,6 +4763,9 @@
             </m:fPr>
             <m:num>
               <m:r>
+                <m:rPr>
+                  <m:sty m:val="p"/>
+                </m:rPr>
                 <w:rPr>
                   <w:rFonts w:ascii="Cambria Math" w:eastAsiaTheme="minorEastAsia" w:hAnsi="Cambria Math"/>
                   <w:sz w:val="24"/>
@@ -4260,7 +4781,18 @@
                   <w:sz w:val="24"/>
                   <w:szCs w:val="24"/>
                 </w:rPr>
-                <m:t>M-1</m:t>
+                <m:t>M</m:t>
+              </m:r>
+              <m:r>
+                <m:rPr>
+                  <m:sty m:val="p"/>
+                </m:rPr>
+                <w:rPr>
+                  <w:rFonts w:ascii="Cambria Math" w:eastAsiaTheme="minorEastAsia" w:hAnsi="Cambria Math"/>
+                  <w:sz w:val="24"/>
+                  <w:szCs w:val="24"/>
+                </w:rPr>
+                <m:t>-1</m:t>
               </m:r>
             </m:den>
           </m:f>
@@ -4284,7 +4816,26 @@
                   <w:sz w:val="24"/>
                   <w:szCs w:val="24"/>
                 </w:rPr>
-                <m:t>j≠m</m:t>
+                <m:t>j</m:t>
+              </m:r>
+              <m:r>
+                <m:rPr>
+                  <m:sty m:val="p"/>
+                </m:rPr>
+                <w:rPr>
+                  <w:rFonts w:ascii="Cambria Math" w:eastAsiaTheme="minorEastAsia" w:hAnsi="Cambria Math"/>
+                  <w:sz w:val="24"/>
+                  <w:szCs w:val="24"/>
+                </w:rPr>
+                <m:t>≠</m:t>
+              </m:r>
+              <m:r>
+                <w:rPr>
+                  <w:rFonts w:ascii="Cambria Math" w:eastAsiaTheme="minorEastAsia" w:hAnsi="Cambria Math"/>
+                  <w:sz w:val="24"/>
+                  <w:szCs w:val="24"/>
+                </w:rPr>
+                <m:t>m</m:t>
               </m:r>
             </m:sub>
             <m:sup/>
@@ -4327,6 +4878,8 @@
     </w:p>
     <w:p>
       <w:pPr>
+        <w:pStyle w:val="a9"/>
+        <w:spacing w:line="360" w:lineRule="auto"/>
         <w:ind w:firstLineChars="200" w:firstLine="480"/>
         <w:rPr>
           <w:rFonts w:asciiTheme="minorEastAsia" w:eastAsiaTheme="minorEastAsia" w:hAnsiTheme="minorEastAsia"/>
@@ -4436,6 +4989,7 @@
     <w:p>
       <w:pPr>
         <w:pStyle w:val="a9"/>
+        <w:spacing w:line="360" w:lineRule="auto"/>
         <w:ind w:firstLineChars="200" w:firstLine="480"/>
         <w:rPr>
           <w:rFonts w:asciiTheme="minorEastAsia" w:eastAsiaTheme="minorEastAsia" w:hAnsiTheme="minorEastAsia"/>
@@ -4455,6 +5009,7 @@
     <w:p>
       <w:pPr>
         <w:pStyle w:val="a9"/>
+        <w:spacing w:line="360" w:lineRule="auto"/>
         <w:ind w:firstLineChars="200" w:firstLine="480"/>
         <w:rPr>
           <w:rFonts w:asciiTheme="minorEastAsia" w:eastAsiaTheme="minorEastAsia" w:hAnsiTheme="minorEastAsia"/>
@@ -4474,6 +5029,7 @@
     <w:p>
       <w:pPr>
         <w:pStyle w:val="a9"/>
+        <w:spacing w:line="360" w:lineRule="auto"/>
         <w:ind w:firstLineChars="200" w:firstLine="480"/>
         <w:rPr>
           <w:rFonts w:asciiTheme="minorEastAsia" w:eastAsiaTheme="minorEastAsia" w:hAnsiTheme="minorEastAsia"/>
@@ -4529,6 +5085,7 @@
     <w:p>
       <w:pPr>
         <w:pStyle w:val="a9"/>
+        <w:spacing w:line="360" w:lineRule="auto"/>
         <w:ind w:firstLineChars="200" w:firstLine="480"/>
         <w:rPr>
           <w:rFonts w:asciiTheme="minorEastAsia" w:eastAsiaTheme="minorEastAsia" w:hAnsiTheme="minorEastAsia"/>
@@ -4573,12 +5130,34 @@
             </m:sub>
           </m:sSub>
           <m:r>
+            <m:rPr>
+              <m:sty m:val="p"/>
+            </m:rPr>
             <w:rPr>
               <w:rFonts w:ascii="Cambria Math" w:eastAsiaTheme="minorEastAsia" w:hAnsi="Cambria Math"/>
               <w:sz w:val="24"/>
               <w:szCs w:val="24"/>
             </w:rPr>
-            <m:t>=clip(</m:t>
+            <m:t>=</m:t>
+          </m:r>
+          <m:r>
+            <w:rPr>
+              <w:rFonts w:ascii="Cambria Math" w:eastAsiaTheme="minorEastAsia" w:hAnsi="Cambria Math"/>
+              <w:sz w:val="24"/>
+              <w:szCs w:val="24"/>
+            </w:rPr>
+            <m:t>clip</m:t>
+          </m:r>
+          <m:r>
+            <m:rPr>
+              <m:sty m:val="p"/>
+            </m:rPr>
+            <w:rPr>
+              <w:rFonts w:ascii="Cambria Math" w:eastAsiaTheme="minorEastAsia" w:hAnsi="Cambria Math"/>
+              <w:sz w:val="24"/>
+              <w:szCs w:val="24"/>
+            </w:rPr>
+            <m:t>(</m:t>
           </m:r>
           <m:sSub>
             <m:sSubPr>
@@ -4612,6 +5191,9 @@
             </m:sub>
           </m:sSub>
           <m:r>
+            <m:rPr>
+              <m:sty m:val="p"/>
+            </m:rPr>
             <w:rPr>
               <w:rFonts w:ascii="Cambria Math" w:eastAsiaTheme="minorEastAsia" w:hAnsi="Cambria Math"/>
               <w:sz w:val="24"/>
@@ -4651,6 +5233,9 @@
             </m:sub>
           </m:sSub>
           <m:r>
+            <m:rPr>
+              <m:sty m:val="p"/>
+            </m:rPr>
             <w:rPr>
               <w:rFonts w:ascii="Cambria Math" w:eastAsiaTheme="minorEastAsia" w:hAnsi="Cambria Math"/>
               <w:sz w:val="24"/>
@@ -4690,6 +5275,9 @@
             </m:sub>
           </m:sSub>
           <m:r>
+            <m:rPr>
+              <m:sty m:val="p"/>
+            </m:rPr>
             <w:rPr>
               <w:rFonts w:ascii="Cambria Math" w:eastAsiaTheme="minorEastAsia" w:hAnsi="Cambria Math"/>
               <w:sz w:val="24"/>
@@ -4729,6 +5317,9 @@
             </m:sub>
           </m:sSub>
           <m:r>
+            <m:rPr>
+              <m:sty m:val="p"/>
+            </m:rPr>
             <w:rPr>
               <w:rFonts w:ascii="Cambria Math" w:eastAsiaTheme="minorEastAsia" w:hAnsi="Cambria Math"/>
               <w:sz w:val="24"/>
@@ -4741,6 +5332,8 @@
     </w:p>
     <w:p>
       <w:pPr>
+        <w:pStyle w:val="a9"/>
+        <w:spacing w:line="360" w:lineRule="auto"/>
         <w:ind w:firstLineChars="200" w:firstLine="480"/>
         <w:rPr>
           <w:rFonts w:asciiTheme="minorEastAsia" w:eastAsiaTheme="minorEastAsia" w:hAnsiTheme="minorEastAsia"/>
@@ -4754,7 +5347,6 @@
           <w:sz w:val="24"/>
           <w:szCs w:val="24"/>
         </w:rPr>
-        <w:lastRenderedPageBreak/>
         <w:t>其中，</w:t>
       </w:r>
       <m:oMath>
@@ -4802,6 +5394,7 @@
     <w:p>
       <w:pPr>
         <w:pStyle w:val="a9"/>
+        <w:spacing w:line="360" w:lineRule="auto"/>
         <w:ind w:firstLineChars="200" w:firstLine="480"/>
         <w:rPr>
           <w:rFonts w:asciiTheme="minorEastAsia" w:eastAsiaTheme="minorEastAsia" w:hAnsiTheme="minorEastAsia"/>
@@ -4862,6 +5455,9 @@
             </m:sub>
           </m:sSub>
           <m:r>
+            <m:rPr>
+              <m:sty m:val="p"/>
+            </m:rPr>
             <w:rPr>
               <w:rFonts w:ascii="Cambria Math" w:eastAsiaTheme="minorEastAsia" w:hAnsi="Cambria Math"/>
               <w:sz w:val="24"/>
@@ -4932,6 +5528,9 @@
             </m:sub>
           </m:sSub>
           <m:r>
+            <m:rPr>
+              <m:sty m:val="p"/>
+            </m:rPr>
             <w:rPr>
               <w:rFonts w:ascii="Cambria Math" w:eastAsiaTheme="minorEastAsia" w:hAnsi="Cambria Math"/>
               <w:sz w:val="24"/>
@@ -4987,6 +5586,9 @@
             </m:sub>
           </m:sSub>
           <m:r>
+            <m:rPr>
+              <m:sty m:val="p"/>
+            </m:rPr>
             <w:rPr>
               <w:rFonts w:ascii="Cambria Math" w:eastAsiaTheme="minorEastAsia" w:hAnsi="Cambria Math"/>
               <w:sz w:val="24"/>
@@ -5026,6 +5628,9 @@
             </m:sub>
           </m:sSub>
           <m:r>
+            <m:rPr>
+              <m:sty m:val="p"/>
+            </m:rPr>
             <w:rPr>
               <w:rFonts w:ascii="Cambria Math" w:eastAsiaTheme="minorEastAsia" w:hAnsi="Cambria Math"/>
               <w:sz w:val="24"/>
@@ -5065,6 +5670,9 @@
             </m:sub>
           </m:sSub>
           <m:r>
+            <m:rPr>
+              <m:sty m:val="p"/>
+            </m:rPr>
             <w:rPr>
               <w:rFonts w:ascii="Cambria Math" w:eastAsiaTheme="minorEastAsia" w:hAnsi="Cambria Math"/>
               <w:sz w:val="24"/>
@@ -5077,6 +5685,8 @@
     </w:p>
     <w:p>
       <w:pPr>
+        <w:pStyle w:val="a9"/>
+        <w:spacing w:line="360" w:lineRule="auto"/>
         <w:ind w:firstLineChars="200" w:firstLine="480"/>
         <w:rPr>
           <w:rFonts w:asciiTheme="minorEastAsia" w:eastAsiaTheme="minorEastAsia" w:hAnsiTheme="minorEastAsia"/>
@@ -5214,6 +5824,7 @@
     <w:p>
       <w:pPr>
         <w:pStyle w:val="a9"/>
+        <w:spacing w:line="360" w:lineRule="auto"/>
         <w:ind w:firstLineChars="200" w:firstLine="480"/>
         <w:rPr>
           <w:rFonts w:asciiTheme="minorEastAsia" w:eastAsiaTheme="minorEastAsia" w:hAnsiTheme="minorEastAsia"/>
@@ -5262,6 +5873,9 @@
           </m:sub>
         </m:sSub>
         <m:r>
+          <m:rPr>
+            <m:sty m:val="p"/>
+          </m:rPr>
           <w:rPr>
             <w:rFonts w:ascii="Cambria Math" w:eastAsiaTheme="minorEastAsia" w:hAnsi="Cambria Math"/>
             <w:sz w:val="24"/>
@@ -5342,6 +5956,9 @@
           </m:sub>
         </m:sSub>
         <m:r>
+          <m:rPr>
+            <m:sty m:val="p"/>
+          </m:rPr>
           <w:rPr>
             <w:rFonts w:ascii="Cambria Math" w:eastAsiaTheme="minorEastAsia" w:hAnsi="Cambria Math"/>
             <w:sz w:val="24"/>
@@ -5381,6 +5998,9 @@
           </m:sub>
         </m:sSub>
         <m:r>
+          <m:rPr>
+            <m:sty m:val="p"/>
+          </m:rPr>
           <w:rPr>
             <w:rFonts w:ascii="Cambria Math" w:eastAsiaTheme="minorEastAsia" w:hAnsi="Cambria Math"/>
             <w:sz w:val="24"/>
@@ -5461,6 +6081,9 @@
           </m:sub>
         </m:sSub>
         <m:r>
+          <m:rPr>
+            <m:sty m:val="p"/>
+          </m:rPr>
           <w:rPr>
             <w:rFonts w:ascii="Cambria Math" w:eastAsiaTheme="minorEastAsia" w:hAnsi="Cambria Math"/>
             <w:sz w:val="24"/>
@@ -5506,12 +6129,22 @@
           <w:sz w:val="24"/>
           <w:szCs w:val="24"/>
         </w:rPr>
-        <w:t>，说明当前样本具有显著证据矛盾，系统保留主要模态意见，直接进入开放集未知风险判定或待确认流程。</w:t>
+        <w:t>，</w:t>
+      </w:r>
+      <w:r>
+        <w:rPr>
+          <w:rFonts w:asciiTheme="minorEastAsia" w:eastAsiaTheme="minorEastAsia" w:hAnsiTheme="minorEastAsia"/>
+          <w:sz w:val="24"/>
+          <w:szCs w:val="24"/>
+        </w:rPr>
+        <w:lastRenderedPageBreak/>
+        <w:t>说明当前样本具有显著证据矛盾，系统保留主要模态意见，直接进入开放集未知风险判定或待确认流程。</w:t>
       </w:r>
     </w:p>
     <w:p>
       <w:pPr>
         <w:pStyle w:val="a9"/>
+        <w:spacing w:line="360" w:lineRule="auto"/>
         <w:ind w:firstLineChars="200" w:firstLine="480"/>
         <w:rPr>
           <w:rFonts w:asciiTheme="minorEastAsia" w:eastAsiaTheme="minorEastAsia" w:hAnsiTheme="minorEastAsia"/>
@@ -5531,6 +6164,7 @@
     <w:p>
       <w:pPr>
         <w:pStyle w:val="a9"/>
+        <w:spacing w:line="360" w:lineRule="auto"/>
         <w:ind w:firstLineChars="200" w:firstLine="480"/>
         <w:rPr>
           <w:rFonts w:asciiTheme="minorEastAsia" w:eastAsiaTheme="minorEastAsia" w:hAnsiTheme="minorEastAsia"/>
@@ -5575,6 +6209,9 @@
             </m:sub>
           </m:sSub>
           <m:r>
+            <m:rPr>
+              <m:sty m:val="p"/>
+            </m:rPr>
             <w:rPr>
               <w:rFonts w:ascii="Cambria Math" w:eastAsiaTheme="minorEastAsia" w:hAnsi="Cambria Math"/>
               <w:sz w:val="24"/>
@@ -5601,7 +6238,18 @@
                   <w:sz w:val="24"/>
                   <w:szCs w:val="24"/>
                 </w:rPr>
-                <m:t>m=1</m:t>
+                <m:t>m</m:t>
+              </m:r>
+              <m:r>
+                <m:rPr>
+                  <m:sty m:val="p"/>
+                </m:rPr>
+                <w:rPr>
+                  <w:rFonts w:ascii="Cambria Math" w:eastAsiaTheme="minorEastAsia" w:hAnsi="Cambria Math"/>
+                  <w:sz w:val="24"/>
+                  <w:szCs w:val="24"/>
+                </w:rPr>
+                <m:t>=1</m:t>
               </m:r>
             </m:sub>
             <m:sup>
@@ -5715,6 +6363,8 @@
     </w:p>
     <w:p>
       <w:pPr>
+        <w:pStyle w:val="a9"/>
+        <w:spacing w:line="360" w:lineRule="auto"/>
         <w:ind w:firstLineChars="200" w:firstLine="480"/>
         <w:rPr>
           <w:rFonts w:asciiTheme="minorEastAsia" w:eastAsiaTheme="minorEastAsia" w:hAnsiTheme="minorEastAsia"/>
@@ -5804,6 +6454,9 @@
           </m:sub>
         </m:sSub>
         <m:r>
+          <m:rPr>
+            <m:sty m:val="p"/>
+          </m:rPr>
           <w:rPr>
             <w:rFonts w:ascii="Cambria Math" w:eastAsiaTheme="minorEastAsia" w:hAnsi="Cambria Math"/>
             <w:sz w:val="24"/>
@@ -5843,6 +6496,9 @@
           </m:sub>
         </m:sSub>
         <m:r>
+          <m:rPr>
+            <m:sty m:val="p"/>
+          </m:rPr>
           <w:rPr>
             <w:rFonts w:ascii="Cambria Math" w:eastAsiaTheme="minorEastAsia" w:hAnsi="Cambria Math"/>
             <w:sz w:val="24"/>
@@ -5956,6 +6612,7 @@
     <w:p>
       <w:pPr>
         <w:pStyle w:val="a9"/>
+        <w:spacing w:line="360" w:lineRule="auto"/>
         <w:ind w:firstLineChars="200" w:firstLine="480"/>
         <w:rPr>
           <w:rFonts w:asciiTheme="minorEastAsia" w:eastAsiaTheme="minorEastAsia" w:hAnsiTheme="minorEastAsia"/>
@@ -5975,6 +6632,7 @@
     <w:p>
       <w:pPr>
         <w:pStyle w:val="a9"/>
+        <w:spacing w:line="360" w:lineRule="auto"/>
         <w:ind w:firstLineChars="200" w:firstLine="480"/>
         <w:rPr>
           <w:rFonts w:asciiTheme="minorEastAsia" w:eastAsiaTheme="minorEastAsia" w:hAnsiTheme="minorEastAsia"/>
@@ -6120,7 +6778,37 @@
             <w:sz w:val="24"/>
             <w:szCs w:val="24"/>
           </w:rPr>
-          <m:t>E(x)</m:t>
+          <m:t>E</m:t>
+        </m:r>
+        <m:r>
+          <m:rPr>
+            <m:sty m:val="p"/>
+          </m:rPr>
+          <w:rPr>
+            <w:rFonts w:ascii="Cambria Math" w:eastAsiaTheme="minorEastAsia" w:hAnsi="Cambria Math"/>
+            <w:sz w:val="24"/>
+            <w:szCs w:val="24"/>
+          </w:rPr>
+          <m:t>(</m:t>
+        </m:r>
+        <m:r>
+          <w:rPr>
+            <w:rFonts w:ascii="Cambria Math" w:eastAsiaTheme="minorEastAsia" w:hAnsi="Cambria Math"/>
+            <w:sz w:val="24"/>
+            <w:szCs w:val="24"/>
+          </w:rPr>
+          <m:t>x</m:t>
+        </m:r>
+        <m:r>
+          <m:rPr>
+            <m:sty m:val="p"/>
+          </m:rPr>
+          <w:rPr>
+            <w:rFonts w:ascii="Cambria Math" w:eastAsiaTheme="minorEastAsia" w:hAnsi="Cambria Math"/>
+            <w:sz w:val="24"/>
+            <w:szCs w:val="24"/>
+          </w:rPr>
+          <m:t>)</m:t>
         </m:r>
       </m:oMath>
       <w:r>
@@ -6258,6 +6946,7 @@
     <w:p>
       <w:pPr>
         <w:pStyle w:val="a9"/>
+        <w:spacing w:line="360" w:lineRule="auto"/>
         <w:ind w:firstLineChars="200" w:firstLine="480"/>
         <w:rPr>
           <w:rFonts w:asciiTheme="minorEastAsia" w:eastAsiaTheme="minorEastAsia" w:hAnsiTheme="minorEastAsia"/>
@@ -6277,6 +6966,7 @@
     <w:p>
       <w:pPr>
         <w:pStyle w:val="a9"/>
+        <w:spacing w:line="360" w:lineRule="auto"/>
         <w:ind w:firstLineChars="200" w:firstLine="480"/>
         <w:rPr>
           <w:rFonts w:asciiTheme="minorEastAsia" w:eastAsiaTheme="minorEastAsia" w:hAnsiTheme="minorEastAsia"/>
@@ -6321,6 +7011,9 @@
             </m:sub>
           </m:sSub>
           <m:r>
+            <m:rPr>
+              <m:sty m:val="p"/>
+            </m:rPr>
             <w:rPr>
               <w:rFonts w:ascii="Cambria Math" w:eastAsiaTheme="minorEastAsia" w:hAnsi="Cambria Math"/>
               <w:sz w:val="24"/>
@@ -6340,6 +7033,9 @@
             </m:fPr>
             <m:num>
               <m:r>
+                <m:rPr>
+                  <m:sty m:val="p"/>
+                </m:rPr>
                 <w:rPr>
                   <w:rFonts w:ascii="Cambria Math" w:eastAsiaTheme="minorEastAsia" w:hAnsi="Cambria Math"/>
                   <w:sz w:val="24"/>
@@ -6350,6 +7046,9 @@
             </m:num>
             <m:den>
               <m:r>
+                <m:rPr>
+                  <m:sty m:val="p"/>
+                </m:rPr>
                 <w:rPr>
                   <w:rFonts w:ascii="Cambria Math" w:eastAsiaTheme="minorEastAsia" w:hAnsi="Cambria Math"/>
                   <w:sz w:val="24"/>
@@ -6389,6 +7088,9 @@
                 </m:sub>
               </m:sSub>
               <m:r>
+                <m:rPr>
+                  <m:sty m:val="p"/>
+                </m:rPr>
                 <w:rPr>
                   <w:rFonts w:ascii="Cambria Math" w:eastAsiaTheme="minorEastAsia" w:hAnsi="Cambria Math"/>
                   <w:sz w:val="24"/>
@@ -6444,6 +7146,9 @@
                 </m:sub>
               </m:sSub>
               <m:r>
+                <m:rPr>
+                  <m:sty m:val="p"/>
+                </m:rPr>
                 <w:rPr>
                   <w:rFonts w:ascii="Cambria Math" w:eastAsiaTheme="minorEastAsia" w:hAnsi="Cambria Math"/>
                   <w:sz w:val="24"/>
@@ -6519,6 +7224,9 @@
             </m:e>
           </m:nary>
           <m:r>
+            <m:rPr>
+              <m:sty m:val="p"/>
+            </m:rPr>
             <w:rPr>
               <w:rFonts w:ascii="Cambria Math" w:eastAsiaTheme="minorEastAsia" w:hAnsi="Cambria Math"/>
               <w:sz w:val="24"/>
@@ -6558,6 +7266,9 @@
             </m:sub>
           </m:sSub>
           <m:r>
+            <m:rPr>
+              <m:sty m:val="p"/>
+            </m:rPr>
             <w:rPr>
               <w:rFonts w:ascii="Cambria Math" w:eastAsiaTheme="minorEastAsia" w:hAnsi="Cambria Math"/>
               <w:sz w:val="24"/>
@@ -6570,6 +7281,8 @@
     </w:p>
     <w:p>
       <w:pPr>
+        <w:pStyle w:val="a9"/>
+        <w:spacing w:line="360" w:lineRule="auto"/>
         <w:ind w:firstLineChars="200" w:firstLine="480"/>
         <w:rPr>
           <w:rFonts w:asciiTheme="minorEastAsia" w:eastAsiaTheme="minorEastAsia" w:hAnsiTheme="minorEastAsia"/>
@@ -6589,6 +7302,7 @@
     <w:p>
       <w:pPr>
         <w:pStyle w:val="a9"/>
+        <w:spacing w:line="360" w:lineRule="auto"/>
         <w:ind w:firstLineChars="200" w:firstLine="480"/>
         <w:rPr>
           <w:rFonts w:asciiTheme="minorEastAsia" w:eastAsiaTheme="minorEastAsia" w:hAnsiTheme="minorEastAsia"/>
@@ -6633,6 +7347,9 @@
             </m:sub>
           </m:sSub>
           <m:r>
+            <m:rPr>
+              <m:sty m:val="p"/>
+            </m:rPr>
             <w:rPr>
               <w:rFonts w:ascii="Cambria Math" w:eastAsiaTheme="minorEastAsia" w:hAnsi="Cambria Math"/>
               <w:sz w:val="24"/>
@@ -6675,6 +7392,9 @@
             </m:lim>
           </m:limLow>
           <m:r>
+            <m:rPr>
+              <m:sty m:val="p"/>
+            </m:rPr>
             <w:rPr>
               <w:rFonts w:ascii="Cambria Math" w:eastAsiaTheme="minorEastAsia" w:hAnsi="Cambria Math"/>
               <w:sz w:val="24"/>
@@ -6714,6 +7434,9 @@
             </m:sub>
           </m:sSub>
           <m:r>
+            <m:rPr>
+              <m:sty m:val="p"/>
+            </m:rPr>
             <w:rPr>
               <w:rFonts w:ascii="Cambria Math" w:eastAsiaTheme="minorEastAsia" w:hAnsi="Cambria Math"/>
               <w:sz w:val="24"/>
@@ -6764,6 +7487,9 @@
             </m:sSubPr>
             <m:e>
               <m:r>
+                <m:rPr>
+                  <m:sty m:val="p"/>
+                </m:rPr>
                 <w:rPr>
                   <w:rFonts w:ascii="Cambria Math" w:eastAsiaTheme="minorEastAsia" w:hAnsi="Cambria Math"/>
                   <w:sz w:val="24"/>
@@ -6774,6 +7500,9 @@
             </m:e>
             <m:sub>
               <m:r>
+                <m:rPr>
+                  <m:sty m:val="p"/>
+                </m:rPr>
                 <w:rPr>
                   <w:rFonts w:ascii="Cambria Math" w:eastAsiaTheme="minorEastAsia" w:hAnsi="Cambria Math"/>
                   <w:sz w:val="24"/>
@@ -6788,6 +7517,8 @@
     </w:p>
     <w:p>
       <w:pPr>
+        <w:pStyle w:val="a9"/>
+        <w:spacing w:line="360" w:lineRule="auto"/>
         <w:ind w:firstLineChars="200" w:firstLine="480"/>
         <w:rPr>
           <w:rFonts w:asciiTheme="minorEastAsia" w:eastAsiaTheme="minorEastAsia" w:hAnsiTheme="minorEastAsia"/>
@@ -6807,6 +7538,7 @@
     <w:p>
       <w:pPr>
         <w:pStyle w:val="a9"/>
+        <w:spacing w:line="360" w:lineRule="auto"/>
         <w:ind w:firstLineChars="200" w:firstLine="480"/>
         <w:rPr>
           <w:rFonts w:asciiTheme="minorEastAsia" w:eastAsiaTheme="minorEastAsia" w:hAnsiTheme="minorEastAsia"/>
@@ -6851,6 +7583,9 @@
             </m:sub>
           </m:sSub>
           <m:r>
+            <m:rPr>
+              <m:sty m:val="p"/>
+            </m:rPr>
             <w:rPr>
               <w:rFonts w:ascii="Cambria Math" w:eastAsiaTheme="minorEastAsia" w:hAnsi="Cambria Math"/>
               <w:sz w:val="24"/>
@@ -6880,6 +7615,9 @@
             </m:e>
             <m:sub>
               <m:r>
+                <m:rPr>
+                  <m:sty m:val="p"/>
+                </m:rPr>
                 <w:rPr>
                   <w:rFonts w:ascii="Cambria Math" w:eastAsiaTheme="minorEastAsia" w:hAnsi="Cambria Math"/>
                   <w:sz w:val="24"/>
@@ -6921,6 +7659,9 @@
             </m:sub>
           </m:sSub>
           <m:r>
+            <m:rPr>
+              <m:sty m:val="p"/>
+            </m:rPr>
             <w:rPr>
               <w:rFonts w:ascii="Cambria Math" w:eastAsiaTheme="minorEastAsia" w:hAnsi="Cambria Math"/>
               <w:sz w:val="24"/>
@@ -6950,6 +7691,9 @@
             </m:e>
             <m:sub>
               <m:r>
+                <m:rPr>
+                  <m:sty m:val="p"/>
+                </m:rPr>
                 <w:rPr>
                   <w:rFonts w:ascii="Cambria Math" w:eastAsiaTheme="minorEastAsia" w:hAnsi="Cambria Math"/>
                   <w:sz w:val="24"/>
@@ -6991,6 +7735,9 @@
             </m:sub>
           </m:sSub>
           <m:r>
+            <m:rPr>
+              <m:sty m:val="p"/>
+            </m:rPr>
             <w:rPr>
               <w:rFonts w:ascii="Cambria Math" w:eastAsiaTheme="minorEastAsia" w:hAnsi="Cambria Math"/>
               <w:sz w:val="24"/>
@@ -7020,6 +7767,9 @@
             </m:e>
             <m:sub>
               <m:r>
+                <m:rPr>
+                  <m:sty m:val="p"/>
+                </m:rPr>
                 <w:rPr>
                   <w:rFonts w:ascii="Cambria Math" w:eastAsiaTheme="minorEastAsia" w:hAnsi="Cambria Math"/>
                   <w:sz w:val="24"/>
@@ -7061,6 +7811,9 @@
             </m:sub>
           </m:sSub>
           <m:r>
+            <m:rPr>
+              <m:sty m:val="p"/>
+            </m:rPr>
             <w:rPr>
               <w:rFonts w:ascii="Cambria Math" w:eastAsiaTheme="minorEastAsia" w:hAnsi="Cambria Math"/>
               <w:sz w:val="24"/>
@@ -7090,6 +7843,9 @@
             </m:e>
             <m:sub>
               <m:r>
+                <m:rPr>
+                  <m:sty m:val="p"/>
+                </m:rPr>
                 <w:rPr>
                   <w:rFonts w:ascii="Cambria Math" w:eastAsiaTheme="minorEastAsia" w:hAnsi="Cambria Math"/>
                   <w:sz w:val="24"/>
@@ -7105,7 +7861,37 @@
               <w:sz w:val="24"/>
               <w:szCs w:val="24"/>
             </w:rPr>
-            <m:t>E(x)+</m:t>
+            <m:t>E</m:t>
+          </m:r>
+          <m:r>
+            <m:rPr>
+              <m:sty m:val="p"/>
+            </m:rPr>
+            <w:rPr>
+              <w:rFonts w:ascii="Cambria Math" w:eastAsiaTheme="minorEastAsia" w:hAnsi="Cambria Math"/>
+              <w:sz w:val="24"/>
+              <w:szCs w:val="24"/>
+            </w:rPr>
+            <m:t>(</m:t>
+          </m:r>
+          <m:r>
+            <w:rPr>
+              <w:rFonts w:ascii="Cambria Math" w:eastAsiaTheme="minorEastAsia" w:hAnsi="Cambria Math"/>
+              <w:sz w:val="24"/>
+              <w:szCs w:val="24"/>
+            </w:rPr>
+            <m:t>x</m:t>
+          </m:r>
+          <m:r>
+            <m:rPr>
+              <m:sty m:val="p"/>
+            </m:rPr>
+            <w:rPr>
+              <w:rFonts w:ascii="Cambria Math" w:eastAsiaTheme="minorEastAsia" w:hAnsi="Cambria Math"/>
+              <w:sz w:val="24"/>
+              <w:szCs w:val="24"/>
+            </w:rPr>
+            <m:t>)+</m:t>
           </m:r>
           <m:sSub>
             <m:sSubPr>
@@ -7129,6 +7915,9 @@
             </m:e>
             <m:sub>
               <m:r>
+                <m:rPr>
+                  <m:sty m:val="p"/>
+                </m:rPr>
                 <w:rPr>
                   <w:rFonts w:ascii="Cambria Math" w:eastAsiaTheme="minorEastAsia" w:hAnsi="Cambria Math"/>
                   <w:sz w:val="24"/>
@@ -7170,6 +7959,9 @@
             </m:sub>
           </m:sSub>
           <m:r>
+            <m:rPr>
+              <m:sty m:val="p"/>
+            </m:rPr>
             <w:rPr>
               <w:rFonts w:ascii="Cambria Math" w:eastAsiaTheme="minorEastAsia" w:hAnsi="Cambria Math"/>
               <w:sz w:val="24"/>
@@ -7199,6 +7991,9 @@
             </m:e>
             <m:sub>
               <m:r>
+                <m:rPr>
+                  <m:sty m:val="p"/>
+                </m:rPr>
                 <w:rPr>
                   <w:rFonts w:ascii="Cambria Math" w:eastAsiaTheme="minorEastAsia" w:hAnsi="Cambria Math"/>
                   <w:sz w:val="24"/>
@@ -7240,6 +8035,9 @@
             </m:sub>
           </m:sSub>
           <m:r>
+            <m:rPr>
+              <m:sty m:val="p"/>
+            </m:rPr>
             <w:rPr>
               <w:rFonts w:ascii="Cambria Math" w:eastAsiaTheme="minorEastAsia" w:hAnsi="Cambria Math"/>
               <w:sz w:val="24"/>
@@ -7269,6 +8067,9 @@
             </m:e>
             <m:sub>
               <m:r>
+                <m:rPr>
+                  <m:sty m:val="p"/>
+                </m:rPr>
                 <w:rPr>
                   <w:rFonts w:ascii="Cambria Math" w:eastAsiaTheme="minorEastAsia" w:hAnsi="Cambria Math"/>
                   <w:sz w:val="24"/>
@@ -7314,6 +8115,8 @@
     </w:p>
     <w:p>
       <w:pPr>
+        <w:pStyle w:val="a9"/>
+        <w:spacing w:line="360" w:lineRule="auto"/>
         <w:ind w:firstLineChars="200" w:firstLine="480"/>
         <w:rPr>
           <w:rFonts w:asciiTheme="minorEastAsia" w:eastAsiaTheme="minorEastAsia" w:hAnsiTheme="minorEastAsia"/>
@@ -7352,6 +8155,9 @@
           </m:e>
           <m:sub>
             <m:r>
+              <m:rPr>
+                <m:sty m:val="p"/>
+              </m:rPr>
               <w:rPr>
                 <w:rFonts w:ascii="Cambria Math" w:eastAsiaTheme="minorEastAsia" w:hAnsi="Cambria Math"/>
                 <w:sz w:val="24"/>
@@ -7393,6 +8199,9 @@
           </m:e>
           <m:sub>
             <m:r>
+              <m:rPr>
+                <m:sty m:val="p"/>
+              </m:rPr>
               <w:rPr>
                 <w:rFonts w:ascii="Cambria Math" w:eastAsiaTheme="minorEastAsia" w:hAnsi="Cambria Math"/>
                 <w:sz w:val="24"/>
@@ -7433,6 +8242,7 @@
     <w:p>
       <w:pPr>
         <w:pStyle w:val="a9"/>
+        <w:spacing w:line="360" w:lineRule="auto"/>
         <w:ind w:firstLineChars="200" w:firstLine="480"/>
         <w:rPr>
           <w:rFonts w:asciiTheme="minorEastAsia" w:eastAsiaTheme="minorEastAsia" w:hAnsiTheme="minorEastAsia"/>
@@ -7446,7 +8256,6 @@
           <w:sz w:val="24"/>
           <w:szCs w:val="24"/>
         </w:rPr>
-        <w:lastRenderedPageBreak/>
         <w:t xml:space="preserve">系统采用场景条件化阈值进行判定。对于场景 </w:t>
       </w:r>
       <m:oMath>
@@ -7500,61 +8309,34 @@
           </m:sub>
         </m:sSub>
         <m:r>
+          <m:rPr>
+            <m:sty m:val="p"/>
+          </m:rPr>
           <w:rPr>
             <w:rFonts w:ascii="Cambria Math" w:eastAsiaTheme="minorEastAsia" w:hAnsi="Cambria Math"/>
             <w:sz w:val="24"/>
             <w:szCs w:val="24"/>
           </w:rPr>
-          <m:t>(s)</m:t>
+          <m:t>(</m:t>
         </m:r>
-      </m:oMath>
-      <w:r>
-        <w:rPr>
-          <w:rFonts w:asciiTheme="minorEastAsia" w:eastAsiaTheme="minorEastAsia" w:hAnsiTheme="minorEastAsia"/>
-          <w:sz w:val="24"/>
-          <w:szCs w:val="24"/>
-        </w:rPr>
-        <w:t xml:space="preserve">、未知阈值 </w:t>
-      </w:r>
-      <m:oMath>
-        <m:sSub>
-          <m:sSubPr>
-            <m:ctrlPr>
-              <w:rPr>
-                <w:rFonts w:ascii="Cambria Math" w:eastAsiaTheme="minorEastAsia" w:hAnsi="Cambria Math"/>
-                <w:sz w:val="24"/>
-                <w:szCs w:val="24"/>
-              </w:rPr>
-            </m:ctrlPr>
-          </m:sSubPr>
-          <m:e>
-            <m:r>
-              <w:rPr>
-                <w:rFonts w:ascii="Cambria Math" w:eastAsiaTheme="minorEastAsia" w:hAnsi="Cambria Math"/>
-                <w:sz w:val="24"/>
-                <w:szCs w:val="24"/>
-              </w:rPr>
-              <m:t>τ</m:t>
-            </m:r>
-          </m:e>
-          <m:sub>
-            <m:r>
-              <w:rPr>
-                <w:rFonts w:ascii="Cambria Math" w:eastAsiaTheme="minorEastAsia" w:hAnsi="Cambria Math"/>
-                <w:sz w:val="24"/>
-                <w:szCs w:val="24"/>
-              </w:rPr>
-              <m:t>unknown</m:t>
-            </m:r>
-          </m:sub>
-        </m:sSub>
         <m:r>
           <w:rPr>
             <w:rFonts w:ascii="Cambria Math" w:eastAsiaTheme="minorEastAsia" w:hAnsi="Cambria Math"/>
             <w:sz w:val="24"/>
             <w:szCs w:val="24"/>
           </w:rPr>
-          <m:t>(s)</m:t>
+          <m:t>s</m:t>
+        </m:r>
+        <m:r>
+          <m:rPr>
+            <m:sty m:val="p"/>
+          </m:rPr>
+          <w:rPr>
+            <w:rFonts w:ascii="Cambria Math" w:eastAsiaTheme="minorEastAsia" w:hAnsi="Cambria Math"/>
+            <w:sz w:val="24"/>
+            <w:szCs w:val="24"/>
+          </w:rPr>
+          <m:t>)</m:t>
         </m:r>
       </m:oMath>
       <w:r>
@@ -7563,7 +8345,7 @@
           <w:sz w:val="24"/>
           <w:szCs w:val="24"/>
         </w:rPr>
-        <w:t xml:space="preserve"> 和恶意阈值 </w:t>
+        <w:t xml:space="preserve">、未知阈值 </w:t>
       </w:r>
       <m:oMath>
         <m:sSub>
@@ -7593,17 +8375,39 @@
                 <w:sz w:val="24"/>
                 <w:szCs w:val="24"/>
               </w:rPr>
-              <m:t>mal</m:t>
+              <m:t>unknown</m:t>
             </m:r>
           </m:sub>
         </m:sSub>
+        <m:r>
+          <m:rPr>
+            <m:sty m:val="p"/>
+          </m:rPr>
+          <w:rPr>
+            <w:rFonts w:ascii="Cambria Math" w:eastAsiaTheme="minorEastAsia" w:hAnsi="Cambria Math"/>
+            <w:sz w:val="24"/>
+            <w:szCs w:val="24"/>
+          </w:rPr>
+          <m:t>(</m:t>
+        </m:r>
         <m:r>
           <w:rPr>
             <w:rFonts w:ascii="Cambria Math" w:eastAsiaTheme="minorEastAsia" w:hAnsi="Cambria Math"/>
             <w:sz w:val="24"/>
             <w:szCs w:val="24"/>
           </w:rPr>
-          <m:t>(s)</m:t>
+          <m:t>s</m:t>
+        </m:r>
+        <m:r>
+          <m:rPr>
+            <m:sty m:val="p"/>
+          </m:rPr>
+          <w:rPr>
+            <w:rFonts w:ascii="Cambria Math" w:eastAsiaTheme="minorEastAsia" w:hAnsi="Cambria Math"/>
+            <w:sz w:val="24"/>
+            <w:szCs w:val="24"/>
+          </w:rPr>
+          <m:t>)</m:t>
         </m:r>
       </m:oMath>
       <w:r>
@@ -7612,7 +8416,7 @@
           <w:sz w:val="24"/>
           <w:szCs w:val="24"/>
         </w:rPr>
-        <w:t xml:space="preserve">。当 </w:t>
+        <w:t xml:space="preserve"> 和恶意阈值 </w:t>
       </w:r>
       <m:oMath>
         <m:sSub>
@@ -7632,7 +8436,7 @@
                 <w:sz w:val="24"/>
                 <w:szCs w:val="24"/>
               </w:rPr>
-              <m:t>S</m:t>
+              <m:t>τ</m:t>
             </m:r>
           </m:e>
           <m:sub>
@@ -7642,11 +8446,85 @@
                 <w:sz w:val="24"/>
                 <w:szCs w:val="24"/>
               </w:rPr>
-              <m:t>unknown</m:t>
+              <m:t>mal</m:t>
             </m:r>
           </m:sub>
         </m:sSub>
         <m:r>
+          <m:rPr>
+            <m:sty m:val="p"/>
+          </m:rPr>
+          <w:rPr>
+            <w:rFonts w:ascii="Cambria Math" w:eastAsiaTheme="minorEastAsia" w:hAnsi="Cambria Math"/>
+            <w:sz w:val="24"/>
+            <w:szCs w:val="24"/>
+          </w:rPr>
+          <m:t>(</m:t>
+        </m:r>
+        <m:r>
+          <w:rPr>
+            <w:rFonts w:ascii="Cambria Math" w:eastAsiaTheme="minorEastAsia" w:hAnsi="Cambria Math"/>
+            <w:sz w:val="24"/>
+            <w:szCs w:val="24"/>
+          </w:rPr>
+          <m:t>s</m:t>
+        </m:r>
+        <m:r>
+          <m:rPr>
+            <m:sty m:val="p"/>
+          </m:rPr>
+          <w:rPr>
+            <w:rFonts w:ascii="Cambria Math" w:eastAsiaTheme="minorEastAsia" w:hAnsi="Cambria Math"/>
+            <w:sz w:val="24"/>
+            <w:szCs w:val="24"/>
+          </w:rPr>
+          <m:t>)</m:t>
+        </m:r>
+      </m:oMath>
+      <w:r>
+        <w:rPr>
+          <w:rFonts w:asciiTheme="minorEastAsia" w:eastAsiaTheme="minorEastAsia" w:hAnsiTheme="minorEastAsia"/>
+          <w:sz w:val="24"/>
+          <w:szCs w:val="24"/>
+        </w:rPr>
+        <w:t xml:space="preserve">。当 </w:t>
+      </w:r>
+      <m:oMath>
+        <m:sSub>
+          <m:sSubPr>
+            <m:ctrlPr>
+              <w:rPr>
+                <w:rFonts w:ascii="Cambria Math" w:eastAsiaTheme="minorEastAsia" w:hAnsi="Cambria Math"/>
+                <w:sz w:val="24"/>
+                <w:szCs w:val="24"/>
+              </w:rPr>
+            </m:ctrlPr>
+          </m:sSubPr>
+          <m:e>
+            <m:r>
+              <w:rPr>
+                <w:rFonts w:ascii="Cambria Math" w:eastAsiaTheme="minorEastAsia" w:hAnsi="Cambria Math"/>
+                <w:sz w:val="24"/>
+                <w:szCs w:val="24"/>
+              </w:rPr>
+              <m:t>S</m:t>
+            </m:r>
+          </m:e>
+          <m:sub>
+            <m:r>
+              <w:rPr>
+                <w:rFonts w:ascii="Cambria Math" w:eastAsiaTheme="minorEastAsia" w:hAnsi="Cambria Math"/>
+                <w:sz w:val="24"/>
+                <w:szCs w:val="24"/>
+              </w:rPr>
+              <m:t>unknown</m:t>
+            </m:r>
+          </m:sub>
+        </m:sSub>
+        <m:r>
+          <m:rPr>
+            <m:sty m:val="p"/>
+          </m:rPr>
           <w:rPr>
             <w:rFonts w:ascii="Cambria Math" w:eastAsiaTheme="minorEastAsia" w:hAnsi="Cambria Math"/>
             <w:sz w:val="24"/>
@@ -7686,12 +8564,34 @@
           </m:sub>
         </m:sSub>
         <m:r>
+          <m:rPr>
+            <m:sty m:val="p"/>
+          </m:rPr>
           <w:rPr>
             <w:rFonts w:ascii="Cambria Math" w:eastAsiaTheme="minorEastAsia" w:hAnsi="Cambria Math"/>
             <w:sz w:val="24"/>
             <w:szCs w:val="24"/>
           </w:rPr>
-          <m:t>(s)</m:t>
+          <m:t>(</m:t>
+        </m:r>
+        <m:r>
+          <w:rPr>
+            <w:rFonts w:ascii="Cambria Math" w:eastAsiaTheme="minorEastAsia" w:hAnsi="Cambria Math"/>
+            <w:sz w:val="24"/>
+            <w:szCs w:val="24"/>
+          </w:rPr>
+          <m:t>s</m:t>
+        </m:r>
+        <m:r>
+          <m:rPr>
+            <m:sty m:val="p"/>
+          </m:rPr>
+          <w:rPr>
+            <w:rFonts w:ascii="Cambria Math" w:eastAsiaTheme="minorEastAsia" w:hAnsi="Cambria Math"/>
+            <w:sz w:val="24"/>
+            <w:szCs w:val="24"/>
+          </w:rPr>
+          <m:t>)</m:t>
         </m:r>
       </m:oMath>
       <w:r>
@@ -7735,6 +8635,9 @@
           </m:sub>
         </m:sSub>
         <m:r>
+          <m:rPr>
+            <m:sty m:val="p"/>
+          </m:rPr>
           <w:rPr>
             <w:rFonts w:ascii="Cambria Math" w:eastAsiaTheme="minorEastAsia" w:hAnsi="Cambria Math"/>
             <w:sz w:val="24"/>
@@ -7774,12 +8677,34 @@
           </m:sub>
         </m:sSub>
         <m:r>
+          <m:rPr>
+            <m:sty m:val="p"/>
+          </m:rPr>
           <w:rPr>
             <w:rFonts w:ascii="Cambria Math" w:eastAsiaTheme="minorEastAsia" w:hAnsi="Cambria Math"/>
             <w:sz w:val="24"/>
             <w:szCs w:val="24"/>
           </w:rPr>
-          <m:t>(s)</m:t>
+          <m:t>(</m:t>
+        </m:r>
+        <m:r>
+          <w:rPr>
+            <w:rFonts w:ascii="Cambria Math" w:eastAsiaTheme="minorEastAsia" w:hAnsi="Cambria Math"/>
+            <w:sz w:val="24"/>
+            <w:szCs w:val="24"/>
+          </w:rPr>
+          <m:t>s</m:t>
+        </m:r>
+        <m:r>
+          <m:rPr>
+            <m:sty m:val="p"/>
+          </m:rPr>
+          <w:rPr>
+            <w:rFonts w:ascii="Cambria Math" w:eastAsiaTheme="minorEastAsia" w:hAnsi="Cambria Math"/>
+            <w:sz w:val="24"/>
+            <w:szCs w:val="24"/>
+          </w:rPr>
+          <m:t>)</m:t>
         </m:r>
       </m:oMath>
       <w:r>
@@ -7823,6 +8748,9 @@
           </m:sub>
         </m:sSub>
         <m:r>
+          <m:rPr>
+            <m:sty m:val="p"/>
+          </m:rPr>
           <w:rPr>
             <w:rFonts w:ascii="Cambria Math" w:eastAsiaTheme="minorEastAsia" w:hAnsi="Cambria Math"/>
             <w:sz w:val="24"/>
@@ -7862,12 +8790,34 @@
           </m:sub>
         </m:sSub>
         <m:r>
+          <m:rPr>
+            <m:sty m:val="p"/>
+          </m:rPr>
           <w:rPr>
             <w:rFonts w:ascii="Cambria Math" w:eastAsiaTheme="minorEastAsia" w:hAnsi="Cambria Math"/>
             <w:sz w:val="24"/>
             <w:szCs w:val="24"/>
           </w:rPr>
-          <m:t>(s)</m:t>
+          <m:t>(</m:t>
+        </m:r>
+        <m:r>
+          <w:rPr>
+            <w:rFonts w:ascii="Cambria Math" w:eastAsiaTheme="minorEastAsia" w:hAnsi="Cambria Math"/>
+            <w:sz w:val="24"/>
+            <w:szCs w:val="24"/>
+          </w:rPr>
+          <m:t>s</m:t>
+        </m:r>
+        <m:r>
+          <m:rPr>
+            <m:sty m:val="p"/>
+          </m:rPr>
+          <w:rPr>
+            <w:rFonts w:ascii="Cambria Math" w:eastAsiaTheme="minorEastAsia" w:hAnsi="Cambria Math"/>
+            <w:sz w:val="24"/>
+            <w:szCs w:val="24"/>
+          </w:rPr>
+          <m:t>)</m:t>
         </m:r>
       </m:oMath>
       <w:r>
@@ -7911,6 +8861,9 @@
           </m:sub>
         </m:sSub>
         <m:r>
+          <m:rPr>
+            <m:sty m:val="p"/>
+          </m:rPr>
           <w:rPr>
             <w:rFonts w:ascii="Cambria Math" w:eastAsiaTheme="minorEastAsia" w:hAnsi="Cambria Math"/>
             <w:sz w:val="24"/>
@@ -7950,12 +8903,34 @@
           </m:sub>
         </m:sSub>
         <m:r>
+          <m:rPr>
+            <m:sty m:val="p"/>
+          </m:rPr>
           <w:rPr>
             <w:rFonts w:ascii="Cambria Math" w:eastAsiaTheme="minorEastAsia" w:hAnsi="Cambria Math"/>
             <w:sz w:val="24"/>
             <w:szCs w:val="24"/>
           </w:rPr>
-          <m:t>(s)</m:t>
+          <m:t>(</m:t>
+        </m:r>
+        <m:r>
+          <w:rPr>
+            <w:rFonts w:ascii="Cambria Math" w:eastAsiaTheme="minorEastAsia" w:hAnsi="Cambria Math"/>
+            <w:sz w:val="24"/>
+            <w:szCs w:val="24"/>
+          </w:rPr>
+          <m:t>s</m:t>
+        </m:r>
+        <m:r>
+          <m:rPr>
+            <m:sty m:val="p"/>
+          </m:rPr>
+          <w:rPr>
+            <w:rFonts w:ascii="Cambria Math" w:eastAsiaTheme="minorEastAsia" w:hAnsi="Cambria Math"/>
+            <w:sz w:val="24"/>
+            <w:szCs w:val="24"/>
+          </w:rPr>
+          <m:t>)</m:t>
         </m:r>
       </m:oMath>
       <w:r>
@@ -7999,6 +8974,9 @@
           </m:sub>
         </m:sSub>
         <m:r>
+          <m:rPr>
+            <m:sty m:val="p"/>
+          </m:rPr>
           <w:rPr>
             <w:rFonts w:ascii="Cambria Math" w:eastAsiaTheme="minorEastAsia" w:hAnsi="Cambria Math"/>
             <w:sz w:val="24"/>
@@ -8038,12 +9016,34 @@
           </m:sub>
         </m:sSub>
         <m:r>
+          <m:rPr>
+            <m:sty m:val="p"/>
+          </m:rPr>
           <w:rPr>
             <w:rFonts w:ascii="Cambria Math" w:eastAsiaTheme="minorEastAsia" w:hAnsi="Cambria Math"/>
             <w:sz w:val="24"/>
             <w:szCs w:val="24"/>
           </w:rPr>
-          <m:t>(s)</m:t>
+          <m:t>(</m:t>
+        </m:r>
+        <m:r>
+          <w:rPr>
+            <w:rFonts w:ascii="Cambria Math" w:eastAsiaTheme="minorEastAsia" w:hAnsi="Cambria Math"/>
+            <w:sz w:val="24"/>
+            <w:szCs w:val="24"/>
+          </w:rPr>
+          <m:t>s</m:t>
+        </m:r>
+        <m:r>
+          <m:rPr>
+            <m:sty m:val="p"/>
+          </m:rPr>
+          <w:rPr>
+            <w:rFonts w:ascii="Cambria Math" w:eastAsiaTheme="minorEastAsia" w:hAnsi="Cambria Math"/>
+            <w:sz w:val="24"/>
+            <w:szCs w:val="24"/>
+          </w:rPr>
+          <m:t>)</m:t>
         </m:r>
       </m:oMath>
       <w:r>
@@ -8058,6 +9058,7 @@
     <w:p>
       <w:pPr>
         <w:pStyle w:val="a9"/>
+        <w:spacing w:line="360" w:lineRule="auto"/>
         <w:ind w:firstLineChars="200" w:firstLine="480"/>
         <w:rPr>
           <w:rFonts w:asciiTheme="minorEastAsia" w:eastAsiaTheme="minorEastAsia" w:hAnsiTheme="minorEastAsia"/>
@@ -8113,6 +9114,7 @@
     <w:p>
       <w:pPr>
         <w:pStyle w:val="a9"/>
+        <w:spacing w:line="360" w:lineRule="auto"/>
         <w:ind w:firstLineChars="200" w:firstLine="480"/>
         <w:rPr>
           <w:rFonts w:asciiTheme="minorEastAsia" w:eastAsiaTheme="minorEastAsia" w:hAnsiTheme="minorEastAsia"/>
@@ -8132,6 +9134,7 @@
     <w:p>
       <w:pPr>
         <w:pStyle w:val="a9"/>
+        <w:spacing w:line="360" w:lineRule="auto"/>
         <w:ind w:firstLineChars="200" w:firstLine="480"/>
         <w:rPr>
           <w:rFonts w:asciiTheme="minorEastAsia" w:eastAsiaTheme="minorEastAsia" w:hAnsiTheme="minorEastAsia"/>
@@ -8169,6 +9172,7 @@
     <w:p>
       <w:pPr>
         <w:pStyle w:val="a9"/>
+        <w:spacing w:line="360" w:lineRule="auto"/>
         <w:ind w:firstLineChars="200" w:firstLine="480"/>
         <w:rPr>
           <w:rFonts w:asciiTheme="minorEastAsia" w:eastAsiaTheme="minorEastAsia" w:hAnsiTheme="minorEastAsia"/>
@@ -8188,6 +9192,7 @@
     <w:p>
       <w:pPr>
         <w:pStyle w:val="a9"/>
+        <w:spacing w:line="360" w:lineRule="auto"/>
         <w:ind w:firstLineChars="200" w:firstLine="480"/>
         <w:rPr>
           <w:rFonts w:asciiTheme="minorEastAsia" w:eastAsiaTheme="minorEastAsia" w:hAnsiTheme="minorEastAsia"/>
@@ -8243,6 +9248,7 @@
     <w:p>
       <w:pPr>
         <w:pStyle w:val="a9"/>
+        <w:spacing w:line="360" w:lineRule="auto"/>
         <w:ind w:firstLineChars="200" w:firstLine="480"/>
         <w:rPr>
           <w:rFonts w:asciiTheme="minorEastAsia" w:eastAsiaTheme="minorEastAsia" w:hAnsiTheme="minorEastAsia"/>
@@ -8262,6 +9268,7 @@
     <w:p>
       <w:pPr>
         <w:pStyle w:val="a9"/>
+        <w:spacing w:line="360" w:lineRule="auto"/>
         <w:ind w:firstLineChars="200" w:firstLine="480"/>
         <w:rPr>
           <w:rFonts w:asciiTheme="minorEastAsia" w:eastAsiaTheme="minorEastAsia" w:hAnsiTheme="minorEastAsia"/>
@@ -8317,6 +9324,7 @@
     <w:p>
       <w:pPr>
         <w:pStyle w:val="a9"/>
+        <w:spacing w:line="360" w:lineRule="auto"/>
         <w:ind w:firstLineChars="200" w:firstLine="480"/>
         <w:rPr>
           <w:rFonts w:asciiTheme="minorEastAsia" w:eastAsiaTheme="minorEastAsia" w:hAnsiTheme="minorEastAsia"/>
@@ -8348,7 +9356,16 @@
           <w:sz w:val="24"/>
           <w:szCs w:val="24"/>
         </w:rPr>
-        <w:t>标签或规则确认结果达到预设可信度条件后，才允许更新原型、阈值、未知候选簇或模态可靠度统计。该策略使系统具备持续学习能力，但不会因</w:t>
+        <w:t>标</w:t>
+      </w:r>
+      <w:r>
+        <w:rPr>
+          <w:rFonts w:asciiTheme="minorEastAsia" w:eastAsiaTheme="minorEastAsia" w:hAnsiTheme="minorEastAsia"/>
+          <w:sz w:val="24"/>
+          <w:szCs w:val="24"/>
+        </w:rPr>
+        <w:lastRenderedPageBreak/>
+        <w:t>签或规则确认结果达到预设可信度条件后，才允许更新原型、阈值、未知候选簇或模态可靠度统计。该策略使系统具备持续学习能力，但不会因</w:t>
       </w:r>
       <w:proofErr w:type="gramStart"/>
       <w:r>
@@ -8372,6 +9389,7 @@
     <w:p>
       <w:pPr>
         <w:pStyle w:val="a9"/>
+        <w:spacing w:line="360" w:lineRule="auto"/>
         <w:ind w:firstLineChars="200" w:firstLine="480"/>
         <w:rPr>
           <w:rFonts w:asciiTheme="minorEastAsia" w:eastAsiaTheme="minorEastAsia" w:hAnsiTheme="minorEastAsia"/>
@@ -8391,6 +9409,7 @@
     <w:p>
       <w:pPr>
         <w:pStyle w:val="a9"/>
+        <w:spacing w:line="360" w:lineRule="auto"/>
         <w:ind w:firstLineChars="200" w:firstLine="480"/>
         <w:rPr>
           <w:rFonts w:asciiTheme="minorEastAsia" w:eastAsiaTheme="minorEastAsia" w:hAnsiTheme="minorEastAsia"/>
@@ -8435,51 +9454,53 @@
             </m:sub>
           </m:sSub>
           <m:r>
+            <m:rPr>
+              <m:sty m:val="p"/>
+            </m:rPr>
             <w:rPr>
               <w:rFonts w:ascii="Cambria Math" w:eastAsiaTheme="minorEastAsia" w:hAnsi="Cambria Math"/>
               <w:sz w:val="24"/>
               <w:szCs w:val="24"/>
             </w:rPr>
-            <m:t>←normalize((1-β)</m:t>
+            <m:t>←</m:t>
           </m:r>
-          <m:sSub>
-            <m:sSubPr>
-              <m:ctrlPr>
-                <w:rPr>
-                  <w:rFonts w:ascii="Cambria Math" w:eastAsiaTheme="minorEastAsia" w:hAnsi="Cambria Math"/>
-                  <w:sz w:val="24"/>
-                  <w:szCs w:val="24"/>
-                </w:rPr>
-              </m:ctrlPr>
-            </m:sSubPr>
-            <m:e>
-              <m:r>
-                <w:rPr>
-                  <w:rFonts w:ascii="Cambria Math" w:eastAsiaTheme="minorEastAsia" w:hAnsi="Cambria Math"/>
-                  <w:sz w:val="24"/>
-                  <w:szCs w:val="24"/>
-                </w:rPr>
-                <m:t>p</m:t>
-              </m:r>
-            </m:e>
-            <m:sub>
-              <m:r>
-                <w:rPr>
-                  <w:rFonts w:ascii="Cambria Math" w:eastAsiaTheme="minorEastAsia" w:hAnsi="Cambria Math"/>
-                  <w:sz w:val="24"/>
-                  <w:szCs w:val="24"/>
-                </w:rPr>
-                <m:t>y</m:t>
-              </m:r>
-            </m:sub>
-          </m:sSub>
           <m:r>
             <w:rPr>
               <w:rFonts w:ascii="Cambria Math" w:eastAsiaTheme="minorEastAsia" w:hAnsi="Cambria Math"/>
               <w:sz w:val="24"/>
               <w:szCs w:val="24"/>
             </w:rPr>
-            <m:t>+β</m:t>
+            <m:t>normalize</m:t>
+          </m:r>
+          <m:r>
+            <m:rPr>
+              <m:sty m:val="p"/>
+            </m:rPr>
+            <w:rPr>
+              <w:rFonts w:ascii="Cambria Math" w:eastAsiaTheme="minorEastAsia" w:hAnsi="Cambria Math"/>
+              <w:sz w:val="24"/>
+              <w:szCs w:val="24"/>
+            </w:rPr>
+            <m:t>((1-</m:t>
+          </m:r>
+          <m:r>
+            <w:rPr>
+              <w:rFonts w:ascii="Cambria Math" w:eastAsiaTheme="minorEastAsia" w:hAnsi="Cambria Math"/>
+              <w:sz w:val="24"/>
+              <w:szCs w:val="24"/>
+            </w:rPr>
+            <m:t>β</m:t>
+          </m:r>
+          <m:r>
+            <m:rPr>
+              <m:sty m:val="p"/>
+            </m:rPr>
+            <w:rPr>
+              <w:rFonts w:ascii="Cambria Math" w:eastAsiaTheme="minorEastAsia" w:hAnsi="Cambria Math"/>
+              <w:sz w:val="24"/>
+              <w:szCs w:val="24"/>
+            </w:rPr>
+            <m:t>)</m:t>
           </m:r>
           <m:sSub>
             <m:sSubPr>
@@ -8498,7 +9519,7 @@
                   <w:sz w:val="24"/>
                   <w:szCs w:val="24"/>
                 </w:rPr>
-                <m:t>h</m:t>
+                <m:t>p</m:t>
               </m:r>
             </m:e>
             <m:sub>
@@ -8508,11 +9529,64 @@
                   <w:sz w:val="24"/>
                   <w:szCs w:val="24"/>
                 </w:rPr>
-                <m:t>f</m:t>
+                <m:t>y</m:t>
               </m:r>
             </m:sub>
           </m:sSub>
           <m:r>
+            <m:rPr>
+              <m:sty m:val="p"/>
+            </m:rPr>
+            <w:rPr>
+              <w:rFonts w:ascii="Cambria Math" w:eastAsiaTheme="minorEastAsia" w:hAnsi="Cambria Math"/>
+              <w:sz w:val="24"/>
+              <w:szCs w:val="24"/>
+            </w:rPr>
+            <m:t>+</m:t>
+          </m:r>
+          <m:r>
+            <w:rPr>
+              <w:rFonts w:ascii="Cambria Math" w:eastAsiaTheme="minorEastAsia" w:hAnsi="Cambria Math"/>
+              <w:sz w:val="24"/>
+              <w:szCs w:val="24"/>
+            </w:rPr>
+            <m:t>β</m:t>
+          </m:r>
+          <m:sSub>
+            <m:sSubPr>
+              <m:ctrlPr>
+                <w:rPr>
+                  <w:rFonts w:ascii="Cambria Math" w:eastAsiaTheme="minorEastAsia" w:hAnsi="Cambria Math"/>
+                  <w:sz w:val="24"/>
+                  <w:szCs w:val="24"/>
+                </w:rPr>
+              </m:ctrlPr>
+            </m:sSubPr>
+            <m:e>
+              <m:r>
+                <w:rPr>
+                  <w:rFonts w:ascii="Cambria Math" w:eastAsiaTheme="minorEastAsia" w:hAnsi="Cambria Math"/>
+                  <w:sz w:val="24"/>
+                  <w:szCs w:val="24"/>
+                </w:rPr>
+                <m:t>h</m:t>
+              </m:r>
+            </m:e>
+            <m:sub>
+              <m:r>
+                <w:rPr>
+                  <w:rFonts w:ascii="Cambria Math" w:eastAsiaTheme="minorEastAsia" w:hAnsi="Cambria Math"/>
+                  <w:sz w:val="24"/>
+                  <w:szCs w:val="24"/>
+                </w:rPr>
+                <m:t>f</m:t>
+              </m:r>
+            </m:sub>
+          </m:sSub>
+          <m:r>
+            <m:rPr>
+              <m:sty m:val="p"/>
+            </m:rPr>
             <w:rPr>
               <w:rFonts w:ascii="Cambria Math" w:eastAsiaTheme="minorEastAsia" w:hAnsi="Cambria Math"/>
               <w:sz w:val="24"/>
@@ -8525,6 +9599,8 @@
     </w:p>
     <w:p>
       <w:pPr>
+        <w:pStyle w:val="a9"/>
+        <w:spacing w:line="360" w:lineRule="auto"/>
         <w:ind w:firstLineChars="200" w:firstLine="480"/>
         <w:rPr>
           <w:rFonts w:asciiTheme="minorEastAsia" w:eastAsiaTheme="minorEastAsia" w:hAnsiTheme="minorEastAsia"/>
@@ -8662,6 +9738,7 @@
     <w:p>
       <w:pPr>
         <w:pStyle w:val="a9"/>
+        <w:spacing w:line="360" w:lineRule="auto"/>
         <w:ind w:firstLineChars="200" w:firstLine="480"/>
         <w:rPr>
           <w:rFonts w:asciiTheme="minorEastAsia" w:eastAsiaTheme="minorEastAsia" w:hAnsiTheme="minorEastAsia"/>
@@ -8675,16 +9752,7 @@
           <w:sz w:val="24"/>
           <w:szCs w:val="24"/>
         </w:rPr>
-        <w:t>模态可靠度也可以根据确认结果更新。若某一模态在某类场景中多次给出正确且稳定的证据，其可靠度先验上调；若某一模态在某类场景中反复产生误导性证据，其</w:t>
-      </w:r>
-      <w:r>
-        <w:rPr>
-          <w:rFonts w:asciiTheme="minorEastAsia" w:eastAsiaTheme="minorEastAsia" w:hAnsiTheme="minorEastAsia"/>
-          <w:sz w:val="24"/>
-          <w:szCs w:val="24"/>
-        </w:rPr>
-        <w:lastRenderedPageBreak/>
-        <w:t>可靠度先验下调。通过这种方式，本发明能够适应协议版本变化、业务迁移和采集条件变化，而不需要每次都从</w:t>
+        <w:t>模态可靠度也可以根据确认结果更新。若某一模态在某类场景中多次给出正确且稳定的证据，其可靠度先验上调；若某一模态在某类场景中反复产生误导性证据，其可靠度先验下调。通过这种方式，本发明能够适应协议版本变化、业务迁移和采集条件变化，而不需要每次都从</w:t>
       </w:r>
       <w:proofErr w:type="gramStart"/>
       <w:r>
@@ -8708,6 +9776,7 @@
     <w:p>
       <w:pPr>
         <w:pStyle w:val="a9"/>
+        <w:spacing w:line="360" w:lineRule="auto"/>
         <w:ind w:firstLineChars="200" w:firstLine="480"/>
         <w:rPr>
           <w:rFonts w:asciiTheme="minorEastAsia" w:eastAsiaTheme="minorEastAsia" w:hAnsiTheme="minorEastAsia"/>
@@ -8727,6 +9796,7 @@
     <w:p>
       <w:pPr>
         <w:pStyle w:val="a9"/>
+        <w:spacing w:line="360" w:lineRule="auto"/>
         <w:ind w:firstLineChars="200" w:firstLine="480"/>
         <w:rPr>
           <w:rFonts w:asciiTheme="minorEastAsia" w:eastAsiaTheme="minorEastAsia" w:hAnsiTheme="minorEastAsia"/>
@@ -8800,6 +9870,7 @@
     <w:p>
       <w:pPr>
         <w:pStyle w:val="a9"/>
+        <w:spacing w:line="360" w:lineRule="auto"/>
         <w:ind w:firstLineChars="200" w:firstLine="480"/>
         <w:rPr>
           <w:rFonts w:asciiTheme="minorEastAsia" w:eastAsiaTheme="minorEastAsia" w:hAnsiTheme="minorEastAsia"/>
@@ -8819,6 +9890,7 @@
     <w:p>
       <w:pPr>
         <w:pStyle w:val="a9"/>
+        <w:spacing w:line="360" w:lineRule="auto"/>
         <w:ind w:firstLineChars="200" w:firstLine="480"/>
         <w:rPr>
           <w:rFonts w:asciiTheme="minorEastAsia" w:eastAsiaTheme="minorEastAsia" w:hAnsiTheme="minorEastAsia"/>
@@ -8837,7 +9909,18 @@
               <w:sz w:val="24"/>
               <w:szCs w:val="24"/>
             </w:rPr>
-            <m:t>L=</m:t>
+            <m:t>L</m:t>
+          </m:r>
+          <m:r>
+            <m:rPr>
+              <m:sty m:val="p"/>
+            </m:rPr>
+            <w:rPr>
+              <w:rFonts w:ascii="Cambria Math" w:eastAsiaTheme="minorEastAsia" w:hAnsi="Cambria Math"/>
+              <w:sz w:val="24"/>
+              <w:szCs w:val="24"/>
+            </w:rPr>
+            <m:t>=</m:t>
           </m:r>
           <m:sSub>
             <m:sSubPr>
@@ -8871,6 +9954,9 @@
             </m:sub>
           </m:sSub>
           <m:r>
+            <m:rPr>
+              <m:sty m:val="p"/>
+            </m:rPr>
             <w:rPr>
               <w:rFonts w:ascii="Cambria Math" w:eastAsiaTheme="minorEastAsia" w:hAnsi="Cambria Math"/>
               <w:sz w:val="24"/>
@@ -8900,6 +9986,9 @@
             </m:e>
             <m:sub>
               <m:r>
+                <m:rPr>
+                  <m:sty m:val="p"/>
+                </m:rPr>
                 <w:rPr>
                   <w:rFonts w:ascii="Cambria Math" w:eastAsiaTheme="minorEastAsia" w:hAnsi="Cambria Math"/>
                   <w:sz w:val="24"/>
@@ -8941,6 +10030,9 @@
             </m:sub>
           </m:sSub>
           <m:r>
+            <m:rPr>
+              <m:sty m:val="p"/>
+            </m:rPr>
             <w:rPr>
               <w:rFonts w:ascii="Cambria Math" w:eastAsiaTheme="minorEastAsia" w:hAnsi="Cambria Math"/>
               <w:sz w:val="24"/>
@@ -8970,6 +10062,9 @@
             </m:e>
             <m:sub>
               <m:r>
+                <m:rPr>
+                  <m:sty m:val="p"/>
+                </m:rPr>
                 <w:rPr>
                   <w:rFonts w:ascii="Cambria Math" w:eastAsiaTheme="minorEastAsia" w:hAnsi="Cambria Math"/>
                   <w:sz w:val="24"/>
@@ -9011,6 +10106,9 @@
             </m:sub>
           </m:sSub>
           <m:r>
+            <m:rPr>
+              <m:sty m:val="p"/>
+            </m:rPr>
             <w:rPr>
               <w:rFonts w:ascii="Cambria Math" w:eastAsiaTheme="minorEastAsia" w:hAnsi="Cambria Math"/>
               <w:sz w:val="24"/>
@@ -9040,6 +10138,9 @@
             </m:e>
             <m:sub>
               <m:r>
+                <m:rPr>
+                  <m:sty m:val="p"/>
+                </m:rPr>
                 <w:rPr>
                   <w:rFonts w:ascii="Cambria Math" w:eastAsiaTheme="minorEastAsia" w:hAnsi="Cambria Math"/>
                   <w:sz w:val="24"/>
@@ -9081,6 +10182,9 @@
             </m:sub>
           </m:sSub>
           <m:r>
+            <m:rPr>
+              <m:sty m:val="p"/>
+            </m:rPr>
             <w:rPr>
               <w:rFonts w:ascii="Cambria Math" w:eastAsiaTheme="minorEastAsia" w:hAnsi="Cambria Math"/>
               <w:sz w:val="24"/>
@@ -9110,6 +10214,9 @@
             </m:e>
             <m:sub>
               <m:r>
+                <m:rPr>
+                  <m:sty m:val="p"/>
+                </m:rPr>
                 <w:rPr>
                   <w:rFonts w:ascii="Cambria Math" w:eastAsiaTheme="minorEastAsia" w:hAnsi="Cambria Math"/>
                   <w:sz w:val="24"/>
@@ -9151,6 +10258,9 @@
             </m:sub>
           </m:sSub>
           <m:r>
+            <m:rPr>
+              <m:sty m:val="p"/>
+            </m:rPr>
             <w:rPr>
               <w:rFonts w:ascii="Cambria Math" w:eastAsiaTheme="minorEastAsia" w:hAnsi="Cambria Math"/>
               <w:sz w:val="24"/>
@@ -9180,6 +10290,9 @@
             </m:e>
             <m:sub>
               <m:r>
+                <m:rPr>
+                  <m:sty m:val="p"/>
+                </m:rPr>
                 <w:rPr>
                   <w:rFonts w:ascii="Cambria Math" w:eastAsiaTheme="minorEastAsia" w:hAnsi="Cambria Math"/>
                   <w:sz w:val="24"/>
@@ -9225,6 +10338,8 @@
     </w:p>
     <w:p>
       <w:pPr>
+        <w:pStyle w:val="a9"/>
+        <w:spacing w:line="360" w:lineRule="auto"/>
         <w:ind w:firstLineChars="200" w:firstLine="480"/>
         <w:rPr>
           <w:rFonts w:asciiTheme="minorEastAsia" w:eastAsiaTheme="minorEastAsia" w:hAnsiTheme="minorEastAsia"/>
@@ -9490,6 +10605,7 @@
     <w:p>
       <w:pPr>
         <w:pStyle w:val="a9"/>
+        <w:spacing w:line="360" w:lineRule="auto"/>
         <w:ind w:firstLineChars="200" w:firstLine="480"/>
         <w:rPr>
           <w:rFonts w:asciiTheme="minorEastAsia" w:eastAsiaTheme="minorEastAsia" w:hAnsiTheme="minorEastAsia"/>
@@ -9509,6 +10625,7 @@
     <w:p>
       <w:pPr>
         <w:pStyle w:val="a9"/>
+        <w:spacing w:line="360" w:lineRule="auto"/>
         <w:ind w:firstLineChars="200" w:firstLine="480"/>
         <w:rPr>
           <w:rFonts w:asciiTheme="minorEastAsia" w:eastAsiaTheme="minorEastAsia" w:hAnsiTheme="minorEastAsia"/>
@@ -9522,6 +10639,7 @@
           <w:sz w:val="24"/>
           <w:szCs w:val="24"/>
         </w:rPr>
+        <w:lastRenderedPageBreak/>
         <w:t>本发明还提供一种证据冲突感知的可信开放集加密恶意流量检测系统，包括流量采集与会话重组单元、多粒度特征提取单元、模态质量评估单元、模态证据生成单元、证据冲突计算单元、自适应折扣融合单元、开放集风险判定单元、未知候选</w:t>
       </w:r>
       <w:proofErr w:type="gramStart"/>
@@ -9546,6 +10664,7 @@
     <w:p>
       <w:pPr>
         <w:pStyle w:val="a9"/>
+        <w:spacing w:line="360" w:lineRule="auto"/>
         <w:ind w:firstLineChars="200" w:firstLine="480"/>
         <w:rPr>
           <w:rFonts w:asciiTheme="minorEastAsia" w:eastAsiaTheme="minorEastAsia" w:hAnsiTheme="minorEastAsia"/>
@@ -9601,6 +10720,7 @@
     <w:p>
       <w:pPr>
         <w:pStyle w:val="a9"/>
+        <w:spacing w:line="360" w:lineRule="auto"/>
         <w:ind w:firstLineChars="200" w:firstLine="480"/>
         <w:rPr>
           <w:rFonts w:asciiTheme="minorEastAsia" w:eastAsiaTheme="minorEastAsia" w:hAnsiTheme="minorEastAsia"/>
@@ -9620,6 +10740,7 @@
     <w:p>
       <w:pPr>
         <w:pStyle w:val="a9"/>
+        <w:spacing w:line="360" w:lineRule="auto"/>
         <w:ind w:firstLineChars="200" w:firstLine="480"/>
         <w:rPr>
           <w:rFonts w:asciiTheme="minorEastAsia" w:eastAsiaTheme="minorEastAsia" w:hAnsiTheme="minorEastAsia"/>
@@ -9704,61 +10825,34 @@
           </m:sub>
         </m:sSub>
         <m:r>
+          <m:rPr>
+            <m:sty m:val="p"/>
+          </m:rPr>
           <w:rPr>
             <w:rFonts w:ascii="Cambria Math" w:eastAsiaTheme="minorEastAsia" w:hAnsi="Cambria Math"/>
             <w:sz w:val="24"/>
             <w:szCs w:val="24"/>
           </w:rPr>
-          <m:t>(s)</m:t>
+          <m:t>(</m:t>
         </m:r>
-      </m:oMath>
-      <w:r>
-        <w:rPr>
-          <w:rFonts w:asciiTheme="minorEastAsia" w:eastAsiaTheme="minorEastAsia" w:hAnsiTheme="minorEastAsia"/>
-          <w:sz w:val="24"/>
-          <w:szCs w:val="24"/>
-        </w:rPr>
-        <w:t xml:space="preserve">、未知阈值 </w:t>
-      </w:r>
-      <m:oMath>
-        <m:sSub>
-          <m:sSubPr>
-            <m:ctrlPr>
-              <w:rPr>
-                <w:rFonts w:ascii="Cambria Math" w:eastAsiaTheme="minorEastAsia" w:hAnsi="Cambria Math"/>
-                <w:sz w:val="24"/>
-                <w:szCs w:val="24"/>
-              </w:rPr>
-            </m:ctrlPr>
-          </m:sSubPr>
-          <m:e>
-            <m:r>
-              <w:rPr>
-                <w:rFonts w:ascii="Cambria Math" w:eastAsiaTheme="minorEastAsia" w:hAnsi="Cambria Math"/>
-                <w:sz w:val="24"/>
-                <w:szCs w:val="24"/>
-              </w:rPr>
-              <m:t>τ</m:t>
-            </m:r>
-          </m:e>
-          <m:sub>
-            <m:r>
-              <w:rPr>
-                <w:rFonts w:ascii="Cambria Math" w:eastAsiaTheme="minorEastAsia" w:hAnsi="Cambria Math"/>
-                <w:sz w:val="24"/>
-                <w:szCs w:val="24"/>
-              </w:rPr>
-              <m:t>unknown</m:t>
-            </m:r>
-          </m:sub>
-        </m:sSub>
         <m:r>
           <w:rPr>
             <w:rFonts w:ascii="Cambria Math" w:eastAsiaTheme="minorEastAsia" w:hAnsi="Cambria Math"/>
             <w:sz w:val="24"/>
             <w:szCs w:val="24"/>
           </w:rPr>
-          <m:t>(s)</m:t>
+          <m:t>s</m:t>
+        </m:r>
+        <m:r>
+          <m:rPr>
+            <m:sty m:val="p"/>
+          </m:rPr>
+          <w:rPr>
+            <w:rFonts w:ascii="Cambria Math" w:eastAsiaTheme="minorEastAsia" w:hAnsi="Cambria Math"/>
+            <w:sz w:val="24"/>
+            <w:szCs w:val="24"/>
+          </w:rPr>
+          <m:t>)</m:t>
         </m:r>
       </m:oMath>
       <w:r>
@@ -9767,7 +10861,7 @@
           <w:sz w:val="24"/>
           <w:szCs w:val="24"/>
         </w:rPr>
-        <w:t xml:space="preserve">、恶意阈值 </w:t>
+        <w:t xml:space="preserve">、未知阈值 </w:t>
       </w:r>
       <m:oMath>
         <m:sSub>
@@ -9797,17 +10891,39 @@
                 <w:sz w:val="24"/>
                 <w:szCs w:val="24"/>
               </w:rPr>
-              <m:t>mal</m:t>
+              <m:t>unknown</m:t>
             </m:r>
           </m:sub>
         </m:sSub>
+        <m:r>
+          <m:rPr>
+            <m:sty m:val="p"/>
+          </m:rPr>
+          <w:rPr>
+            <w:rFonts w:ascii="Cambria Math" w:eastAsiaTheme="minorEastAsia" w:hAnsi="Cambria Math"/>
+            <w:sz w:val="24"/>
+            <w:szCs w:val="24"/>
+          </w:rPr>
+          <m:t>(</m:t>
+        </m:r>
         <m:r>
           <w:rPr>
             <w:rFonts w:ascii="Cambria Math" w:eastAsiaTheme="minorEastAsia" w:hAnsi="Cambria Math"/>
             <w:sz w:val="24"/>
             <w:szCs w:val="24"/>
           </w:rPr>
-          <m:t>(s)</m:t>
+          <m:t>s</m:t>
+        </m:r>
+        <m:r>
+          <m:rPr>
+            <m:sty m:val="p"/>
+          </m:rPr>
+          <w:rPr>
+            <w:rFonts w:ascii="Cambria Math" w:eastAsiaTheme="minorEastAsia" w:hAnsi="Cambria Math"/>
+            <w:sz w:val="24"/>
+            <w:szCs w:val="24"/>
+          </w:rPr>
+          <m:t>)</m:t>
         </m:r>
       </m:oMath>
       <w:r>
@@ -9816,7 +10932,7 @@
           <w:sz w:val="24"/>
           <w:szCs w:val="24"/>
         </w:rPr>
-        <w:t xml:space="preserve">、冲突阈值 </w:t>
+        <w:t xml:space="preserve">、恶意阈值 </w:t>
       </w:r>
       <m:oMath>
         <m:sSub>
@@ -9846,17 +10962,39 @@
                 <w:sz w:val="24"/>
                 <w:szCs w:val="24"/>
               </w:rPr>
-              <m:t>conflict</m:t>
+              <m:t>mal</m:t>
             </m:r>
           </m:sub>
         </m:sSub>
+        <m:r>
+          <m:rPr>
+            <m:sty m:val="p"/>
+          </m:rPr>
+          <w:rPr>
+            <w:rFonts w:ascii="Cambria Math" w:eastAsiaTheme="minorEastAsia" w:hAnsi="Cambria Math"/>
+            <w:sz w:val="24"/>
+            <w:szCs w:val="24"/>
+          </w:rPr>
+          <m:t>(</m:t>
+        </m:r>
         <m:r>
           <w:rPr>
             <w:rFonts w:ascii="Cambria Math" w:eastAsiaTheme="minorEastAsia" w:hAnsi="Cambria Math"/>
             <w:sz w:val="24"/>
             <w:szCs w:val="24"/>
           </w:rPr>
-          <m:t>(s)</m:t>
+          <m:t>s</m:t>
+        </m:r>
+        <m:r>
+          <m:rPr>
+            <m:sty m:val="p"/>
+          </m:rPr>
+          <w:rPr>
+            <w:rFonts w:ascii="Cambria Math" w:eastAsiaTheme="minorEastAsia" w:hAnsi="Cambria Math"/>
+            <w:sz w:val="24"/>
+            <w:szCs w:val="24"/>
+          </w:rPr>
+          <m:t>)</m:t>
         </m:r>
       </m:oMath>
       <w:r>
@@ -9865,7 +11003,7 @@
           <w:sz w:val="24"/>
           <w:szCs w:val="24"/>
         </w:rPr>
-        <w:t xml:space="preserve"> 和模态质量阈值 </w:t>
+        <w:t xml:space="preserve">、冲突阈值 </w:t>
       </w:r>
       <m:oMath>
         <m:sSub>
@@ -9895,17 +11033,110 @@
                 <w:sz w:val="24"/>
                 <w:szCs w:val="24"/>
               </w:rPr>
-              <m:t>quality</m:t>
+              <m:t>conflict</m:t>
             </m:r>
           </m:sub>
         </m:sSub>
+        <m:r>
+          <m:rPr>
+            <m:sty m:val="p"/>
+          </m:rPr>
+          <w:rPr>
+            <w:rFonts w:ascii="Cambria Math" w:eastAsiaTheme="minorEastAsia" w:hAnsi="Cambria Math"/>
+            <w:sz w:val="24"/>
+            <w:szCs w:val="24"/>
+          </w:rPr>
+          <m:t>(</m:t>
+        </m:r>
         <m:r>
           <w:rPr>
             <w:rFonts w:ascii="Cambria Math" w:eastAsiaTheme="minorEastAsia" w:hAnsi="Cambria Math"/>
             <w:sz w:val="24"/>
             <w:szCs w:val="24"/>
           </w:rPr>
-          <m:t>(s)</m:t>
+          <m:t>s</m:t>
+        </m:r>
+        <m:r>
+          <m:rPr>
+            <m:sty m:val="p"/>
+          </m:rPr>
+          <w:rPr>
+            <w:rFonts w:ascii="Cambria Math" w:eastAsiaTheme="minorEastAsia" w:hAnsi="Cambria Math"/>
+            <w:sz w:val="24"/>
+            <w:szCs w:val="24"/>
+          </w:rPr>
+          <m:t>)</m:t>
+        </m:r>
+      </m:oMath>
+      <w:r>
+        <w:rPr>
+          <w:rFonts w:asciiTheme="minorEastAsia" w:eastAsiaTheme="minorEastAsia" w:hAnsiTheme="minorEastAsia"/>
+          <w:sz w:val="24"/>
+          <w:szCs w:val="24"/>
+        </w:rPr>
+        <w:t xml:space="preserve"> 和模态质量阈值 </w:t>
+      </w:r>
+      <m:oMath>
+        <m:sSub>
+          <m:sSubPr>
+            <m:ctrlPr>
+              <w:rPr>
+                <w:rFonts w:ascii="Cambria Math" w:eastAsiaTheme="minorEastAsia" w:hAnsi="Cambria Math"/>
+                <w:sz w:val="24"/>
+                <w:szCs w:val="24"/>
+              </w:rPr>
+            </m:ctrlPr>
+          </m:sSubPr>
+          <m:e>
+            <m:r>
+              <w:rPr>
+                <w:rFonts w:ascii="Cambria Math" w:eastAsiaTheme="minorEastAsia" w:hAnsi="Cambria Math"/>
+                <w:sz w:val="24"/>
+                <w:szCs w:val="24"/>
+              </w:rPr>
+              <m:t>τ</m:t>
+            </m:r>
+          </m:e>
+          <m:sub>
+            <m:r>
+              <w:rPr>
+                <w:rFonts w:ascii="Cambria Math" w:eastAsiaTheme="minorEastAsia" w:hAnsi="Cambria Math"/>
+                <w:sz w:val="24"/>
+                <w:szCs w:val="24"/>
+              </w:rPr>
+              <m:t>quality</m:t>
+            </m:r>
+          </m:sub>
+        </m:sSub>
+        <m:r>
+          <m:rPr>
+            <m:sty m:val="p"/>
+          </m:rPr>
+          <w:rPr>
+            <w:rFonts w:ascii="Cambria Math" w:eastAsiaTheme="minorEastAsia" w:hAnsi="Cambria Math"/>
+            <w:sz w:val="24"/>
+            <w:szCs w:val="24"/>
+          </w:rPr>
+          <m:t>(</m:t>
+        </m:r>
+        <m:r>
+          <w:rPr>
+            <w:rFonts w:ascii="Cambria Math" w:eastAsiaTheme="minorEastAsia" w:hAnsi="Cambria Math"/>
+            <w:sz w:val="24"/>
+            <w:szCs w:val="24"/>
+          </w:rPr>
+          <m:t>s</m:t>
+        </m:r>
+        <m:r>
+          <m:rPr>
+            <m:sty m:val="p"/>
+          </m:rPr>
+          <w:rPr>
+            <w:rFonts w:ascii="Cambria Math" w:eastAsiaTheme="minorEastAsia" w:hAnsi="Cambria Math"/>
+            <w:sz w:val="24"/>
+            <w:szCs w:val="24"/>
+          </w:rPr>
+          <m:t>)</m:t>
         </m:r>
       </m:oMath>
       <w:r>
@@ -9920,6 +11151,7 @@
     <w:p>
       <w:pPr>
         <w:pStyle w:val="a9"/>
+        <w:spacing w:line="360" w:lineRule="auto"/>
         <w:ind w:firstLineChars="200" w:firstLine="480"/>
         <w:rPr>
           <w:rFonts w:asciiTheme="minorEastAsia" w:eastAsiaTheme="minorEastAsia" w:hAnsiTheme="minorEastAsia"/>
@@ -9939,6 +11171,7 @@
     <w:p>
       <w:pPr>
         <w:pStyle w:val="a9"/>
+        <w:spacing w:line="360" w:lineRule="auto"/>
         <w:ind w:firstLineChars="200" w:firstLine="480"/>
         <w:rPr>
           <w:rFonts w:asciiTheme="minorEastAsia" w:eastAsiaTheme="minorEastAsia" w:hAnsiTheme="minorEastAsia"/>
@@ -9993,16 +11226,7 @@
           <w:sz w:val="24"/>
           <w:szCs w:val="24"/>
         </w:rPr>
-        <w:t>。在一种方式中，系统为每个场景维护历史</w:t>
-      </w:r>
-      <w:r>
-        <w:rPr>
-          <w:rFonts w:asciiTheme="minorEastAsia" w:eastAsiaTheme="minorEastAsia" w:hAnsiTheme="minorEastAsia"/>
-          <w:sz w:val="24"/>
-          <w:szCs w:val="24"/>
-        </w:rPr>
-        <w:lastRenderedPageBreak/>
-        <w:t xml:space="preserve">融合表示均值 </w:t>
+        <w:t xml:space="preserve">。在一种方式中，系统为每个场景维护历史融合表示均值 </w:t>
       </w:r>
       <m:oMath>
         <m:sSub>
@@ -10090,6 +11314,7 @@
     <w:p>
       <w:pPr>
         <w:pStyle w:val="a9"/>
+        <w:spacing w:line="360" w:lineRule="auto"/>
         <w:ind w:firstLineChars="200" w:firstLine="480"/>
         <w:rPr>
           <w:rFonts w:asciiTheme="minorEastAsia" w:eastAsiaTheme="minorEastAsia" w:hAnsiTheme="minorEastAsia"/>
@@ -10134,12 +11359,53 @@
             </m:sub>
           </m:sSub>
           <m:r>
+            <m:rPr>
+              <m:sty m:val="p"/>
+            </m:rPr>
             <w:rPr>
               <w:rFonts w:ascii="Cambria Math" w:eastAsiaTheme="minorEastAsia" w:hAnsi="Cambria Math"/>
               <w:sz w:val="24"/>
               <w:szCs w:val="24"/>
             </w:rPr>
-            <m:t>(x,s)=(</m:t>
+            <m:t>(</m:t>
+          </m:r>
+          <m:r>
+            <w:rPr>
+              <w:rFonts w:ascii="Cambria Math" w:eastAsiaTheme="minorEastAsia" w:hAnsi="Cambria Math"/>
+              <w:sz w:val="24"/>
+              <w:szCs w:val="24"/>
+            </w:rPr>
+            <m:t>x</m:t>
+          </m:r>
+          <m:r>
+            <m:rPr>
+              <m:sty m:val="p"/>
+            </m:rPr>
+            <w:rPr>
+              <w:rFonts w:ascii="Cambria Math" w:eastAsiaTheme="minorEastAsia" w:hAnsi="Cambria Math"/>
+              <w:sz w:val="24"/>
+              <w:szCs w:val="24"/>
+            </w:rPr>
+            <m:t>,</m:t>
+          </m:r>
+          <m:r>
+            <w:rPr>
+              <w:rFonts w:ascii="Cambria Math" w:eastAsiaTheme="minorEastAsia" w:hAnsi="Cambria Math"/>
+              <w:sz w:val="24"/>
+              <w:szCs w:val="24"/>
+            </w:rPr>
+            <m:t>s</m:t>
+          </m:r>
+          <m:r>
+            <m:rPr>
+              <m:sty m:val="p"/>
+            </m:rPr>
+            <w:rPr>
+              <w:rFonts w:ascii="Cambria Math" w:eastAsiaTheme="minorEastAsia" w:hAnsi="Cambria Math"/>
+              <w:sz w:val="24"/>
+              <w:szCs w:val="24"/>
+            </w:rPr>
+            <m:t>)=(</m:t>
           </m:r>
           <m:sSub>
             <m:sSubPr>
@@ -10173,6 +11439,9 @@
             </m:sub>
           </m:sSub>
           <m:r>
+            <m:rPr>
+              <m:sty m:val="p"/>
+            </m:rPr>
             <w:rPr>
               <w:rFonts w:ascii="Cambria Math" w:eastAsiaTheme="minorEastAsia" w:hAnsi="Cambria Math"/>
               <w:sz w:val="24"/>
@@ -10223,6 +11492,9 @@
             </m:sSupPr>
             <m:e>
               <m:r>
+                <m:rPr>
+                  <m:sty m:val="p"/>
+                </m:rPr>
                 <w:rPr>
                   <w:rFonts w:ascii="Cambria Math" w:eastAsiaTheme="minorEastAsia" w:hAnsi="Cambria Math"/>
                   <w:sz w:val="24"/>
@@ -10233,6 +11505,9 @@
             </m:e>
             <m:sup>
               <m:r>
+                <m:rPr>
+                  <m:sty m:val="p"/>
+                </m:rPr>
                 <w:rPr>
                   <w:rFonts w:ascii="Cambria Math" w:eastAsiaTheme="minorEastAsia" w:hAnsi="Cambria Math"/>
                   <w:sz w:val="24"/>
@@ -10274,6 +11549,9 @@
             </m:sub>
             <m:sup>
               <m:r>
+                <m:rPr>
+                  <m:sty m:val="p"/>
+                </m:rPr>
                 <w:rPr>
                   <w:rFonts w:ascii="Cambria Math" w:eastAsiaTheme="minorEastAsia" w:hAnsi="Cambria Math"/>
                   <w:sz w:val="24"/>
@@ -10284,6 +11562,9 @@
             </m:sup>
           </m:sSubSup>
           <m:r>
+            <m:rPr>
+              <m:sty m:val="p"/>
+            </m:rPr>
             <w:rPr>
               <w:rFonts w:ascii="Cambria Math" w:eastAsiaTheme="minorEastAsia" w:hAnsi="Cambria Math"/>
               <w:sz w:val="24"/>
@@ -10323,6 +11604,9 @@
             </m:sub>
           </m:sSub>
           <m:r>
+            <m:rPr>
+              <m:sty m:val="p"/>
+            </m:rPr>
             <w:rPr>
               <w:rFonts w:ascii="Cambria Math" w:eastAsiaTheme="minorEastAsia" w:hAnsi="Cambria Math"/>
               <w:sz w:val="24"/>
@@ -10362,6 +11646,9 @@
             </m:sub>
           </m:sSub>
           <m:r>
+            <m:rPr>
+              <m:sty m:val="p"/>
+            </m:rPr>
             <w:rPr>
               <w:rFonts w:ascii="Cambria Math" w:eastAsiaTheme="minorEastAsia" w:hAnsi="Cambria Math"/>
               <w:sz w:val="24"/>
@@ -10374,6 +11661,8 @@
     </w:p>
     <w:p>
       <w:pPr>
+        <w:pStyle w:val="a9"/>
+        <w:spacing w:line="360" w:lineRule="auto"/>
         <w:ind w:firstLineChars="200" w:firstLine="480"/>
         <w:rPr>
           <w:rFonts w:asciiTheme="minorEastAsia" w:eastAsiaTheme="minorEastAsia" w:hAnsiTheme="minorEastAsia"/>
@@ -10469,12 +11758,22 @@
           <w:sz w:val="24"/>
           <w:szCs w:val="24"/>
         </w:rPr>
-        <w:t>、证据冲突和恶意风险同时较高时，系统倾向于输出未知恶意候选。通过该模块，本发明能够将业务漂移、新协议版本和真实未知攻击区分开来，避免把所有分布偏离都视为恶意，也避免把高风险未知攻击简单归入正常漂移。</w:t>
+        <w:t>、证据冲突和恶意风险同时较高时，系统倾向于输出未知恶意候选。通过该模块，本发明能够将业务漂移、新协议版本和真实未知攻击区分开来，避免把所有分布偏离都视为恶意，</w:t>
+      </w:r>
+      <w:r>
+        <w:rPr>
+          <w:rFonts w:asciiTheme="minorEastAsia" w:eastAsiaTheme="minorEastAsia" w:hAnsiTheme="minorEastAsia"/>
+          <w:sz w:val="24"/>
+          <w:szCs w:val="24"/>
+        </w:rPr>
+        <w:lastRenderedPageBreak/>
+        <w:t>也避免把高风险未知攻击简单归入正常漂移。</w:t>
       </w:r>
     </w:p>
     <w:p>
       <w:pPr>
         <w:pStyle w:val="a9"/>
+        <w:spacing w:line="360" w:lineRule="auto"/>
         <w:ind w:firstLineChars="200" w:firstLine="480"/>
         <w:rPr>
           <w:rFonts w:asciiTheme="minorEastAsia" w:eastAsiaTheme="minorEastAsia" w:hAnsiTheme="minorEastAsia"/>
@@ -10494,6 +11793,7 @@
     <w:p>
       <w:pPr>
         <w:pStyle w:val="a9"/>
+        <w:spacing w:line="360" w:lineRule="auto"/>
         <w:ind w:firstLineChars="200" w:firstLine="480"/>
         <w:rPr>
           <w:rFonts w:asciiTheme="minorEastAsia" w:eastAsiaTheme="minorEastAsia" w:hAnsiTheme="minorEastAsia"/>
@@ -10549,6 +11849,7 @@
     <w:p>
       <w:pPr>
         <w:pStyle w:val="a9"/>
+        <w:spacing w:line="360" w:lineRule="auto"/>
         <w:ind w:firstLineChars="200" w:firstLine="480"/>
         <w:rPr>
           <w:rFonts w:asciiTheme="minorEastAsia" w:eastAsiaTheme="minorEastAsia" w:hAnsiTheme="minorEastAsia"/>
@@ -10955,6 +12256,7 @@
     <w:p>
       <w:pPr>
         <w:pStyle w:val="a9"/>
+        <w:spacing w:line="360" w:lineRule="auto"/>
         <w:ind w:firstLineChars="200" w:firstLine="480"/>
         <w:rPr>
           <w:rFonts w:asciiTheme="minorEastAsia" w:eastAsiaTheme="minorEastAsia" w:hAnsiTheme="minorEastAsia"/>
@@ -10999,6 +12301,9 @@
             </m:sub>
           </m:sSub>
           <m:r>
+            <m:rPr>
+              <m:sty m:val="p"/>
+            </m:rPr>
             <w:rPr>
               <w:rFonts w:ascii="Cambria Math" w:eastAsiaTheme="minorEastAsia" w:hAnsi="Cambria Math"/>
               <w:sz w:val="24"/>
@@ -11019,6 +12324,9 @@
             <m:t>1</m:t>
           </m:r>
           <m:r>
+            <m:rPr>
+              <m:sty m:val="p"/>
+            </m:rPr>
             <w:rPr>
               <w:rFonts w:ascii="Cambria Math" w:eastAsiaTheme="minorEastAsia" w:hAnsi="Cambria Math"/>
               <w:sz w:val="24"/>
@@ -11058,6 +12366,9 @@
             </m:sub>
           </m:sSub>
           <m:r>
+            <m:rPr>
+              <m:sty m:val="p"/>
+            </m:rPr>
             <w:rPr>
               <w:rFonts w:ascii="Cambria Math" w:eastAsiaTheme="minorEastAsia" w:hAnsi="Cambria Math"/>
               <w:sz w:val="24"/>
@@ -11097,6 +12408,9 @@
             </m:sub>
           </m:sSub>
           <m:r>
+            <m:rPr>
+              <m:sty m:val="p"/>
+            </m:rPr>
             <w:rPr>
               <w:rFonts w:ascii="Cambria Math" w:eastAsiaTheme="minorEastAsia" w:hAnsi="Cambria Math"/>
               <w:sz w:val="24"/>
@@ -11136,6 +12450,9 @@
             </m:sub>
           </m:sSub>
           <m:r>
+            <m:rPr>
+              <m:sty m:val="p"/>
+            </m:rPr>
             <w:rPr>
               <w:rFonts w:ascii="Cambria Math" w:eastAsiaTheme="minorEastAsia" w:hAnsi="Cambria Math"/>
               <w:sz w:val="24"/>
@@ -11175,6 +12492,9 @@
             </m:sub>
           </m:sSub>
           <m:r>
+            <m:rPr>
+              <m:sty m:val="p"/>
+            </m:rPr>
             <w:rPr>
               <w:rFonts w:ascii="Cambria Math" w:eastAsiaTheme="minorEastAsia" w:hAnsi="Cambria Math"/>
               <w:sz w:val="24"/>
@@ -11214,6 +12534,9 @@
             </m:sub>
           </m:sSub>
           <m:r>
+            <m:rPr>
+              <m:sty m:val="p"/>
+            </m:rPr>
             <w:rPr>
               <w:rFonts w:ascii="Cambria Math" w:eastAsiaTheme="minorEastAsia" w:hAnsi="Cambria Math"/>
               <w:sz w:val="24"/>
@@ -11253,6 +12576,9 @@
             </m:sub>
           </m:sSub>
           <m:r>
+            <m:rPr>
+              <m:sty m:val="p"/>
+            </m:rPr>
             <w:rPr>
               <w:rFonts w:ascii="Cambria Math" w:eastAsiaTheme="minorEastAsia" w:hAnsi="Cambria Math"/>
               <w:sz w:val="24"/>
@@ -11265,6 +12591,8 @@
     </w:p>
     <w:p>
       <w:pPr>
+        <w:pStyle w:val="a9"/>
+        <w:spacing w:line="360" w:lineRule="auto"/>
         <w:ind w:firstLineChars="200" w:firstLine="480"/>
         <w:rPr>
           <w:rFonts w:asciiTheme="minorEastAsia" w:eastAsiaTheme="minorEastAsia" w:hAnsiTheme="minorEastAsia"/>
@@ -11466,6 +12794,7 @@
     <w:p>
       <w:pPr>
         <w:pStyle w:val="a9"/>
+        <w:spacing w:line="360" w:lineRule="auto"/>
         <w:ind w:firstLineChars="200" w:firstLine="480"/>
         <w:rPr>
           <w:rFonts w:asciiTheme="minorEastAsia" w:eastAsiaTheme="minorEastAsia" w:hAnsiTheme="minorEastAsia"/>
@@ -11521,6 +12850,7 @@
     <w:p>
       <w:pPr>
         <w:pStyle w:val="a9"/>
+        <w:spacing w:line="360" w:lineRule="auto"/>
         <w:ind w:firstLineChars="200" w:firstLine="480"/>
         <w:rPr>
           <w:rFonts w:asciiTheme="minorEastAsia" w:eastAsiaTheme="minorEastAsia" w:hAnsiTheme="minorEastAsia"/>
@@ -11540,6 +12870,7 @@
     <w:p>
       <w:pPr>
         <w:pStyle w:val="a9"/>
+        <w:spacing w:line="360" w:lineRule="auto"/>
         <w:ind w:firstLineChars="200" w:firstLine="480"/>
         <w:rPr>
           <w:rFonts w:asciiTheme="minorEastAsia" w:eastAsiaTheme="minorEastAsia" w:hAnsiTheme="minorEastAsia"/>
@@ -11559,6 +12890,7 @@
     <w:p>
       <w:pPr>
         <w:pStyle w:val="a9"/>
+        <w:spacing w:line="360" w:lineRule="auto"/>
         <w:ind w:firstLineChars="200" w:firstLine="480"/>
         <w:rPr>
           <w:rFonts w:asciiTheme="minorEastAsia" w:eastAsiaTheme="minorEastAsia" w:hAnsiTheme="minorEastAsia"/>
@@ -11590,12 +12922,22 @@
           <w:sz w:val="24"/>
           <w:szCs w:val="24"/>
         </w:rPr>
-        <w:t>增强视图，仅对不影响语义的字段进行轻微扰动，要求不同模态输出的融合结果保持一致；第二类为冲突增强视图，将某一模态替换为相似但不同类别样本的模态表示，或对某一模态施加较强遮蔽，要求系统识别出模态冲突或证据不足。训练时可加入冲突一致性损失：</w:t>
+        <w:t>增强视图，仅对不影响语义的字段进行轻微扰动，要求不同模态输出的融合结果保持一致；第二类为冲突增强视图，将某一模态替换为相似但不同类别样本的模态表示，或对某一模</w:t>
+      </w:r>
+      <w:r>
+        <w:rPr>
+          <w:rFonts w:asciiTheme="minorEastAsia" w:eastAsiaTheme="minorEastAsia" w:hAnsiTheme="minorEastAsia"/>
+          <w:sz w:val="24"/>
+          <w:szCs w:val="24"/>
+        </w:rPr>
+        <w:lastRenderedPageBreak/>
+        <w:t>态施加较强遮蔽，要求系统识别出模态冲突或证据不足。训练时可加入冲突一致性损失：</w:t>
       </w:r>
     </w:p>
     <w:p>
       <w:pPr>
         <w:pStyle w:val="a9"/>
+        <w:spacing w:line="360" w:lineRule="auto"/>
         <w:ind w:firstLineChars="200" w:firstLine="480"/>
         <w:rPr>
           <w:rFonts w:asciiTheme="minorEastAsia" w:eastAsiaTheme="minorEastAsia" w:hAnsiTheme="minorEastAsia"/>
@@ -11640,6 +12982,9 @@
             </m:sub>
           </m:sSub>
           <m:r>
+            <m:rPr>
+              <m:sty m:val="p"/>
+            </m:rPr>
             <w:rPr>
               <w:rFonts w:ascii="Cambria Math" w:eastAsiaTheme="minorEastAsia" w:hAnsi="Cambria Math"/>
               <w:sz w:val="24"/>
@@ -11679,6 +13024,9 @@
             </m:sub>
           </m:sSub>
           <m:r>
+            <m:rPr>
+              <m:sty m:val="p"/>
+            </m:rPr>
             <w:rPr>
               <w:rFonts w:ascii="Cambria Math" w:eastAsiaTheme="minorEastAsia" w:hAnsi="Cambria Math"/>
               <w:sz w:val="24"/>
@@ -11734,6 +13082,9 @@
             </m:sub>
           </m:sSub>
           <m:r>
+            <m:rPr>
+              <m:sty m:val="p"/>
+            </m:rPr>
             <w:rPr>
               <w:rFonts w:ascii="Cambria Math" w:eastAsiaTheme="minorEastAsia" w:hAnsi="Cambria Math"/>
               <w:sz w:val="24"/>
@@ -11767,6 +13118,9 @@
             <m:sup/>
             <m:e>
               <m:r>
+                <m:rPr>
+                  <m:sty m:val="p"/>
+                </m:rPr>
                 <w:rPr>
                   <w:rFonts w:ascii="Cambria Math" w:eastAsiaTheme="minorEastAsia" w:hAnsi="Cambria Math"/>
                   <w:sz w:val="24"/>
@@ -11808,6 +13162,9 @@
             </m:sub>
           </m:sSub>
           <m:r>
+            <m:rPr>
+              <m:sty m:val="p"/>
+            </m:rPr>
             <w:rPr>
               <w:rFonts w:ascii="Cambria Math" w:eastAsiaTheme="minorEastAsia" w:hAnsi="Cambria Math"/>
               <w:sz w:val="24"/>
@@ -11863,6 +13220,9 @@
             </m:sub>
           </m:sSub>
           <m:r>
+            <m:rPr>
+              <m:sty m:val="p"/>
+            </m:rPr>
             <w:rPr>
               <w:rFonts w:ascii="Cambria Math" w:eastAsiaTheme="minorEastAsia" w:hAnsi="Cambria Math"/>
               <w:sz w:val="24"/>
@@ -11875,6 +13235,8 @@
     </w:p>
     <w:p>
       <w:pPr>
+        <w:pStyle w:val="a9"/>
+        <w:spacing w:line="360" w:lineRule="auto"/>
         <w:ind w:firstLineChars="200" w:firstLine="480"/>
         <w:rPr>
           <w:rFonts w:asciiTheme="minorEastAsia" w:eastAsiaTheme="minorEastAsia" w:hAnsiTheme="minorEastAsia"/>
@@ -12002,21 +13364,13 @@
           <w:sz w:val="24"/>
           <w:szCs w:val="24"/>
         </w:rPr>
-        <w:t xml:space="preserve"> 表示根据增强策略预期得到的全局冲突和单模态冲突目标。对</w:t>
-      </w:r>
-      <w:r>
-        <w:rPr>
-          <w:rFonts w:asciiTheme="minorEastAsia" w:eastAsiaTheme="minorEastAsia" w:hAnsiTheme="minorEastAsia"/>
-          <w:sz w:val="24"/>
-          <w:szCs w:val="24"/>
-        </w:rPr>
-        <w:lastRenderedPageBreak/>
-        <w:t>于一致增强样本，目标冲突较低；对于冲突增强样本，目标冲突较高。通过这种训练方式，模型不会只追求闭集分类准确率，而会学习“何时应该相信证据、何时应该表达不确定、何时应该输出待确认”。</w:t>
+        <w:t xml:space="preserve"> 表示根据增强策略预期得到的全局冲突和单模态冲突目标。对于一致增强样本，目标冲突较低；对于冲突增强样本，目标冲突较高。通过这种训练方式，模型不会只追求闭集分类准确率，而会学习“何时应该相信证据、何时应该表达不确定、何时应该输出待确认”。</w:t>
       </w:r>
     </w:p>
     <w:p>
       <w:pPr>
         <w:pStyle w:val="a9"/>
+        <w:spacing w:line="360" w:lineRule="auto"/>
         <w:ind w:firstLineChars="200" w:firstLine="480"/>
         <w:rPr>
           <w:rFonts w:asciiTheme="minorEastAsia" w:eastAsiaTheme="minorEastAsia" w:hAnsiTheme="minorEastAsia"/>
@@ -12072,6 +13426,7 @@
     <w:p>
       <w:pPr>
         <w:pStyle w:val="a9"/>
+        <w:spacing w:line="360" w:lineRule="auto"/>
         <w:ind w:firstLineChars="200" w:firstLine="480"/>
         <w:rPr>
           <w:rFonts w:asciiTheme="minorEastAsia" w:eastAsiaTheme="minorEastAsia" w:hAnsiTheme="minorEastAsia"/>
@@ -12091,6 +13446,7 @@
     <w:p>
       <w:pPr>
         <w:pStyle w:val="a9"/>
+        <w:spacing w:line="360" w:lineRule="auto"/>
         <w:ind w:firstLineChars="200" w:firstLine="480"/>
         <w:rPr>
           <w:rFonts w:asciiTheme="minorEastAsia" w:eastAsiaTheme="minorEastAsia" w:hAnsiTheme="minorEastAsia"/>
@@ -12128,6 +13484,7 @@
     <w:p>
       <w:pPr>
         <w:pStyle w:val="a9"/>
+        <w:spacing w:line="360" w:lineRule="auto"/>
         <w:ind w:firstLineChars="200" w:firstLine="480"/>
         <w:rPr>
           <w:rFonts w:asciiTheme="minorEastAsia" w:eastAsiaTheme="minorEastAsia" w:hAnsiTheme="minorEastAsia"/>
@@ -12183,6 +13540,7 @@
     <w:p>
       <w:pPr>
         <w:pStyle w:val="a9"/>
+        <w:spacing w:line="360" w:lineRule="auto"/>
         <w:ind w:firstLineChars="200" w:firstLine="480"/>
         <w:rPr>
           <w:rFonts w:asciiTheme="minorEastAsia" w:eastAsiaTheme="minorEastAsia" w:hAnsiTheme="minorEastAsia"/>
@@ -12220,6 +13578,7 @@
     <w:p>
       <w:pPr>
         <w:pStyle w:val="a9"/>
+        <w:spacing w:line="360" w:lineRule="auto"/>
         <w:ind w:firstLineChars="200" w:firstLine="480"/>
         <w:rPr>
           <w:rFonts w:asciiTheme="minorEastAsia" w:eastAsiaTheme="minorEastAsia" w:hAnsiTheme="minorEastAsia"/>
@@ -12239,6 +13598,7 @@
     <w:p>
       <w:pPr>
         <w:pStyle w:val="a9"/>
+        <w:spacing w:line="360" w:lineRule="auto"/>
         <w:ind w:firstLineChars="200" w:firstLine="480"/>
         <w:rPr>
           <w:rFonts w:asciiTheme="minorEastAsia" w:eastAsiaTheme="minorEastAsia" w:hAnsiTheme="minorEastAsia"/>
@@ -12252,6 +13612,7 @@
           <w:sz w:val="24"/>
           <w:szCs w:val="24"/>
         </w:rPr>
+        <w:lastRenderedPageBreak/>
         <w:t xml:space="preserve">为便于说明本发明的工作方式，以下给出一种典型判定过程。系统接收到一条加密外联流量后，首先通过流量对象构建模块完成会话重组和方向标记，得到流量对象 </w:t>
       </w:r>
       <m:oMath>
@@ -12312,6 +13673,7 @@
     <w:p>
       <w:pPr>
         <w:pStyle w:val="a9"/>
+        <w:spacing w:line="360" w:lineRule="auto"/>
         <w:ind w:firstLineChars="200" w:firstLine="480"/>
         <w:rPr>
           <w:rFonts w:asciiTheme="minorEastAsia" w:eastAsiaTheme="minorEastAsia" w:hAnsiTheme="minorEastAsia"/>
@@ -12385,6 +13747,7 @@
     <w:p>
       <w:pPr>
         <w:pStyle w:val="a9"/>
+        <w:spacing w:line="360" w:lineRule="auto"/>
         <w:ind w:firstLineChars="200" w:firstLine="480"/>
         <w:rPr>
           <w:rFonts w:asciiTheme="minorEastAsia" w:eastAsiaTheme="minorEastAsia" w:hAnsiTheme="minorEastAsia"/>
@@ -12504,6 +13867,7 @@
     <w:p>
       <w:pPr>
         <w:pStyle w:val="a9"/>
+        <w:spacing w:line="360" w:lineRule="auto"/>
         <w:ind w:firstLineChars="200" w:firstLine="480"/>
         <w:rPr>
           <w:rFonts w:asciiTheme="minorEastAsia" w:eastAsiaTheme="minorEastAsia" w:hAnsiTheme="minorEastAsia"/>
@@ -12553,16 +13917,7 @@
           <w:sz w:val="24"/>
           <w:szCs w:val="24"/>
         </w:rPr>
-        <w:t>中心、代</w:t>
-      </w:r>
-      <w:r>
-        <w:rPr>
-          <w:rFonts w:asciiTheme="minorEastAsia" w:eastAsiaTheme="minorEastAsia" w:hAnsiTheme="minorEastAsia"/>
-          <w:sz w:val="24"/>
-          <w:szCs w:val="24"/>
-        </w:rPr>
-        <w:lastRenderedPageBreak/>
-        <w:t>表样本和冲突模式，并在满足样本数量和纯度条件后生成新类候选；若确认其属于已有恶意类别，系统使用确认样本更新相应类别原型和模态可靠度统计。通过该过程，本发明将一次检测结果转化为可解释、可确认和</w:t>
+        <w:t>中心、代表样本和冲突模式，并在满足样本数量和纯度条件后生成新类候选；若确认其属于已有恶意类别，系统使用确认样本更新相应类别原型和模态可靠度统计。通过该过程，本发明将一次检测结果转化为可解释、可确认和</w:t>
       </w:r>
       <w:proofErr w:type="gramStart"/>
       <w:r>
@@ -12604,6 +13959,7 @@
     <w:p>
       <w:pPr>
         <w:pStyle w:val="a9"/>
+        <w:spacing w:line="360" w:lineRule="auto"/>
         <w:ind w:firstLineChars="200" w:firstLine="480"/>
         <w:rPr>
           <w:rFonts w:asciiTheme="minorEastAsia" w:eastAsiaTheme="minorEastAsia" w:hAnsiTheme="minorEastAsia"/>
@@ -12623,6 +13979,7 @@
     <w:p>
       <w:pPr>
         <w:pStyle w:val="a9"/>
+        <w:spacing w:line="360" w:lineRule="auto"/>
         <w:ind w:firstLineChars="200" w:firstLine="480"/>
         <w:rPr>
           <w:rFonts w:asciiTheme="minorEastAsia" w:eastAsiaTheme="minorEastAsia" w:hAnsiTheme="minorEastAsia"/>
@@ -12678,6 +14035,7 @@
     <w:p>
       <w:pPr>
         <w:pStyle w:val="a9"/>
+        <w:spacing w:line="360" w:lineRule="auto"/>
         <w:ind w:firstLineChars="200" w:firstLine="480"/>
         <w:rPr>
           <w:rFonts w:asciiTheme="minorEastAsia" w:eastAsiaTheme="minorEastAsia" w:hAnsiTheme="minorEastAsia"/>
@@ -12691,6 +14049,7 @@
           <w:sz w:val="24"/>
           <w:szCs w:val="24"/>
         </w:rPr>
+        <w:lastRenderedPageBreak/>
         <w:t>本发明通过自适应折扣融合机制，根据模态可靠度和冲突程度对证据</w:t>
       </w:r>
       <w:proofErr w:type="gramStart"/>
@@ -12751,6 +14110,7 @@
     <w:p>
       <w:pPr>
         <w:pStyle w:val="a9"/>
+        <w:spacing w:line="360" w:lineRule="auto"/>
         <w:ind w:firstLineChars="200" w:firstLine="480"/>
         <w:rPr>
           <w:rFonts w:asciiTheme="minorEastAsia" w:eastAsiaTheme="minorEastAsia" w:hAnsiTheme="minorEastAsia"/>
@@ -12806,6 +14166,7 @@
     <w:p>
       <w:pPr>
         <w:pStyle w:val="a9"/>
+        <w:spacing w:line="360" w:lineRule="auto"/>
         <w:ind w:firstLineChars="200" w:firstLine="480"/>
         <w:rPr>
           <w:rFonts w:asciiTheme="minorEastAsia" w:eastAsiaTheme="minorEastAsia" w:hAnsiTheme="minorEastAsia"/>
@@ -12825,7 +14186,8 @@
     <w:p>
       <w:pPr>
         <w:pStyle w:val="a9"/>
-        <w:ind w:firstLineChars="200" w:firstLine="482"/>
+        <w:spacing w:line="360" w:lineRule="auto"/>
+        <w:ind w:firstLineChars="200" w:firstLine="480"/>
         <w:rPr>
           <w:rFonts w:asciiTheme="minorEastAsia" w:eastAsiaTheme="minorEastAsia" w:hAnsiTheme="minorEastAsia"/>
           <w:sz w:val="24"/>
@@ -12835,7 +14197,6 @@
       <w:r>
         <w:rPr>
           <w:rFonts w:asciiTheme="minorEastAsia" w:eastAsiaTheme="minorEastAsia" w:hAnsiTheme="minorEastAsia"/>
-          <w:b/>
           <w:sz w:val="24"/>
           <w:szCs w:val="24"/>
         </w:rPr>
@@ -12845,6 +14206,7 @@
     <w:p>
       <w:pPr>
         <w:pStyle w:val="a9"/>
+        <w:spacing w:line="360" w:lineRule="auto"/>
         <w:ind w:firstLineChars="200" w:firstLine="480"/>
         <w:rPr>
           <w:rFonts w:asciiTheme="minorEastAsia" w:eastAsiaTheme="minorEastAsia" w:hAnsiTheme="minorEastAsia"/>
@@ -12864,6 +14226,7 @@
     <w:p>
       <w:pPr>
         <w:pStyle w:val="a9"/>
+        <w:spacing w:line="360" w:lineRule="auto"/>
         <w:ind w:firstLineChars="200" w:firstLine="480"/>
         <w:rPr>
           <w:rFonts w:asciiTheme="minorEastAsia" w:eastAsiaTheme="minorEastAsia" w:hAnsiTheme="minorEastAsia"/>
@@ -12883,6 +14246,7 @@
     <w:p>
       <w:pPr>
         <w:pStyle w:val="a9"/>
+        <w:spacing w:line="360" w:lineRule="auto"/>
         <w:ind w:firstLineChars="200" w:firstLine="480"/>
         <w:rPr>
           <w:rFonts w:asciiTheme="minorEastAsia" w:eastAsiaTheme="minorEastAsia" w:hAnsiTheme="minorEastAsia"/>
@@ -12902,6 +14266,7 @@
     <w:p>
       <w:pPr>
         <w:pStyle w:val="a9"/>
+        <w:spacing w:line="360" w:lineRule="auto"/>
         <w:ind w:firstLineChars="200" w:firstLine="480"/>
         <w:rPr>
           <w:rFonts w:asciiTheme="minorEastAsia" w:eastAsiaTheme="minorEastAsia" w:hAnsiTheme="minorEastAsia"/>
@@ -12921,6 +14286,7 @@
     <w:p>
       <w:pPr>
         <w:pStyle w:val="a9"/>
+        <w:spacing w:line="360" w:lineRule="auto"/>
         <w:ind w:firstLineChars="200" w:firstLine="480"/>
         <w:rPr>
           <w:rFonts w:asciiTheme="minorEastAsia" w:eastAsiaTheme="minorEastAsia" w:hAnsiTheme="minorEastAsia"/>
@@ -12940,7 +14306,8 @@
     <w:p>
       <w:pPr>
         <w:pStyle w:val="a9"/>
-        <w:ind w:firstLineChars="200" w:firstLine="482"/>
+        <w:spacing w:line="360" w:lineRule="auto"/>
+        <w:ind w:firstLineChars="200" w:firstLine="480"/>
         <w:rPr>
           <w:rFonts w:asciiTheme="minorEastAsia" w:eastAsiaTheme="minorEastAsia" w:hAnsiTheme="minorEastAsia"/>
           <w:sz w:val="24"/>
@@ -12950,7 +14317,6 @@
       <w:r>
         <w:rPr>
           <w:rFonts w:asciiTheme="minorEastAsia" w:eastAsiaTheme="minorEastAsia" w:hAnsiTheme="minorEastAsia"/>
-          <w:b/>
           <w:sz w:val="24"/>
           <w:szCs w:val="24"/>
         </w:rPr>
@@ -12960,6 +14326,7 @@
     <w:p>
       <w:pPr>
         <w:pStyle w:val="a9"/>
+        <w:spacing w:line="360" w:lineRule="auto"/>
         <w:ind w:firstLineChars="200" w:firstLine="480"/>
         <w:rPr>
           <w:rFonts w:asciiTheme="minorEastAsia" w:eastAsiaTheme="minorEastAsia" w:hAnsiTheme="minorEastAsia"/>

</xml_diff>

<commit_message>
Auto sync docs/source code 2026-07-07 13:44:06
</commit_message>
<xml_diff>
--- a/方向分析/专利/01_证据冲突感知的可信开放集加密恶意流量检测方法及装置/可信开放集加密恶意流量检测方法及系统_按新模板.docx
+++ b/方向分析/专利/01_证据冲突感知的可信开放集加密恶意流量检测方法及装置/可信开放集加密恶意流量检测方法及系统_按新模板.docx
@@ -62,6 +62,7 @@
           <w:szCs w:val="24"/>
         </w:rPr>
       </w:pPr>
+      <w:bookmarkStart w:id="0" w:name="OLE_LINK5"/>
       <w:r>
         <w:rPr>
           <w:rFonts w:asciiTheme="minorEastAsia" w:eastAsiaTheme="minorEastAsia" w:hAnsiTheme="minorEastAsia"/>
@@ -71,6 +72,7 @@
         <w:t>本发明涉及网络安全技术领域，尤其涉及一种证据冲突感知的可信开放集加密恶意流量检测方法及系统。</w:t>
       </w:r>
     </w:p>
+    <w:bookmarkEnd w:id="0"/>
     <w:p>
       <w:pPr>
         <w:pStyle w:val="a9"/>
@@ -276,7 +278,7 @@
           <w:szCs w:val="24"/>
         </w:rPr>
       </w:pPr>
-      <w:bookmarkStart w:id="0" w:name="OLE_LINK4"/>
+      <w:bookmarkStart w:id="1" w:name="OLE_LINK4"/>
       <w:r>
         <w:rPr>
           <w:rFonts w:asciiTheme="minorEastAsia" w:eastAsiaTheme="minorEastAsia" w:hAnsiTheme="minorEastAsia"/>
@@ -560,7 +562,7 @@
         </w:rPr>
         <w:t>持续发现新类、减少重复确认，并在满足可信度条件后支持原型、阈值和模态可靠度更新</w:t>
       </w:r>
-      <w:bookmarkEnd w:id="0"/>
+      <w:bookmarkEnd w:id="1"/>
       <w:r>
         <w:rPr>
           <w:rFonts w:asciiTheme="minorEastAsia" w:eastAsiaTheme="minorEastAsia" w:hAnsiTheme="minorEastAsia"/>

</xml_diff>